<commit_message>
Add ExLAW, a superhero setting, plus powers with Classes and legal status in the engine
- New pack: 26 callings, 9 origins (+ restricted Shadow Earth defector), 50 powers by Class,
  rituals, Aegis suits, legal status, Collateral/Scrutiny/Backlash, Strain, seeds, example and 7 ready-made characters
- Engine: power slots by origin tier, legal status picker, sheet and checks
- Bot, handouts, website kit and Cloudflare site include ExLAW
- The Shattered Crown: rules for learning and swapping cantrips

Co-Authored-By: Claude Opus 5.5 <noreply@anthropic.com>
Claude-Session: https://claude.ai/code/session_015SADCFzhKijkC2foUmXrpC
</commit_message>
<xml_diff>
--- a/legend-dynamics/fantasy/The_Shattered_Crown_Players_Guide.docx
+++ b/legend-dynamics/fantasy/The_Shattered_Crown_Players_Guide.docx
@@ -11999,6 +11999,138 @@
         </w:tc>
       </w:tr>
     </w:tbl>
+    <w:p>
+      <w:pPr>
+        <w:pStyle w:val="BodyText"/>
+      </w:pPr>
+      <w:r>
+        <w:rPr>
+          <w:bCs/>
+          <w:b/>
+        </w:rPr>
+        <w:t xml:space="preserve">Changing cantrips.</w:t>
+      </w:r>
+      <w:r>
+        <w:t xml:space="preserve"> </w:t>
+      </w:r>
+      <w:r>
+        <w:t xml:space="preserve">Cantrips are learned, not prayed for each morning, so a caster keeps the ones they know:</w:t>
+      </w:r>
+    </w:p>
+    <w:p>
+      <w:pPr>
+        <w:numPr>
+          <w:ilvl w:val="0"/>
+          <w:numId w:val="1012"/>
+        </w:numPr>
+        <w:pStyle w:val="Compact"/>
+      </w:pPr>
+      <w:r>
+        <w:rPr>
+          <w:bCs/>
+          <w:b/>
+        </w:rPr>
+        <w:t xml:space="preserve">New cantrips.</w:t>
+      </w:r>
+      <w:r>
+        <w:t xml:space="preserve"> </w:t>
+      </w:r>
+      <w:r>
+        <w:t xml:space="preserve">When</w:t>
+      </w:r>
+      <w:r>
+        <w:t xml:space="preserve"> </w:t>
+      </w:r>
+      <w:r>
+        <w:rPr>
+          <w:bCs/>
+          <w:b/>
+        </w:rPr>
+        <w:t xml:space="preserve">Sorcery</w:t>
+      </w:r>
+      <w:r>
+        <w:t xml:space="preserve"> </w:t>
+      </w:r>
+      <w:r>
+        <w:t xml:space="preserve">advances (Untrained to Trained, or Trained to Specialty), choose the new cantrips at once.</w:t>
+      </w:r>
+    </w:p>
+    <w:p>
+      <w:pPr>
+        <w:numPr>
+          <w:ilvl w:val="0"/>
+          <w:numId w:val="1012"/>
+        </w:numPr>
+        <w:pStyle w:val="Compact"/>
+      </w:pPr>
+      <w:r>
+        <w:rPr>
+          <w:bCs/>
+          <w:b/>
+        </w:rPr>
+        <w:t xml:space="preserve">Swapping.</w:t>
+      </w:r>
+      <w:r>
+        <w:t xml:space="preserve"> </w:t>
+      </w:r>
+      <w:r>
+        <w:t xml:space="preserve">Between ventures, a caster can swap</w:t>
+      </w:r>
+      <w:r>
+        <w:t xml:space="preserve"> </w:t>
+      </w:r>
+      <w:r>
+        <w:rPr>
+          <w:bCs/>
+          <w:b/>
+        </w:rPr>
+        <w:t xml:space="preserve">one</w:t>
+      </w:r>
+      <w:r>
+        <w:t xml:space="preserve"> </w:t>
+      </w:r>
+      <w:r>
+        <w:t xml:space="preserve">cantrip for another with</w:t>
+      </w:r>
+      <w:r>
+        <w:t xml:space="preserve"> </w:t>
+      </w:r>
+      <w:r>
+        <w:rPr>
+          <w:bCs/>
+          <w:b/>
+        </w:rPr>
+        <w:t xml:space="preserve">a week of study</w:t>
+      </w:r>
+      <w:r>
+        <w:t xml:space="preserve"> </w:t>
+      </w:r>
+      <w:r>
+        <w:t xml:space="preserve">and a source to learn it from: a teacher, a grimoire, a captured sorcerer’s notes or a Crown shard’s memory. The GM may make finding the source part of the next venture.</w:t>
+      </w:r>
+    </w:p>
+    <w:p>
+      <w:pPr>
+        <w:numPr>
+          <w:ilvl w:val="0"/>
+          <w:numId w:val="1012"/>
+        </w:numPr>
+        <w:pStyle w:val="Compact"/>
+      </w:pPr>
+      <w:r>
+        <w:rPr>
+          <w:bCs/>
+          <w:b/>
+        </w:rPr>
+        <w:t xml:space="preserve">Never mid-venture.</w:t>
+      </w:r>
+      <w:r>
+        <w:t xml:space="preserve"> </w:t>
+      </w:r>
+      <w:r>
+        <w:t xml:space="preserve">No swapping during a venture, unless the GM offers it as the reward for something remarkable (a demon’s bargain, a dying sorcerer’s last lesson).</w:t>
+      </w:r>
+    </w:p>
     <w:bookmarkEnd w:id="69"/>
     <w:bookmarkStart w:id="70" w:name="rituals"/>
     <w:p>
@@ -12319,7 +12451,7 @@
       <w:pPr>
         <w:numPr>
           <w:ilvl w:val="0"/>
-          <w:numId w:val="1012"/>
+          <w:numId w:val="1013"/>
         </w:numPr>
         <w:pStyle w:val="Compact"/>
       </w:pPr>
@@ -12341,7 +12473,7 @@
       <w:pPr>
         <w:numPr>
           <w:ilvl w:val="0"/>
-          <w:numId w:val="1012"/>
+          <w:numId w:val="1013"/>
         </w:numPr>
         <w:pStyle w:val="Compact"/>
       </w:pPr>
@@ -12802,7 +12934,7 @@
       <w:pPr>
         <w:numPr>
           <w:ilvl w:val="0"/>
-          <w:numId w:val="1013"/>
+          <w:numId w:val="1014"/>
         </w:numPr>
         <w:pStyle w:val="Compact"/>
       </w:pPr>
@@ -12847,141 +12979,6 @@
       </w:r>
       <w:r>
         <w:t xml:space="preserve">.</w:t>
-      </w:r>
-    </w:p>
-    <w:p>
-      <w:pPr>
-        <w:numPr>
-          <w:ilvl w:val="0"/>
-          <w:numId w:val="1013"/>
-        </w:numPr>
-        <w:pStyle w:val="Compact"/>
-      </w:pPr>
-      <w:r>
-        <w:rPr>
-          <w:bCs/>
-          <w:b/>
-        </w:rPr>
-        <w:t xml:space="preserve">The Frozen North.</w:t>
-      </w:r>
-      <w:r>
-        <w:t xml:space="preserve"> </w:t>
-      </w:r>
-      <w:r>
-        <w:t xml:space="preserve">Clans, longships and giants’ graves. Northlanders raid south every summer and trade every winter.</w:t>
-      </w:r>
-    </w:p>
-    <w:p>
-      <w:pPr>
-        <w:numPr>
-          <w:ilvl w:val="0"/>
-          <w:numId w:val="1013"/>
-        </w:numPr>
-        <w:pStyle w:val="Compact"/>
-      </w:pPr>
-      <w:r>
-        <w:rPr>
-          <w:bCs/>
-          <w:b/>
-        </w:rPr>
-        <w:t xml:space="preserve">The Burning Sands.</w:t>
-      </w:r>
-      <w:r>
-        <w:t xml:space="preserve"> </w:t>
-      </w:r>
-      <w:r>
-        <w:t xml:space="preserve">Nomads, caravan cities and buried temples of the</w:t>
-      </w:r>
-      <w:r>
-        <w:t xml:space="preserve"> </w:t>
-      </w:r>
-      <w:r>
-        <w:rPr>
-          <w:bCs/>
-          <w:b/>
-        </w:rPr>
-        <w:t xml:space="preserve">serpent kings</w:t>
-      </w:r>
-      <w:r>
-        <w:t xml:space="preserve"> </w:t>
-      </w:r>
-      <w:r>
-        <w:t xml:space="preserve">who ruled before humans.</w:t>
-      </w:r>
-    </w:p>
-    <w:p>
-      <w:pPr>
-        <w:numPr>
-          <w:ilvl w:val="0"/>
-          <w:numId w:val="1013"/>
-        </w:numPr>
-        <w:pStyle w:val="Compact"/>
-      </w:pPr>
-      <w:r>
-        <w:rPr>
-          <w:bCs/>
-          <w:b/>
-        </w:rPr>
-        <w:t xml:space="preserve">The Shattered Isles.</w:t>
-      </w:r>
-      <w:r>
-        <w:t xml:space="preserve"> </w:t>
-      </w:r>
-      <w:r>
-        <w:t xml:space="preserve">Corsair havens, sea-witches and sunken ruins; the Islanders’ free captains answer to no one.</w:t>
-      </w:r>
-    </w:p>
-    <w:p>
-      <w:pPr>
-        <w:numPr>
-          <w:ilvl w:val="0"/>
-          <w:numId w:val="1013"/>
-        </w:numPr>
-        <w:pStyle w:val="Compact"/>
-      </w:pPr>
-      <w:r>
-        <w:rPr>
-          <w:bCs/>
-          <w:b/>
-        </w:rPr>
-        <w:t xml:space="preserve">The Deeps.</w:t>
-      </w:r>
-      <w:r>
-        <w:t xml:space="preserve"> </w:t>
-      </w:r>
-      <w:r>
-        <w:t xml:space="preserve">Deepkin cities beneath the mountains, and below them, older things that dream.</w:t>
-      </w:r>
-    </w:p>
-    <w:p>
-      <w:pPr>
-        <w:numPr>
-          <w:ilvl w:val="0"/>
-          <w:numId w:val="1013"/>
-        </w:numPr>
-        <w:pStyle w:val="Compact"/>
-      </w:pPr>
-      <w:r>
-        <w:rPr>
-          <w:bCs/>
-          <w:b/>
-        </w:rPr>
-        <w:t xml:space="preserve">The Ashlands.</w:t>
-      </w:r>
-      <w:r>
-        <w:t xml:space="preserve"> </w:t>
-      </w:r>
-      <w:r>
-        <w:t xml:space="preserve">The empire’s blasted center, where the Crown broke. Nothing grows; shards and madmen are found there.</w:t>
-      </w:r>
-    </w:p>
-    <w:bookmarkStart w:id="73" w:name="powers"/>
-    <w:p>
-      <w:pPr>
-        <w:pStyle w:val="Heading2"/>
-      </w:pPr>
-      <w:r>
-        <w:t xml:space="preserve">Powers</w:t>
       </w:r>
     </w:p>
     <w:p>
@@ -12997,13 +12994,13 @@
           <w:bCs/>
           <w:b/>
         </w:rPr>
-        <w:t xml:space="preserve">The Crown shards.</w:t>
-      </w:r>
-      <w:r>
-        <w:t xml:space="preserve"> </w:t>
-      </w:r>
-      <w:r>
-        <w:t xml:space="preserve">Nine in all; four are held by known rulers, three are lost, and two are rumors. Each grants one great power and whispers to its bearer.</w:t>
+        <w:t xml:space="preserve">The Frozen North.</w:t>
+      </w:r>
+      <w:r>
+        <w:t xml:space="preserve"> </w:t>
+      </w:r>
+      <w:r>
+        <w:t xml:space="preserve">Clans, longships and giants’ graves. Northlanders raid south every summer and trade every winter.</w:t>
       </w:r>
     </w:p>
     <w:p>
@@ -13019,13 +13016,29 @@
           <w:bCs/>
           <w:b/>
         </w:rPr>
-        <w:t xml:space="preserve">The sorcerer-princes.</w:t>
-      </w:r>
-      <w:r>
-        <w:t xml:space="preserve"> </w:t>
-      </w:r>
-      <w:r>
-        <w:t xml:space="preserve">Rulers who bought their thrones with sorcery and keep them with fear.</w:t>
+        <w:t xml:space="preserve">The Burning Sands.</w:t>
+      </w:r>
+      <w:r>
+        <w:t xml:space="preserve"> </w:t>
+      </w:r>
+      <w:r>
+        <w:t xml:space="preserve">Nomads, caravan cities and buried temples of the</w:t>
+      </w:r>
+      <w:r>
+        <w:t xml:space="preserve"> </w:t>
+      </w:r>
+      <w:r>
+        <w:rPr>
+          <w:bCs/>
+          <w:b/>
+        </w:rPr>
+        <w:t xml:space="preserve">serpent kings</w:t>
+      </w:r>
+      <w:r>
+        <w:t xml:space="preserve"> </w:t>
+      </w:r>
+      <w:r>
+        <w:t xml:space="preserve">who ruled before humans.</w:t>
       </w:r>
     </w:p>
     <w:p>
@@ -13041,13 +13054,13 @@
           <w:bCs/>
           <w:b/>
         </w:rPr>
-        <w:t xml:space="preserve">The merchant princes.</w:t>
-      </w:r>
-      <w:r>
-        <w:t xml:space="preserve"> </w:t>
-      </w:r>
-      <w:r>
-        <w:t xml:space="preserve">Gold rules the Gilded Cities more than any king.</w:t>
+        <w:t xml:space="preserve">The Shattered Isles.</w:t>
+      </w:r>
+      <w:r>
+        <w:t xml:space="preserve"> </w:t>
+      </w:r>
+      <w:r>
+        <w:t xml:space="preserve">Corsair havens, sea-witches and sunken ruins; the Islanders’ free captains answer to no one.</w:t>
       </w:r>
     </w:p>
     <w:p>
@@ -13063,13 +13076,13 @@
           <w:bCs/>
           <w:b/>
         </w:rPr>
-        <w:t xml:space="preserve">The Cult of the Burning God.</w:t>
-      </w:r>
-      <w:r>
-        <w:t xml:space="preserve"> </w:t>
-      </w:r>
-      <w:r>
-        <w:t xml:space="preserve">Zealots who burn sorcerers, and sometimes their neighbors.</w:t>
+        <w:t xml:space="preserve">The Deeps.</w:t>
+      </w:r>
+      <w:r>
+        <w:t xml:space="preserve"> </w:t>
+      </w:r>
+      <w:r>
+        <w:t xml:space="preserve">Deepkin cities beneath the mountains, and below them, older things that dream.</w:t>
       </w:r>
     </w:p>
     <w:p>
@@ -13085,20 +13098,139 @@
           <w:bCs/>
           <w:b/>
         </w:rPr>
-        <w:t xml:space="preserve">The Iron Company and its rivals.</w:t>
-      </w:r>
-      <w:r>
-        <w:t xml:space="preserve"> </w:t>
-      </w:r>
-      <w:r>
-        <w:t xml:space="preserve">Mercenary companies who decide most wars, for a price.</w:t>
+        <w:t xml:space="preserve">The Ashlands.</w:t>
+      </w:r>
+      <w:r>
+        <w:t xml:space="preserve"> </w:t>
+      </w:r>
+      <w:r>
+        <w:t xml:space="preserve">The empire’s blasted center, where the Crown broke. Nothing grows; shards and madmen are found there.</w:t>
+      </w:r>
+    </w:p>
+    <w:bookmarkStart w:id="73" w:name="powers"/>
+    <w:p>
+      <w:pPr>
+        <w:pStyle w:val="Heading2"/>
+      </w:pPr>
+      <w:r>
+        <w:t xml:space="preserve">Powers</w:t>
       </w:r>
     </w:p>
     <w:p>
       <w:pPr>
         <w:numPr>
           <w:ilvl w:val="0"/>
-          <w:numId w:val="1014"/>
+          <w:numId w:val="1015"/>
+        </w:numPr>
+        <w:pStyle w:val="Compact"/>
+      </w:pPr>
+      <w:r>
+        <w:rPr>
+          <w:bCs/>
+          <w:b/>
+        </w:rPr>
+        <w:t xml:space="preserve">The Crown shards.</w:t>
+      </w:r>
+      <w:r>
+        <w:t xml:space="preserve"> </w:t>
+      </w:r>
+      <w:r>
+        <w:t xml:space="preserve">Nine in all; four are held by known rulers, three are lost, and two are rumors. Each grants one great power and whispers to its bearer.</w:t>
+      </w:r>
+    </w:p>
+    <w:p>
+      <w:pPr>
+        <w:numPr>
+          <w:ilvl w:val="0"/>
+          <w:numId w:val="1015"/>
+        </w:numPr>
+        <w:pStyle w:val="Compact"/>
+      </w:pPr>
+      <w:r>
+        <w:rPr>
+          <w:bCs/>
+          <w:b/>
+        </w:rPr>
+        <w:t xml:space="preserve">The sorcerer-princes.</w:t>
+      </w:r>
+      <w:r>
+        <w:t xml:space="preserve"> </w:t>
+      </w:r>
+      <w:r>
+        <w:t xml:space="preserve">Rulers who bought their thrones with sorcery and keep them with fear.</w:t>
+      </w:r>
+    </w:p>
+    <w:p>
+      <w:pPr>
+        <w:numPr>
+          <w:ilvl w:val="0"/>
+          <w:numId w:val="1015"/>
+        </w:numPr>
+        <w:pStyle w:val="Compact"/>
+      </w:pPr>
+      <w:r>
+        <w:rPr>
+          <w:bCs/>
+          <w:b/>
+        </w:rPr>
+        <w:t xml:space="preserve">The merchant princes.</w:t>
+      </w:r>
+      <w:r>
+        <w:t xml:space="preserve"> </w:t>
+      </w:r>
+      <w:r>
+        <w:t xml:space="preserve">Gold rules the Gilded Cities more than any king.</w:t>
+      </w:r>
+    </w:p>
+    <w:p>
+      <w:pPr>
+        <w:numPr>
+          <w:ilvl w:val="0"/>
+          <w:numId w:val="1015"/>
+        </w:numPr>
+        <w:pStyle w:val="Compact"/>
+      </w:pPr>
+      <w:r>
+        <w:rPr>
+          <w:bCs/>
+          <w:b/>
+        </w:rPr>
+        <w:t xml:space="preserve">The Cult of the Burning God.</w:t>
+      </w:r>
+      <w:r>
+        <w:t xml:space="preserve"> </w:t>
+      </w:r>
+      <w:r>
+        <w:t xml:space="preserve">Zealots who burn sorcerers, and sometimes their neighbors.</w:t>
+      </w:r>
+    </w:p>
+    <w:p>
+      <w:pPr>
+        <w:numPr>
+          <w:ilvl w:val="0"/>
+          <w:numId w:val="1015"/>
+        </w:numPr>
+        <w:pStyle w:val="Compact"/>
+      </w:pPr>
+      <w:r>
+        <w:rPr>
+          <w:bCs/>
+          <w:b/>
+        </w:rPr>
+        <w:t xml:space="preserve">The Iron Company and its rivals.</w:t>
+      </w:r>
+      <w:r>
+        <w:t xml:space="preserve"> </w:t>
+      </w:r>
+      <w:r>
+        <w:t xml:space="preserve">Mercenary companies who decide most wars, for a price.</w:t>
+      </w:r>
+    </w:p>
+    <w:p>
+      <w:pPr>
+        <w:numPr>
+          <w:ilvl w:val="0"/>
+          <w:numId w:val="1015"/>
         </w:numPr>
         <w:pStyle w:val="Compact"/>
       </w:pPr>
@@ -14545,7 +14677,7 @@
       <w:pPr>
         <w:numPr>
           <w:ilvl w:val="0"/>
-          <w:numId w:val="1015"/>
+          <w:numId w:val="1016"/>
         </w:numPr>
         <w:pStyle w:val="Compact"/>
       </w:pPr>
@@ -14577,154 +14709,6 @@
       </w:r>
       <w:r>
         <w:t xml:space="preserve">12.</w:t>
-      </w:r>
-    </w:p>
-    <w:p>
-      <w:pPr>
-        <w:numPr>
-          <w:ilvl w:val="0"/>
-          <w:numId w:val="1015"/>
-        </w:numPr>
-        <w:pStyle w:val="Compact"/>
-      </w:pPr>
-      <w:r>
-        <w:rPr>
-          <w:bCs/>
-          <w:b/>
-        </w:rPr>
-        <w:t xml:space="preserve">Skills:</w:t>
-      </w:r>
-      <w:r>
-        <w:t xml:space="preserve"> </w:t>
-      </w:r>
-      <w:r>
-        <w:t xml:space="preserve">Thievery 18 (Expert). Trained: Stealth 14, Deception 13, Persuasion 13, Athletics 12, Craft 12, Investigation 12, Melee 12, Read People 10.</w:t>
-      </w:r>
-    </w:p>
-    <w:p>
-      <w:pPr>
-        <w:numPr>
-          <w:ilvl w:val="0"/>
-          <w:numId w:val="1015"/>
-        </w:numPr>
-        <w:pStyle w:val="Compact"/>
-      </w:pPr>
-      <w:r>
-        <w:rPr>
-          <w:bCs/>
-          <w:b/>
-        </w:rPr>
-        <w:t xml:space="preserve">Edges:</w:t>
-      </w:r>
-      <w:r>
-        <w:t xml:space="preserve"> </w:t>
-      </w:r>
-      <w:r>
-        <w:t xml:space="preserve">+1 attribute point, Extra Trained skill, A friend; a friend: Old Marrow, a fence in the Gilded Cities who buys anything and asks nothing.</w:t>
-      </w:r>
-    </w:p>
-    <w:p>
-      <w:pPr>
-        <w:numPr>
-          <w:ilvl w:val="0"/>
-          <w:numId w:val="1015"/>
-        </w:numPr>
-        <w:pStyle w:val="Compact"/>
-      </w:pPr>
-      <w:r>
-        <w:rPr>
-          <w:bCs/>
-          <w:b/>
-        </w:rPr>
-        <w:t xml:space="preserve">Advantage:</w:t>
-      </w:r>
-      <w:r>
-        <w:t xml:space="preserve"> </w:t>
-      </w:r>
-      <w:r>
-        <w:t xml:space="preserve">Lockbreaker.</w:t>
-      </w:r>
-      <w:r>
-        <w:t xml:space="preserve"> </w:t>
-      </w:r>
-      <w:r>
-        <w:rPr>
-          <w:bCs/>
-          <w:b/>
-        </w:rPr>
-        <w:t xml:space="preserve">Complication:</w:t>
-      </w:r>
-      <w:r>
-        <w:t xml:space="preserve"> </w:t>
-      </w:r>
-      <w:r>
-        <w:t xml:space="preserve">Keeper of a Secret; trigger: a powerful figure asks what you know.</w:t>
-      </w:r>
-    </w:p>
-    <w:p>
-      <w:pPr>
-        <w:numPr>
-          <w:ilvl w:val="0"/>
-          <w:numId w:val="1015"/>
-        </w:numPr>
-        <w:pStyle w:val="Compact"/>
-      </w:pPr>
-      <w:r>
-        <w:rPr>
-          <w:bCs/>
-          <w:b/>
-        </w:rPr>
-        <w:t xml:space="preserve">What drives me:</w:t>
-      </w:r>
-      <w:r>
-        <w:t xml:space="preserve"> </w:t>
-      </w:r>
-      <w:r>
-        <w:t xml:space="preserve">Gold, and plenty of it. Everything else follows.</w:t>
-      </w:r>
-      <w:r>
-        <w:t xml:space="preserve"> </w:t>
-      </w:r>
-      <w:r>
-        <w:rPr>
-          <w:bCs/>
-          <w:b/>
-        </w:rPr>
-        <w:t xml:space="preserve">Connection:</w:t>
-      </w:r>
-      <w:r>
-        <w:t xml:space="preserve"> </w:t>
-      </w:r>
-      <w:r>
-        <w:t xml:space="preserve">Cinder was paid to kill her and didn’t. Neither of them has said why.</w:t>
-      </w:r>
-    </w:p>
-    <w:bookmarkEnd w:id="76"/>
-    <w:bookmarkStart w:id="77" w:name="ithrann"/>
-    <w:p>
-      <w:pPr>
-        <w:pStyle w:val="Heading2"/>
-      </w:pPr>
-      <w:r>
-        <w:t xml:space="preserve">Ithrann</w:t>
-      </w:r>
-    </w:p>
-    <w:p>
-      <w:pPr>
-        <w:pStyle w:val="FirstParagraph"/>
-      </w:pPr>
-      <w:r>
-        <w:rPr>
-          <w:iCs/>
-          <w:i/>
-        </w:rPr>
-        <w:t xml:space="preserve">Last scholar of Ssa’keth, Sorcerer. Serpent-kin (tier 2).</w:t>
-      </w:r>
-      <w:r>
-        <w:t xml:space="preserve"> </w:t>
-      </w:r>
-      <w:r>
-        <w:t xml:space="preserve">Keeper of a drowned serpent temple’s memory, searching the human kingdoms for its lost library.</w:t>
       </w:r>
     </w:p>
     <w:p>
@@ -14740,29 +14724,13 @@
           <w:bCs/>
           <w:b/>
         </w:rPr>
-        <w:t xml:space="preserve">Attributes:</w:t>
-      </w:r>
-      <w:r>
-        <w:t xml:space="preserve"> </w:t>
-      </w:r>
-      <w:r>
-        <w:t xml:space="preserve">Body 9, Agility 12, Intellect 13, Presence 9, Will 13.</w:t>
-      </w:r>
-      <w:r>
-        <w:t xml:space="preserve"> </w:t>
-      </w:r>
-      <w:r>
-        <w:rPr>
-          <w:bCs/>
-          <w:b/>
-        </w:rPr>
-        <w:t xml:space="preserve">Dodge</w:t>
-      </w:r>
-      <w:r>
-        <w:t xml:space="preserve"> </w:t>
-      </w:r>
-      <w:r>
-        <w:t xml:space="preserve">11.</w:t>
+        <w:t xml:space="preserve">Skills:</w:t>
+      </w:r>
+      <w:r>
+        <w:t xml:space="preserve"> </w:t>
+      </w:r>
+      <w:r>
+        <w:t xml:space="preserve">Thievery 18 (Expert). Trained: Stealth 14, Deception 13, Persuasion 13, Athletics 12, Craft 12, Investigation 12, Melee 12, Read People 10.</w:t>
       </w:r>
     </w:p>
     <w:p>
@@ -14778,13 +14746,13 @@
           <w:bCs/>
           <w:b/>
         </w:rPr>
-        <w:t xml:space="preserve">Skills:</w:t>
-      </w:r>
-      <w:r>
-        <w:t xml:space="preserve"> </w:t>
-      </w:r>
-      <w:r>
-        <w:t xml:space="preserve">Sorcery 16 (Specialty). Trained: Healing 14, Investigation 14, Lore 14, Read People 14, Survival 14, Stealth 13, Athletics 10, Deception 10, Persuasion 10.</w:t>
+        <w:t xml:space="preserve">Edges:</w:t>
+      </w:r>
+      <w:r>
+        <w:t xml:space="preserve"> </w:t>
+      </w:r>
+      <w:r>
+        <w:t xml:space="preserve">+1 attribute point, Extra Trained skill, A friend; a friend: Old Marrow, a fence in the Gilded Cities who buys anything and asks nothing.</w:t>
       </w:r>
     </w:p>
     <w:p>
@@ -14800,13 +14768,29 @@
           <w:bCs/>
           <w:b/>
         </w:rPr>
-        <w:t xml:space="preserve">Edges:</w:t>
-      </w:r>
-      <w:r>
-        <w:t xml:space="preserve"> </w:t>
-      </w:r>
-      <w:r>
-        <w:t xml:space="preserve">+1 attribute point.</w:t>
+        <w:t xml:space="preserve">Advantage:</w:t>
+      </w:r>
+      <w:r>
+        <w:t xml:space="preserve"> </w:t>
+      </w:r>
+      <w:r>
+        <w:t xml:space="preserve">Lockbreaker.</w:t>
+      </w:r>
+      <w:r>
+        <w:t xml:space="preserve"> </w:t>
+      </w:r>
+      <w:r>
+        <w:rPr>
+          <w:bCs/>
+          <w:b/>
+        </w:rPr>
+        <w:t xml:space="preserve">Complication:</w:t>
+      </w:r>
+      <w:r>
+        <w:t xml:space="preserve"> </w:t>
+      </w:r>
+      <w:r>
+        <w:t xml:space="preserve">Keeper of a Secret; trigger: a powerful figure asks what you know.</w:t>
       </w:r>
     </w:p>
     <w:p>
@@ -14822,13 +14806,13 @@
           <w:bCs/>
           <w:b/>
         </w:rPr>
-        <w:t xml:space="preserve">Advantage:</w:t>
-      </w:r>
-      <w:r>
-        <w:t xml:space="preserve"> </w:t>
-      </w:r>
-      <w:r>
-        <w:t xml:space="preserve">Venom (ancestry; companion: Hated Blood).</w:t>
+        <w:t xml:space="preserve">What drives me:</w:t>
+      </w:r>
+      <w:r>
+        <w:t xml:space="preserve"> </w:t>
+      </w:r>
+      <w:r>
+        <w:t xml:space="preserve">Gold, and plenty of it. Everything else follows.</w:t>
       </w:r>
       <w:r>
         <w:t xml:space="preserve"> </w:t>
@@ -14838,61 +14822,23 @@
           <w:bCs/>
           <w:b/>
         </w:rPr>
-        <w:t xml:space="preserve">Complication:</w:t>
-      </w:r>
-      <w:r>
-        <w:t xml:space="preserve"> </w:t>
-      </w:r>
-      <w:r>
-        <w:t xml:space="preserve">Outcast; trigger: someone recognizes your exile mark.</w:t>
-      </w:r>
-    </w:p>
-    <w:p>
-      <w:pPr>
-        <w:numPr>
-          <w:ilvl w:val="0"/>
-          <w:numId w:val="1016"/>
-        </w:numPr>
-        <w:pStyle w:val="Compact"/>
-      </w:pPr>
-      <w:r>
-        <w:rPr>
-          <w:bCs/>
-          <w:b/>
-        </w:rPr>
-        <w:t xml:space="preserve">What drives me:</w:t>
-      </w:r>
-      <w:r>
-        <w:t xml:space="preserve"> </w:t>
-      </w:r>
-      <w:r>
-        <w:t xml:space="preserve">The old empire’s secrets are out there. I will read them.</w:t>
-      </w:r>
-      <w:r>
-        <w:t xml:space="preserve"> </w:t>
-      </w:r>
-      <w:r>
-        <w:rPr>
-          <w:bCs/>
-          <w:b/>
-        </w:rPr>
         <w:t xml:space="preserve">Connection:</w:t>
       </w:r>
       <w:r>
         <w:t xml:space="preserve"> </w:t>
       </w:r>
       <w:r>
-        <w:t xml:space="preserve">Oren Sael shelters Ithrann at his shrine when no inn will take a serpent-kin.</w:t>
-      </w:r>
-    </w:p>
-    <w:bookmarkEnd w:id="77"/>
-    <w:bookmarkStart w:id="78" w:name="nyx"/>
+        <w:t xml:space="preserve">Cinder was paid to kill her and didn’t. Neither of them has said why.</w:t>
+      </w:r>
+    </w:p>
+    <w:bookmarkEnd w:id="76"/>
+    <w:bookmarkStart w:id="77" w:name="ithrann"/>
     <w:p>
       <w:pPr>
         <w:pStyle w:val="Heading2"/>
       </w:pPr>
       <w:r>
-        <w:t xml:space="preserve">Nyx</w:t>
+        <w:t xml:space="preserve">Ithrann</w:t>
       </w:r>
     </w:p>
     <w:p>
@@ -14904,13 +14850,13 @@
           <w:iCs/>
           <w:i/>
         </w:rPr>
-        <w:t xml:space="preserve">Hedge-witch, Witch. Witch-blooded (tier 1).</w:t>
-      </w:r>
-      <w:r>
-        <w:t xml:space="preserve"> </w:t>
-      </w:r>
-      <w:r>
-        <w:t xml:space="preserve">Run out of her village with stones and torches; sells cures and curses to whoever pays.</w:t>
+        <w:t xml:space="preserve">Last scholar of Ssa’keth, Sorcerer. Serpent-kin (tier 2).</w:t>
+      </w:r>
+      <w:r>
+        <w:t xml:space="preserve"> </w:t>
+      </w:r>
+      <w:r>
+        <w:t xml:space="preserve">Keeper of a drowned serpent temple’s memory, searching the human kingdoms for its lost library.</w:t>
       </w:r>
     </w:p>
     <w:p>
@@ -14932,7 +14878,7 @@
         <w:t xml:space="preserve"> </w:t>
       </w:r>
       <w:r>
-        <w:t xml:space="preserve">Body 9, Agility 11, Intellect 11, Presence 11, Will 13.</w:t>
+        <w:t xml:space="preserve">Body 9, Agility 12, Intellect 13, Presence 9, Will 13.</w:t>
       </w:r>
       <w:r>
         <w:t xml:space="preserve"> </w:t>
@@ -14948,7 +14894,7 @@
         <w:t xml:space="preserve"> </w:t>
       </w:r>
       <w:r>
-        <w:t xml:space="preserve">10.</w:t>
+        <w:t xml:space="preserve">11.</w:t>
       </w:r>
     </w:p>
     <w:p>
@@ -14970,7 +14916,7 @@
         <w:t xml:space="preserve"> </w:t>
       </w:r>
       <w:r>
-        <w:t xml:space="preserve">Sorcery 16 (Specialty). Trained: Read People 14, Survival 14, Craft 12, Deception 12, Healing 12, Lore 12, Persuasion 12, Stealth 12, Tracking 12, Athletics 10.</w:t>
+        <w:t xml:space="preserve">Sorcery 16 (Specialty). Trained: Healing 14, Investigation 14, Lore 14, Read People 14, Survival 14, Stealth 13, Athletics 10, Deception 10, Persuasion 10.</w:t>
       </w:r>
     </w:p>
     <w:p>
@@ -14992,7 +14938,7 @@
         <w:t xml:space="preserve"> </w:t>
       </w:r>
       <w:r>
-        <w:t xml:space="preserve">Extra Trained skill, Extra Fortune.</w:t>
+        <w:t xml:space="preserve">+1 attribute point.</w:t>
       </w:r>
     </w:p>
     <w:p>
@@ -15014,7 +14960,7 @@
         <w:t xml:space="preserve"> </w:t>
       </w:r>
       <w:r>
-        <w:t xml:space="preserve">Herb-Wise.</w:t>
+        <w:t xml:space="preserve">Venom (ancestry; companion: Hated Blood).</w:t>
       </w:r>
       <w:r>
         <w:t xml:space="preserve"> </w:t>
@@ -15030,7 +14976,7 @@
         <w:t xml:space="preserve"> </w:t>
       </w:r>
       <w:r>
-        <w:t xml:space="preserve">Debt to a Sorcerer; trigger: a raven arrives with a sealed message.</w:t>
+        <w:t xml:space="preserve">Outcast; trigger: someone recognizes your exile mark.</w:t>
       </w:r>
     </w:p>
     <w:p>
@@ -15052,7 +14998,7 @@
         <w:t xml:space="preserve"> </w:t>
       </w:r>
       <w:r>
-        <w:t xml:space="preserve">Every day alive is a victory. I mean to have more of them.</w:t>
+        <w:t xml:space="preserve">The old empire’s secrets are out there. I will read them.</w:t>
       </w:r>
       <w:r>
         <w:t xml:space="preserve"> </w:t>
@@ -15068,17 +15014,17 @@
         <w:t xml:space="preserve"> </w:t>
       </w:r>
       <w:r>
-        <w:t xml:space="preserve">Gorrum carried her out of the burning village. He says he was just passing.</w:t>
-      </w:r>
-    </w:p>
-    <w:bookmarkEnd w:id="78"/>
-    <w:bookmarkStart w:id="79" w:name="gorrum-ironjaw"/>
+        <w:t xml:space="preserve">Oren Sael shelters Ithrann at his shrine when no inn will take a serpent-kin.</w:t>
+      </w:r>
+    </w:p>
+    <w:bookmarkEnd w:id="77"/>
+    <w:bookmarkStart w:id="78" w:name="nyx"/>
     <w:p>
       <w:pPr>
         <w:pStyle w:val="Heading2"/>
       </w:pPr>
       <w:r>
-        <w:t xml:space="preserve">Gorrum Ironjaw</w:t>
+        <w:t xml:space="preserve">Nyx</w:t>
       </w:r>
     </w:p>
     <w:p>
@@ -15090,13 +15036,13 @@
           <w:iCs/>
           <w:i/>
         </w:rPr>
-        <w:t xml:space="preserve">Sergeant of the Iron Company, Sellsword. Giant-blooded (tier 2).</w:t>
-      </w:r>
-      <w:r>
-        <w:t xml:space="preserve"> </w:t>
-      </w:r>
-      <w:r>
-        <w:t xml:space="preserve">Twenty years with the Iron Company, a wheel-lock pistol he calls Thunder, and a soft spot for strays.</w:t>
+        <w:t xml:space="preserve">Hedge-witch, Witch. Witch-blooded (tier 1).</w:t>
+      </w:r>
+      <w:r>
+        <w:t xml:space="preserve"> </w:t>
+      </w:r>
+      <w:r>
+        <w:t xml:space="preserve">Run out of her village with stones and torches; sells cures and curses to whoever pays.</w:t>
       </w:r>
     </w:p>
     <w:p>
@@ -15118,7 +15064,7 @@
         <w:t xml:space="preserve"> </w:t>
       </w:r>
       <w:r>
-        <w:t xml:space="preserve">Body 15, Agility 10, Intellect 9, Presence 10, Will 11.</w:t>
+        <w:t xml:space="preserve">Body 9, Agility 11, Intellect 11, Presence 11, Will 13.</w:t>
       </w:r>
       <w:r>
         <w:t xml:space="preserve"> </w:t>
@@ -15134,7 +15080,7 @@
         <w:t xml:space="preserve"> </w:t>
       </w:r>
       <w:r>
-        <w:t xml:space="preserve">9.</w:t>
+        <w:t xml:space="preserve">10.</w:t>
       </w:r>
     </w:p>
     <w:p>
@@ -15156,7 +15102,7 @@
         <w:t xml:space="preserve"> </w:t>
       </w:r>
       <w:r>
-        <w:t xml:space="preserve">Melee 18 (Specialty). Trained: Athletics 16, Brawling 16, Read People 12, Survival 12, Leadership 11, Marksmanship 11, Persuasion 11, Riding 11, Healing 10.</w:t>
+        <w:t xml:space="preserve">Sorcery 16 (Specialty). Trained: Read People 14, Survival 14, Craft 12, Deception 12, Healing 12, Lore 12, Persuasion 12, Stealth 12, Tracking 12, Athletics 10.</w:t>
       </w:r>
     </w:p>
     <w:p>
@@ -15178,7 +15124,7 @@
         <w:t xml:space="preserve"> </w:t>
       </w:r>
       <w:r>
-        <w:t xml:space="preserve">Second advantage; second advantage: Shield-Wall.</w:t>
+        <w:t xml:space="preserve">Extra Trained skill, Extra Fortune.</w:t>
       </w:r>
     </w:p>
     <w:p>
@@ -15200,7 +15146,7 @@
         <w:t xml:space="preserve"> </w:t>
       </w:r>
       <w:r>
-        <w:t xml:space="preserve">Battle-Hardened.</w:t>
+        <w:t xml:space="preserve">Herb-Wise.</w:t>
       </w:r>
       <w:r>
         <w:t xml:space="preserve"> </w:t>
@@ -15216,7 +15162,7 @@
         <w:t xml:space="preserve"> </w:t>
       </w:r>
       <w:r>
-        <w:t xml:space="preserve">Old Rival; trigger: your rival arrives first.</w:t>
+        <w:t xml:space="preserve">Debt to a Sorcerer; trigger: a raven arrives with a sealed message.</w:t>
       </w:r>
     </w:p>
     <w:p>
@@ -15238,7 +15184,7 @@
         <w:t xml:space="preserve"> </w:t>
       </w:r>
       <w:r>
-        <w:t xml:space="preserve">I did terrible things. I mean to balance the scales.</w:t>
+        <w:t xml:space="preserve">Every day alive is a victory. I mean to have more of them.</w:t>
       </w:r>
       <w:r>
         <w:t xml:space="preserve"> </w:t>
@@ -15254,17 +15200,17 @@
         <w:t xml:space="preserve"> </w:t>
       </w:r>
       <w:r>
-        <w:t xml:space="preserve">Nyx is the stray he carried out of the fire. He’d die before he’d say he cares.</w:t>
-      </w:r>
-    </w:p>
-    <w:bookmarkEnd w:id="79"/>
-    <w:bookmarkStart w:id="80" w:name="mira-saltwind"/>
+        <w:t xml:space="preserve">Gorrum carried her out of the burning village. He says he was just passing.</w:t>
+      </w:r>
+    </w:p>
+    <w:bookmarkEnd w:id="78"/>
+    <w:bookmarkStart w:id="79" w:name="gorrum-ironjaw"/>
     <w:p>
       <w:pPr>
         <w:pStyle w:val="Heading2"/>
       </w:pPr>
       <w:r>
-        <w:t xml:space="preserve">Mira Saltwind</w:t>
+        <w:t xml:space="preserve">Gorrum Ironjaw</w:t>
       </w:r>
     </w:p>
     <w:p>
@@ -15276,13 +15222,13 @@
           <w:iCs/>
           <w:i/>
         </w:rPr>
-        <w:t xml:space="preserve">Free captain, without a ship, Corsair. Islander (tier 0); Master.</w:t>
-      </w:r>
-      <w:r>
-        <w:t xml:space="preserve"> </w:t>
-      </w:r>
-      <w:r>
-        <w:t xml:space="preserve">Captain of the Kestrel until a sea-witch sank her. She kept her mother’s arquebus and her crew’s debts.</w:t>
+        <w:t xml:space="preserve">Sergeant of the Iron Company, Sellsword. Giant-blooded (tier 2).</w:t>
+      </w:r>
+      <w:r>
+        <w:t xml:space="preserve"> </w:t>
+      </w:r>
+      <w:r>
+        <w:t xml:space="preserve">Twenty years with the Iron Company, a wheel-lock pistol he calls Thunder, and a soft spot for strays.</w:t>
       </w:r>
     </w:p>
     <w:p>
@@ -15304,7 +15250,7 @@
         <w:t xml:space="preserve"> </w:t>
       </w:r>
       <w:r>
-        <w:t xml:space="preserve">Body 11, Agility 13, Intellect 10, Presence 11, Will 11.</w:t>
+        <w:t xml:space="preserve">Body 15, Agility 10, Intellect 9, Presence 10, Will 11.</w:t>
       </w:r>
       <w:r>
         <w:t xml:space="preserve"> </w:t>
@@ -15320,7 +15266,7 @@
         <w:t xml:space="preserve"> </w:t>
       </w:r>
       <w:r>
-        <w:t xml:space="preserve">12.</w:t>
+        <w:t xml:space="preserve">9.</w:t>
       </w:r>
     </w:p>
     <w:p>
@@ -15342,7 +15288,7 @@
         <w:t xml:space="preserve"> </w:t>
       </w:r>
       <w:r>
-        <w:t xml:space="preserve">Sailing 18 (Expert). Trained: Marksmanship 14, Stealth 14, Athletics 12, Brawling 12, Melee 12, Persuasion 12, Read People 12, Survival 12.</w:t>
+        <w:t xml:space="preserve">Melee 18 (Specialty). Trained: Athletics 16, Brawling 16, Read People 12, Survival 12, Leadership 11, Marksmanship 11, Persuasion 11, Riding 11, Healing 10.</w:t>
       </w:r>
     </w:p>
     <w:p>
@@ -15364,7 +15310,7 @@
         <w:t xml:space="preserve"> </w:t>
       </w:r>
       <w:r>
-        <w:t xml:space="preserve">+1 attribute point, Extra Trained skill, A fine weapon or tool; a fine tool: her mother’s arquebus, Widowmaker (+2 Marksmanship).</w:t>
+        <w:t xml:space="preserve">Second advantage; second advantage: Shield-Wall.</w:t>
       </w:r>
     </w:p>
     <w:p>
@@ -15386,7 +15332,7 @@
         <w:t xml:space="preserve"> </w:t>
       </w:r>
       <w:r>
-        <w:t xml:space="preserve">Sea Legs.</w:t>
+        <w:t xml:space="preserve">Battle-Hardened.</w:t>
       </w:r>
       <w:r>
         <w:t xml:space="preserve"> </w:t>
@@ -15402,7 +15348,7 @@
         <w:t xml:space="preserve"> </w:t>
       </w:r>
       <w:r>
-        <w:t xml:space="preserve">Sworn Vengeance; trigger: news of where your enemy is.</w:t>
+        <w:t xml:space="preserve">Old Rival; trigger: your rival arrives first.</w:t>
       </w:r>
     </w:p>
     <w:p>
@@ -15424,7 +15370,7 @@
         <w:t xml:space="preserve"> </w:t>
       </w:r>
       <w:r>
-        <w:t xml:space="preserve">Someone took everything from me. I mean to take it back, in blood.</w:t>
+        <w:t xml:space="preserve">I did terrible things. I mean to balance the scales.</w:t>
       </w:r>
       <w:r>
         <w:t xml:space="preserve"> </w:t>
@@ -15440,17 +15386,17 @@
         <w:t xml:space="preserve"> </w:t>
       </w:r>
       <w:r>
-        <w:t xml:space="preserve">Kara of the Long Winter owes her a life, and Mira means to collect.</w:t>
-      </w:r>
-    </w:p>
-    <w:bookmarkEnd w:id="80"/>
-    <w:bookmarkStart w:id="81" w:name="cinder"/>
+        <w:t xml:space="preserve">Nyx is the stray he carried out of the fire. He’d die before he’d say he cares.</w:t>
+      </w:r>
+    </w:p>
+    <w:bookmarkEnd w:id="79"/>
+    <w:bookmarkStart w:id="80" w:name="mira-saltwind"/>
     <w:p>
       <w:pPr>
         <w:pStyle w:val="Heading2"/>
       </w:pPr>
       <w:r>
-        <w:t xml:space="preserve">Cinder</w:t>
+        <w:t xml:space="preserve">Mira Saltwind</w:t>
       </w:r>
     </w:p>
     <w:p>
@@ -15462,13 +15408,13 @@
           <w:iCs/>
           <w:i/>
         </w:rPr>
-        <w:t xml:space="preserve">Former blade of the Ash Guild, Assassin. Ashborn (tier 1).</w:t>
-      </w:r>
-      <w:r>
-        <w:t xml:space="preserve"> </w:t>
-      </w:r>
-      <w:r>
-        <w:t xml:space="preserve">Made by the Ash Guild into its best knife; ran the night they ordered a child’s death.</w:t>
+        <w:t xml:space="preserve">Free captain, without a ship, Corsair. Islander (tier 0); Master.</w:t>
+      </w:r>
+      <w:r>
+        <w:t xml:space="preserve"> </w:t>
+      </w:r>
+      <w:r>
+        <w:t xml:space="preserve">Captain of the Kestrel until a sea-witch sank her. She kept her mother’s arquebus and her crew’s debts.</w:t>
       </w:r>
     </w:p>
     <w:p>
@@ -15490,7 +15436,7 @@
         <w:t xml:space="preserve"> </w:t>
       </w:r>
       <w:r>
-        <w:t xml:space="preserve">Body 12, Agility 13, Intellect 11, Presence 9, Will 11.</w:t>
+        <w:t xml:space="preserve">Body 11, Agility 13, Intellect 10, Presence 11, Will 11.</w:t>
       </w:r>
       <w:r>
         <w:t xml:space="preserve"> </w:t>
@@ -15528,7 +15474,7 @@
         <w:t xml:space="preserve"> </w:t>
       </w:r>
       <w:r>
-        <w:t xml:space="preserve">Stealth 16 (Specialty). Trained: Marksmanship 14, Thievery 14, Athletics 13, Brawling 13, Melee 13, Craft 12, Investigation 12, Read People 12, Survival 12, Deception 10.</w:t>
+        <w:t xml:space="preserve">Sailing 18 (Expert). Trained: Marksmanship 14, Stealth 14, Athletics 12, Brawling 12, Melee 12, Persuasion 12, Read People 12, Survival 12.</w:t>
       </w:r>
     </w:p>
     <w:p>
@@ -15550,7 +15496,7 @@
         <w:t xml:space="preserve"> </w:t>
       </w:r>
       <w:r>
-        <w:t xml:space="preserve">+1 attribute point, Extra Trained skill.</w:t>
+        <w:t xml:space="preserve">+1 attribute point, Extra Trained skill, A fine weapon or tool; a fine tool: her mother’s arquebus, Widowmaker (+2 Marksmanship).</w:t>
       </w:r>
     </w:p>
     <w:p>
@@ -15572,7 +15518,7 @@
         <w:t xml:space="preserve"> </w:t>
       </w:r>
       <w:r>
-        <w:t xml:space="preserve">Shadow-Walker.</w:t>
+        <w:t xml:space="preserve">Sea Legs.</w:t>
       </w:r>
       <w:r>
         <w:t xml:space="preserve"> </w:t>
@@ -15588,7 +15534,7 @@
         <w:t xml:space="preserve"> </w:t>
       </w:r>
       <w:r>
-        <w:t xml:space="preserve">Wanted; trigger: a bounty hunter takes the next room.</w:t>
+        <w:t xml:space="preserve">Sworn Vengeance; trigger: news of where your enemy is.</w:t>
       </w:r>
     </w:p>
     <w:p>
@@ -15610,7 +15556,7 @@
         <w:t xml:space="preserve"> </w:t>
       </w:r>
       <w:r>
-        <w:t xml:space="preserve">No master, no chains, no one to answer to.</w:t>
+        <w:t xml:space="preserve">Someone took everything from me. I mean to take it back, in blood.</w:t>
       </w:r>
       <w:r>
         <w:t xml:space="preserve"> </w:t>
@@ -15626,17 +15572,17 @@
         <w:t xml:space="preserve"> </w:t>
       </w:r>
       <w:r>
-        <w:t xml:space="preserve">Vessa Thorn was their last contract. They let her live and have been running ever since.</w:t>
-      </w:r>
-    </w:p>
-    <w:bookmarkEnd w:id="81"/>
-    <w:bookmarkStart w:id="82" w:name="oren-sael"/>
+        <w:t xml:space="preserve">Kara of the Long Winter owes her a life, and Mira means to collect.</w:t>
+      </w:r>
+    </w:p>
+    <w:bookmarkEnd w:id="80"/>
+    <w:bookmarkStart w:id="81" w:name="cinder"/>
     <w:p>
       <w:pPr>
         <w:pStyle w:val="Heading2"/>
       </w:pPr>
       <w:r>
-        <w:t xml:space="preserve">Oren Sael</w:t>
+        <w:t xml:space="preserve">Cinder</w:t>
       </w:r>
     </w:p>
     <w:p>
@@ -15648,13 +15594,13 @@
           <w:iCs/>
           <w:i/>
         </w:rPr>
-        <w:t xml:space="preserve">Keeper of the Last Shrine, Priest. Sand-born (tier 0).</w:t>
-      </w:r>
-      <w:r>
-        <w:t xml:space="preserve"> </w:t>
-      </w:r>
-      <w:r>
-        <w:t xml:space="preserve">The last priest of Haddu, god of wells, who keeps a shrine no caravan visits and a flame that is going out.</w:t>
+        <w:t xml:space="preserve">Former blade of the Ash Guild, Assassin. Ashborn (tier 1).</w:t>
+      </w:r>
+      <w:r>
+        <w:t xml:space="preserve"> </w:t>
+      </w:r>
+      <w:r>
+        <w:t xml:space="preserve">Made by the Ash Guild into its best knife; ran the night they ordered a child’s death.</w:t>
       </w:r>
     </w:p>
     <w:p>
@@ -15676,7 +15622,7 @@
         <w:t xml:space="preserve"> </w:t>
       </w:r>
       <w:r>
-        <w:t xml:space="preserve">Body 10, Agility 10, Intellect 11, Presence 13, Will 13.</w:t>
+        <w:t xml:space="preserve">Body 12, Agility 13, Intellect 11, Presence 9, Will 11.</w:t>
       </w:r>
       <w:r>
         <w:t xml:space="preserve"> </w:t>
@@ -15692,7 +15638,7 @@
         <w:t xml:space="preserve"> </w:t>
       </w:r>
       <w:r>
-        <w:t xml:space="preserve">9.</w:t>
+        <w:t xml:space="preserve">12.</w:t>
       </w:r>
     </w:p>
     <w:p>
@@ -15714,7 +15660,7 @@
         <w:t xml:space="preserve"> </w:t>
       </w:r>
       <w:r>
-        <w:t xml:space="preserve">Persuasion 16 (Specialty). Trained: Leadership 14, Read People 14, Survival 14, Healing 12, Investigation 12, Lore 12, Athletics 11, Melee 11, Riding 11.</w:t>
+        <w:t xml:space="preserve">Stealth 16 (Specialty). Trained: Marksmanship 14, Thievery 14, Athletics 13, Brawling 13, Melee 13, Craft 12, Investigation 12, Read People 12, Survival 12, Deception 10.</w:t>
       </w:r>
     </w:p>
     <w:p>
@@ -15736,7 +15682,7 @@
         <w:t xml:space="preserve"> </w:t>
       </w:r>
       <w:r>
-        <w:t xml:space="preserve">+1 attribute point ×2, A friend; a friend: Yusra, the last caravan-master who still stops at the shrine.</w:t>
+        <w:t xml:space="preserve">+1 attribute point, Extra Trained skill.</w:t>
       </w:r>
     </w:p>
     <w:p>
@@ -15758,7 +15704,7 @@
         <w:t xml:space="preserve"> </w:t>
       </w:r>
       <w:r>
-        <w:t xml:space="preserve">Iron Will.</w:t>
+        <w:t xml:space="preserve">Shadow-Walker.</w:t>
       </w:r>
       <w:r>
         <w:t xml:space="preserve"> </w:t>
@@ -15774,7 +15720,7 @@
         <w:t xml:space="preserve"> </w:t>
       </w:r>
       <w:r>
-        <w:t xml:space="preserve">Oath-Bound; trigger: keeping the vow means abandoning the plan.</w:t>
+        <w:t xml:space="preserve">Wanted; trigger: a bounty hunter takes the next room.</w:t>
       </w:r>
     </w:p>
     <w:p>
@@ -15782,6 +15728,192 @@
         <w:numPr>
           <w:ilvl w:val="0"/>
           <w:numId w:val="1021"/>
+        </w:numPr>
+        <w:pStyle w:val="Compact"/>
+      </w:pPr>
+      <w:r>
+        <w:rPr>
+          <w:bCs/>
+          <w:b/>
+        </w:rPr>
+        <w:t xml:space="preserve">What drives me:</w:t>
+      </w:r>
+      <w:r>
+        <w:t xml:space="preserve"> </w:t>
+      </w:r>
+      <w:r>
+        <w:t xml:space="preserve">No master, no chains, no one to answer to.</w:t>
+      </w:r>
+      <w:r>
+        <w:t xml:space="preserve"> </w:t>
+      </w:r>
+      <w:r>
+        <w:rPr>
+          <w:bCs/>
+          <w:b/>
+        </w:rPr>
+        <w:t xml:space="preserve">Connection:</w:t>
+      </w:r>
+      <w:r>
+        <w:t xml:space="preserve"> </w:t>
+      </w:r>
+      <w:r>
+        <w:t xml:space="preserve">Vessa Thorn was their last contract. They let her live and have been running ever since.</w:t>
+      </w:r>
+    </w:p>
+    <w:bookmarkEnd w:id="81"/>
+    <w:bookmarkStart w:id="82" w:name="oren-sael"/>
+    <w:p>
+      <w:pPr>
+        <w:pStyle w:val="Heading2"/>
+      </w:pPr>
+      <w:r>
+        <w:t xml:space="preserve">Oren Sael</w:t>
+      </w:r>
+    </w:p>
+    <w:p>
+      <w:pPr>
+        <w:pStyle w:val="FirstParagraph"/>
+      </w:pPr>
+      <w:r>
+        <w:rPr>
+          <w:iCs/>
+          <w:i/>
+        </w:rPr>
+        <w:t xml:space="preserve">Keeper of the Last Shrine, Priest. Sand-born (tier 0).</w:t>
+      </w:r>
+      <w:r>
+        <w:t xml:space="preserve"> </w:t>
+      </w:r>
+      <w:r>
+        <w:t xml:space="preserve">The last priest of Haddu, god of wells, who keeps a shrine no caravan visits and a flame that is going out.</w:t>
+      </w:r>
+    </w:p>
+    <w:p>
+      <w:pPr>
+        <w:numPr>
+          <w:ilvl w:val="0"/>
+          <w:numId w:val="1022"/>
+        </w:numPr>
+        <w:pStyle w:val="Compact"/>
+      </w:pPr>
+      <w:r>
+        <w:rPr>
+          <w:bCs/>
+          <w:b/>
+        </w:rPr>
+        <w:t xml:space="preserve">Attributes:</w:t>
+      </w:r>
+      <w:r>
+        <w:t xml:space="preserve"> </w:t>
+      </w:r>
+      <w:r>
+        <w:t xml:space="preserve">Body 10, Agility 10, Intellect 11, Presence 13, Will 13.</w:t>
+      </w:r>
+      <w:r>
+        <w:t xml:space="preserve"> </w:t>
+      </w:r>
+      <w:r>
+        <w:rPr>
+          <w:bCs/>
+          <w:b/>
+        </w:rPr>
+        <w:t xml:space="preserve">Dodge</w:t>
+      </w:r>
+      <w:r>
+        <w:t xml:space="preserve"> </w:t>
+      </w:r>
+      <w:r>
+        <w:t xml:space="preserve">9.</w:t>
+      </w:r>
+    </w:p>
+    <w:p>
+      <w:pPr>
+        <w:numPr>
+          <w:ilvl w:val="0"/>
+          <w:numId w:val="1022"/>
+        </w:numPr>
+        <w:pStyle w:val="Compact"/>
+      </w:pPr>
+      <w:r>
+        <w:rPr>
+          <w:bCs/>
+          <w:b/>
+        </w:rPr>
+        <w:t xml:space="preserve">Skills:</w:t>
+      </w:r>
+      <w:r>
+        <w:t xml:space="preserve"> </w:t>
+      </w:r>
+      <w:r>
+        <w:t xml:space="preserve">Persuasion 16 (Specialty). Trained: Leadership 14, Read People 14, Survival 14, Healing 12, Investigation 12, Lore 12, Athletics 11, Melee 11, Riding 11.</w:t>
+      </w:r>
+    </w:p>
+    <w:p>
+      <w:pPr>
+        <w:numPr>
+          <w:ilvl w:val="0"/>
+          <w:numId w:val="1022"/>
+        </w:numPr>
+        <w:pStyle w:val="Compact"/>
+      </w:pPr>
+      <w:r>
+        <w:rPr>
+          <w:bCs/>
+          <w:b/>
+        </w:rPr>
+        <w:t xml:space="preserve">Edges:</w:t>
+      </w:r>
+      <w:r>
+        <w:t xml:space="preserve"> </w:t>
+      </w:r>
+      <w:r>
+        <w:t xml:space="preserve">+1 attribute point ×2, A friend; a friend: Yusra, the last caravan-master who still stops at the shrine.</w:t>
+      </w:r>
+    </w:p>
+    <w:p>
+      <w:pPr>
+        <w:numPr>
+          <w:ilvl w:val="0"/>
+          <w:numId w:val="1022"/>
+        </w:numPr>
+        <w:pStyle w:val="Compact"/>
+      </w:pPr>
+      <w:r>
+        <w:rPr>
+          <w:bCs/>
+          <w:b/>
+        </w:rPr>
+        <w:t xml:space="preserve">Advantage:</w:t>
+      </w:r>
+      <w:r>
+        <w:t xml:space="preserve"> </w:t>
+      </w:r>
+      <w:r>
+        <w:t xml:space="preserve">Iron Will.</w:t>
+      </w:r>
+      <w:r>
+        <w:t xml:space="preserve"> </w:t>
+      </w:r>
+      <w:r>
+        <w:rPr>
+          <w:bCs/>
+          <w:b/>
+        </w:rPr>
+        <w:t xml:space="preserve">Complication:</w:t>
+      </w:r>
+      <w:r>
+        <w:t xml:space="preserve"> </w:t>
+      </w:r>
+      <w:r>
+        <w:t xml:space="preserve">Oath-Bound; trigger: keeping the vow means abandoning the plan.</w:t>
+      </w:r>
+    </w:p>
+    <w:p>
+      <w:pPr>
+        <w:numPr>
+          <w:ilvl w:val="0"/>
+          <w:numId w:val="1022"/>
         </w:numPr>
         <w:pStyle w:val="Compact"/>
       </w:pPr>
@@ -19097,7 +19229,7 @@
       <w:pPr>
         <w:numPr>
           <w:ilvl w:val="0"/>
-          <w:numId w:val="1022"/>
+          <w:numId w:val="1023"/>
         </w:numPr>
         <w:pStyle w:val="Compact"/>
       </w:pPr>
@@ -19435,7 +19567,7 @@
       <w:pPr>
         <w:numPr>
           <w:ilvl w:val="0"/>
-          <w:numId w:val="1023"/>
+          <w:numId w:val="1024"/>
         </w:numPr>
         <w:pStyle w:val="Compact"/>
       </w:pPr>
@@ -19447,7 +19579,7 @@
       <w:pPr>
         <w:numPr>
           <w:ilvl w:val="0"/>
-          <w:numId w:val="1023"/>
+          <w:numId w:val="1024"/>
         </w:numPr>
         <w:pStyle w:val="Compact"/>
       </w:pPr>
@@ -19785,7 +19917,7 @@
       <w:pPr>
         <w:numPr>
           <w:ilvl w:val="0"/>
-          <w:numId w:val="1024"/>
+          <w:numId w:val="1025"/>
         </w:numPr>
         <w:pStyle w:val="Compact"/>
       </w:pPr>
@@ -19797,7 +19929,7 @@
       <w:pPr>
         <w:numPr>
           <w:ilvl w:val="0"/>
-          <w:numId w:val="1024"/>
+          <w:numId w:val="1025"/>
         </w:numPr>
         <w:pStyle w:val="Compact"/>
       </w:pPr>
@@ -20153,7 +20285,7 @@
       <w:pPr>
         <w:numPr>
           <w:ilvl w:val="0"/>
-          <w:numId w:val="1025"/>
+          <w:numId w:val="1026"/>
         </w:numPr>
         <w:pStyle w:val="Compact"/>
       </w:pPr>
@@ -20165,7 +20297,7 @@
       <w:pPr>
         <w:numPr>
           <w:ilvl w:val="0"/>
-          <w:numId w:val="1025"/>
+          <w:numId w:val="1026"/>
         </w:numPr>
         <w:pStyle w:val="Compact"/>
       </w:pPr>
@@ -20503,7 +20635,7 @@
       <w:pPr>
         <w:numPr>
           <w:ilvl w:val="0"/>
-          <w:numId w:val="1026"/>
+          <w:numId w:val="1027"/>
         </w:numPr>
         <w:pStyle w:val="Compact"/>
       </w:pPr>
@@ -20841,7 +20973,7 @@
       <w:pPr>
         <w:numPr>
           <w:ilvl w:val="0"/>
-          <w:numId w:val="1027"/>
+          <w:numId w:val="1028"/>
         </w:numPr>
         <w:pStyle w:val="Compact"/>
       </w:pPr>
@@ -20853,7 +20985,7 @@
       <w:pPr>
         <w:numPr>
           <w:ilvl w:val="0"/>
-          <w:numId w:val="1027"/>
+          <w:numId w:val="1028"/>
         </w:numPr>
         <w:pStyle w:val="Compact"/>
       </w:pPr>
@@ -21191,7 +21323,7 @@
       <w:pPr>
         <w:numPr>
           <w:ilvl w:val="0"/>
-          <w:numId w:val="1028"/>
+          <w:numId w:val="1029"/>
         </w:numPr>
         <w:pStyle w:val="Compact"/>
       </w:pPr>
@@ -21203,7 +21335,7 @@
       <w:pPr>
         <w:numPr>
           <w:ilvl w:val="0"/>
-          <w:numId w:val="1028"/>
+          <w:numId w:val="1029"/>
         </w:numPr>
         <w:pStyle w:val="Compact"/>
       </w:pPr>
@@ -21575,7 +21707,7 @@
       <w:pPr>
         <w:numPr>
           <w:ilvl w:val="0"/>
-          <w:numId w:val="1029"/>
+          <w:numId w:val="1030"/>
         </w:numPr>
         <w:pStyle w:val="Compact"/>
       </w:pPr>
@@ -21587,7 +21719,7 @@
       <w:pPr>
         <w:numPr>
           <w:ilvl w:val="0"/>
-          <w:numId w:val="1029"/>
+          <w:numId w:val="1030"/>
         </w:numPr>
         <w:pStyle w:val="Compact"/>
       </w:pPr>
@@ -21925,7 +22057,7 @@
       <w:pPr>
         <w:numPr>
           <w:ilvl w:val="0"/>
-          <w:numId w:val="1030"/>
+          <w:numId w:val="1031"/>
         </w:numPr>
         <w:pStyle w:val="Compact"/>
       </w:pPr>
@@ -21937,7 +22069,7 @@
       <w:pPr>
         <w:numPr>
           <w:ilvl w:val="0"/>
-          <w:numId w:val="1030"/>
+          <w:numId w:val="1031"/>
         </w:numPr>
         <w:pStyle w:val="Compact"/>
       </w:pPr>
@@ -21949,7 +22081,7 @@
       <w:pPr>
         <w:numPr>
           <w:ilvl w:val="0"/>
-          <w:numId w:val="1030"/>
+          <w:numId w:val="1031"/>
         </w:numPr>
         <w:pStyle w:val="Compact"/>
       </w:pPr>
@@ -22297,7 +22429,7 @@
       <w:pPr>
         <w:numPr>
           <w:ilvl w:val="0"/>
-          <w:numId w:val="1031"/>
+          <w:numId w:val="1032"/>
         </w:numPr>
         <w:pStyle w:val="Compact"/>
       </w:pPr>
@@ -22343,7 +22475,7 @@
       <w:pPr>
         <w:numPr>
           <w:ilvl w:val="0"/>
-          <w:numId w:val="1031"/>
+          <w:numId w:val="1032"/>
         </w:numPr>
         <w:pStyle w:val="Compact"/>
       </w:pPr>
@@ -22365,7 +22497,7 @@
       <w:pPr>
         <w:numPr>
           <w:ilvl w:val="0"/>
-          <w:numId w:val="1031"/>
+          <w:numId w:val="1032"/>
         </w:numPr>
         <w:pStyle w:val="Compact"/>
       </w:pPr>
@@ -22387,7 +22519,7 @@
       <w:pPr>
         <w:numPr>
           <w:ilvl w:val="0"/>
-          <w:numId w:val="1031"/>
+          <w:numId w:val="1032"/>
         </w:numPr>
         <w:pStyle w:val="Compact"/>
       </w:pPr>
@@ -22954,7 +23086,7 @@
       <w:pPr>
         <w:numPr>
           <w:ilvl w:val="0"/>
-          <w:numId w:val="1032"/>
+          <w:numId w:val="1033"/>
         </w:numPr>
         <w:pStyle w:val="Compact"/>
       </w:pPr>
@@ -22982,7 +23114,7 @@
       <w:pPr>
         <w:numPr>
           <w:ilvl w:val="0"/>
-          <w:numId w:val="1032"/>
+          <w:numId w:val="1033"/>
         </w:numPr>
         <w:pStyle w:val="Compact"/>
       </w:pPr>
@@ -22994,7 +23126,7 @@
       <w:pPr>
         <w:numPr>
           <w:ilvl w:val="0"/>
-          <w:numId w:val="1032"/>
+          <w:numId w:val="1033"/>
         </w:numPr>
         <w:pStyle w:val="Compact"/>
       </w:pPr>
@@ -23022,7 +23154,7 @@
       <w:pPr>
         <w:numPr>
           <w:ilvl w:val="0"/>
-          <w:numId w:val="1032"/>
+          <w:numId w:val="1033"/>
         </w:numPr>
         <w:pStyle w:val="Compact"/>
       </w:pPr>
@@ -24487,6 +24619,9 @@
     <w:abstractNumId w:val="991"/>
   </w:num>
   <w:num w:numId="1031">
+    <w:abstractNumId w:val="991"/>
+  </w:num>
+  <w:num w:numId="1032">
     <w:abstractNumId w:val="99411"/>
     <w:lvlOverride w:ilvl="0">
       <w:startOverride w:val="1"/>
@@ -24516,7 +24651,7 @@
       <w:startOverride w:val="1"/>
     </w:lvlOverride>
   </w:num>
-  <w:num w:numId="1032">
+  <w:num w:numId="1033">
     <w:abstractNumId w:val="99411"/>
     <w:lvlOverride w:ilvl="0">
       <w:startOverride w:val="1"/>

</xml_diff>

<commit_message>
Magic advancement for The Shattered Crown and Dust & Damnation
Casters can take a magic option instead of a skill step after a significant
venture or job, with the GM's approval: extra cantrips or ready charms,
cantrip mastery, rituals by heart, a quicker hand (western), and Archmage /
Master of the tradition (Expert, end of a long campaign). The creator records
them under 'Magic grown in play' and shows them on the sheet.

Co-Authored-By: Claude Opus 5.5 <noreply@anthropic.com>
Claude-Session: https://claude.ai/code/session_015SADCFzhKijkC2foUmXrpC
</commit_message>
<xml_diff>
--- a/legend-dynamics/fantasy/The_Shattered_Crown_Players_Guide.docx
+++ b/legend-dynamics/fantasy/The_Shattered_Crown_Players_Guide.docx
@@ -12030,7 +12030,7 @@
     </w:p>
     <w:bookmarkEnd w:id="68"/>
     <w:bookmarkEnd w:id="69"/>
-    <w:bookmarkStart w:id="73" w:name="sorcery"/>
+    <w:bookmarkStart w:id="74" w:name="sorcery"/>
     <w:p>
       <w:pPr>
         <w:pStyle w:val="Heading1"/>
@@ -13618,8 +13618,332 @@
       </w:r>
     </w:p>
     <w:bookmarkEnd w:id="72"/>
+    <w:bookmarkStart w:id="73" w:name="magic-advancement"/>
+    <w:p>
+      <w:pPr>
+        <w:pStyle w:val="Heading2"/>
+      </w:pPr>
+      <w:r>
+        <w:t xml:space="preserve">Magic advancement</w:t>
+      </w:r>
+    </w:p>
+    <w:p>
+      <w:pPr>
+        <w:pStyle w:val="FirstParagraph"/>
+      </w:pPr>
+      <w:r>
+        <w:t xml:space="preserve">A caster’s magic grows in play. After a significant venture, a caster can take one of these</w:t>
+      </w:r>
+      <w:r>
+        <w:t xml:space="preserve"> </w:t>
+      </w:r>
+      <w:r>
+        <w:rPr>
+          <w:bCs/>
+          <w:b/>
+        </w:rPr>
+        <w:t xml:space="preserve">instead of a skill step</w:t>
+      </w:r>
+      <w:r>
+        <w:t xml:space="preserve">, with the GM’s approval and a reason from the story: a grimoire recovered, a teacher found, a spell cast a hundred times under pressure. Corruption still applies to everything below.</w:t>
+      </w:r>
+    </w:p>
+    <w:tbl>
+      <w:tblPr>
+        <w:tblStyle w:val="Table"/>
+        <w:tblW w:type="pct" w:w="5000"/>
+        <w:tblLook w:firstRow="1" w:lastRow="0" w:firstColumn="0" w:lastColumn="0" w:noHBand="0" w:noVBand="0" w:val="0020"/>
+        <w:jc w:val="start"/>
+        <w:tblBorders>
+          <w:top w:val="single" w:sz="4" w:color="B8C2D3"/>
+          <w:left w:val="single" w:sz="4" w:color="B8C2D3"/>
+          <w:bottom w:val="single" w:sz="4" w:color="B8C2D3"/>
+          <w:right w:val="single" w:sz="4" w:color="B8C2D3"/>
+          <w:insideH w:val="single" w:sz="4" w:color="B8C2D3"/>
+          <w:insideV w:val="single" w:sz="4" w:color="B8C2D3"/>
+        </w:tblBorders>
+      </w:tblPr>
+      <w:tblGrid>
+        <w:gridCol w:w="2640"/>
+        <w:gridCol w:w="2640"/>
+        <w:gridCol w:w="2640"/>
+      </w:tblGrid>
+      <w:tr>
+        <w:trPr>
+          <w:tblHeader w:val="true"/>
+        </w:trPr>
+        <w:tc>
+          <w:tcPr>
+            <w:shd w:val="clear" w:fill="F2E7D6"/>
+          </w:tcPr>
+          <w:p>
+            <w:pPr>
+              <w:pStyle w:val="Compact"/>
+              <w:jc w:val="left"/>
+            </w:pPr>
+            <w:r>
+              <w:rPr>
+                <w:b/>
+                <w:sz w:val="19"/>
+              </w:rPr>
+              <w:t xml:space="preserve">Option</w:t>
+            </w:r>
+          </w:p>
+        </w:tc>
+        <w:tc>
+          <w:tcPr>
+            <w:shd w:val="clear" w:fill="F2E7D6"/>
+          </w:tcPr>
+          <w:p>
+            <w:pPr>
+              <w:pStyle w:val="Compact"/>
+              <w:jc w:val="left"/>
+            </w:pPr>
+            <w:r>
+              <w:rPr>
+                <w:b/>
+                <w:sz w:val="19"/>
+              </w:rPr>
+              <w:t xml:space="preserve">Effect</w:t>
+            </w:r>
+          </w:p>
+        </w:tc>
+        <w:tc>
+          <w:tcPr>
+            <w:shd w:val="clear" w:fill="F2E7D6"/>
+          </w:tcPr>
+          <w:p>
+            <w:pPr>
+              <w:pStyle w:val="Compact"/>
+              <w:jc w:val="left"/>
+            </w:pPr>
+            <w:r>
+              <w:rPr>
+                <w:b/>
+                <w:sz w:val="19"/>
+              </w:rPr>
+              <w:t xml:space="preserve">Limit</w:t>
+            </w:r>
+          </w:p>
+        </w:tc>
+      </w:tr>
+      <w:tr>
+        <w:tc>
+          <w:tcPr/>
+          <w:p>
+            <w:pPr>
+              <w:pStyle w:val="Compact"/>
+              <w:jc w:val="left"/>
+            </w:pPr>
+            <w:r>
+              <w:rPr>
+                <w:b/>
+                <w:sz w:val="19"/>
+              </w:rPr>
+              <w:t xml:space="preserve">New cantrip</w:t>
+            </w:r>
+          </w:p>
+        </w:tc>
+        <w:tc>
+          <w:tcPr/>
+          <w:p>
+            <w:pPr>
+              <w:pStyle w:val="Compact"/>
+              <w:jc w:val="left"/>
+            </w:pPr>
+            <w:r>
+              <w:rPr>
+                <w:sz w:val="19"/>
+              </w:rPr>
+              <w:t xml:space="preserve">Learn one cantrip beyond your Sorcery limit</w:t>
+            </w:r>
+          </w:p>
+        </w:tc>
+        <w:tc>
+          <w:tcPr/>
+          <w:p>
+            <w:pPr>
+              <w:pStyle w:val="Compact"/>
+              <w:jc w:val="left"/>
+            </w:pPr>
+            <w:r>
+              <w:rPr>
+                <w:sz w:val="19"/>
+              </w:rPr>
+              <w:t xml:space="preserve">Up to 2 extra</w:t>
+            </w:r>
+          </w:p>
+        </w:tc>
+      </w:tr>
+      <w:tr>
+        <w:tc>
+          <w:tcPr/>
+          <w:p>
+            <w:pPr>
+              <w:pStyle w:val="Compact"/>
+              <w:jc w:val="left"/>
+            </w:pPr>
+            <w:r>
+              <w:rPr>
+                <w:b/>
+                <w:sz w:val="19"/>
+              </w:rPr>
+              <w:t xml:space="preserve">Cantrip mastery</w:t>
+            </w:r>
+          </w:p>
+        </w:tc>
+        <w:tc>
+          <w:tcPr/>
+          <w:p>
+            <w:pPr>
+              <w:pStyle w:val="Compact"/>
+              <w:jc w:val="left"/>
+            </w:pPr>
+            <w:r>
+              <w:rPr>
+                <w:sz w:val="19"/>
+              </w:rPr>
+              <w:t xml:space="preserve">+2 to cast one cantrip, and a failed cast with it marks no Corruption (a natural 18 still marks 2)</w:t>
+            </w:r>
+          </w:p>
+        </w:tc>
+        <w:tc>
+          <w:tcPr/>
+          <w:p>
+            <w:pPr>
+              <w:pStyle w:val="Compact"/>
+              <w:jc w:val="left"/>
+            </w:pPr>
+            <w:r>
+              <w:rPr>
+                <w:sz w:val="19"/>
+              </w:rPr>
+              <w:t xml:space="preserve">Each cantrip once</w:t>
+            </w:r>
+          </w:p>
+        </w:tc>
+      </w:tr>
+      <w:tr>
+        <w:tc>
+          <w:tcPr/>
+          <w:p>
+            <w:pPr>
+              <w:pStyle w:val="Compact"/>
+              <w:jc w:val="left"/>
+            </w:pPr>
+            <w:r>
+              <w:rPr>
+                <w:b/>
+                <w:sz w:val="19"/>
+              </w:rPr>
+              <w:t xml:space="preserve">Ritual by heart</w:t>
+            </w:r>
+          </w:p>
+        </w:tc>
+        <w:tc>
+          <w:tcPr/>
+          <w:p>
+            <w:pPr>
+              <w:pStyle w:val="Compact"/>
+              <w:jc w:val="left"/>
+            </w:pPr>
+            <w:r>
+              <w:rPr>
+                <w:sz w:val="19"/>
+              </w:rPr>
+              <w:t xml:space="preserve">One kind of ritual (wards, curses, questions of the dead) takes one fewer segment, to a minimum of 1</w:t>
+            </w:r>
+          </w:p>
+        </w:tc>
+        <w:tc>
+          <w:tcPr/>
+          <w:p>
+            <w:pPr>
+              <w:pStyle w:val="Compact"/>
+              <w:jc w:val="left"/>
+            </w:pPr>
+            <w:r>
+              <w:rPr>
+                <w:sz w:val="19"/>
+              </w:rPr>
+              <w:t xml:space="preserve">Each kind once</w:t>
+            </w:r>
+          </w:p>
+        </w:tc>
+      </w:tr>
+      <w:tr>
+        <w:tc>
+          <w:tcPr/>
+          <w:p>
+            <w:pPr>
+              <w:pStyle w:val="Compact"/>
+              <w:jc w:val="left"/>
+            </w:pPr>
+            <w:r>
+              <w:rPr>
+                <w:b/>
+                <w:sz w:val="19"/>
+              </w:rPr>
+              <w:t xml:space="preserve">Archmage</w:t>
+            </w:r>
+          </w:p>
+        </w:tc>
+        <w:tc>
+          <w:tcPr/>
+          <w:p>
+            <w:pPr>
+              <w:pStyle w:val="Compact"/>
+              <w:jc w:val="left"/>
+            </w:pPr>
+            <w:r>
+              <w:rPr>
+                <w:sz w:val="19"/>
+              </w:rPr>
+              <w:t xml:space="preserve">Sorcery becomes Expert (+5), and you know 4 cantrips before extras</w:t>
+            </w:r>
+          </w:p>
+        </w:tc>
+        <w:tc>
+          <w:tcPr/>
+          <w:p>
+            <w:pPr>
+              <w:pStyle w:val="Compact"/>
+              <w:jc w:val="left"/>
+            </w:pPr>
+            <w:r>
+              <w:rPr>
+                <w:sz w:val="19"/>
+              </w:rPr>
+              <w:t xml:space="preserve">Once, at the end of a long campaign, with the GM’s approval</w:t>
+            </w:r>
+          </w:p>
+        </w:tc>
+      </w:tr>
+    </w:tbl>
+    <w:p>
+      <w:pPr>
+        <w:pStyle w:val="BodyText"/>
+      </w:pPr>
+      <w:r>
+        <w:t xml:space="preserve">Record these in the creator under</w:t>
+      </w:r>
+      <w:r>
+        <w:t xml:space="preserve"> </w:t>
+      </w:r>
+      <w:r>
+        <w:rPr>
+          <w:bCs/>
+          <w:b/>
+        </w:rPr>
+        <w:t xml:space="preserve">Magic grown in play</w:t>
+      </w:r>
+      <w:r>
+        <w:t xml:space="preserve">: extra cantrips raise your limit, mastered cantrips show on the sheet, and your rituals by heart are listed with them.</w:t>
+      </w:r>
+    </w:p>
     <w:bookmarkEnd w:id="73"/>
-    <w:bookmarkStart w:id="75" w:name="the-world"/>
+    <w:bookmarkEnd w:id="74"/>
+    <w:bookmarkStart w:id="76" w:name="the-world"/>
     <w:p>
       <w:pPr>
         <w:pStyle w:val="Heading1"/>
@@ -13813,7 +14137,7 @@
         <w:t xml:space="preserve">The empire’s blasted center, where the Crown broke. Nothing grows; shards and madmen are found there.</w:t>
       </w:r>
     </w:p>
-    <w:bookmarkStart w:id="74" w:name="powers"/>
+    <w:bookmarkStart w:id="75" w:name="powers"/>
     <w:p>
       <w:pPr>
         <w:pStyle w:val="Heading2"/>
@@ -13954,9 +14278,9 @@
         <w:t xml:space="preserve">Every city has one; they don’t all get along.</w:t>
       </w:r>
     </w:p>
-    <w:bookmarkEnd w:id="74"/>
     <w:bookmarkEnd w:id="75"/>
-    <w:bookmarkStart w:id="76" w:name="threats"/>
+    <w:bookmarkEnd w:id="76"/>
+    <w:bookmarkStart w:id="77" w:name="threats"/>
     <w:p>
       <w:pPr>
         <w:pStyle w:val="Heading1"/>
@@ -15334,8 +15658,8 @@
         <w:t xml:space="preserve">For a tougher version, add +1 to its targets and one box; for a weaker one, subtract.</w:t>
       </w:r>
     </w:p>
-    <w:bookmarkEnd w:id="76"/>
-    <w:bookmarkStart w:id="84" w:name="ready-made-characters"/>
+    <w:bookmarkEnd w:id="77"/>
+    <w:bookmarkStart w:id="85" w:name="ready-made-characters"/>
     <w:p>
       <w:pPr>
         <w:pStyle w:val="Heading1"/>
@@ -15352,7 +15676,7 @@
         <w:t xml:space="preserve">Characters ready to play, for one-shots, new players, or a group in a hurry. Each follows the creation rules exactly, and their connections tie them together. In the creator, choose one from the ready-made list to open it and make it your own.</w:t>
       </w:r>
     </w:p>
-    <w:bookmarkStart w:id="77" w:name="vessa-thorn"/>
+    <w:bookmarkStart w:id="78" w:name="vessa-thorn"/>
     <w:p>
       <w:pPr>
         <w:pStyle w:val="Heading2"/>
@@ -15537,8 +15861,8 @@
         <w:t xml:space="preserve">Cinder was paid to kill her and didn’t. Neither of them has said why.</w:t>
       </w:r>
     </w:p>
-    <w:bookmarkEnd w:id="77"/>
-    <w:bookmarkStart w:id="78" w:name="ithrann"/>
+    <w:bookmarkEnd w:id="78"/>
+    <w:bookmarkStart w:id="79" w:name="ithrann"/>
     <w:p>
       <w:pPr>
         <w:pStyle w:val="Heading2"/>
@@ -15723,8 +16047,8 @@
         <w:t xml:space="preserve">Oren Sael shelters Ithrann at his shrine when no inn will take a serpent-kin.</w:t>
       </w:r>
     </w:p>
-    <w:bookmarkEnd w:id="78"/>
-    <w:bookmarkStart w:id="79" w:name="nyx"/>
+    <w:bookmarkEnd w:id="79"/>
+    <w:bookmarkStart w:id="80" w:name="nyx"/>
     <w:p>
       <w:pPr>
         <w:pStyle w:val="Heading2"/>
@@ -15909,8 +16233,8 @@
         <w:t xml:space="preserve">Gorrum carried her out of the burning village. He says he was just passing.</w:t>
       </w:r>
     </w:p>
-    <w:bookmarkEnd w:id="79"/>
-    <w:bookmarkStart w:id="80" w:name="gorrum-ironjaw"/>
+    <w:bookmarkEnd w:id="80"/>
+    <w:bookmarkStart w:id="81" w:name="gorrum-ironjaw"/>
     <w:p>
       <w:pPr>
         <w:pStyle w:val="Heading2"/>
@@ -16095,8 +16419,8 @@
         <w:t xml:space="preserve">Nyx is the stray he carried out of the fire. He’d die before he’d say he cares.</w:t>
       </w:r>
     </w:p>
-    <w:bookmarkEnd w:id="80"/>
-    <w:bookmarkStart w:id="81" w:name="mira-saltwind"/>
+    <w:bookmarkEnd w:id="81"/>
+    <w:bookmarkStart w:id="82" w:name="mira-saltwind"/>
     <w:p>
       <w:pPr>
         <w:pStyle w:val="Heading2"/>
@@ -16281,8 +16605,8 @@
         <w:t xml:space="preserve">Kara of the Long Winter owes her a life, and Mira means to collect.</w:t>
       </w:r>
     </w:p>
-    <w:bookmarkEnd w:id="81"/>
-    <w:bookmarkStart w:id="82" w:name="cinder"/>
+    <w:bookmarkEnd w:id="82"/>
+    <w:bookmarkStart w:id="83" w:name="cinder"/>
     <w:p>
       <w:pPr>
         <w:pStyle w:val="Heading2"/>
@@ -16467,8 +16791,8 @@
         <w:t xml:space="preserve">Vessa Thorn was their last contract. They let her live and have been running ever since.</w:t>
       </w:r>
     </w:p>
-    <w:bookmarkEnd w:id="82"/>
-    <w:bookmarkStart w:id="83" w:name="oren-sael"/>
+    <w:bookmarkEnd w:id="83"/>
+    <w:bookmarkStart w:id="84" w:name="oren-sael"/>
     <w:p>
       <w:pPr>
         <w:pStyle w:val="Heading2"/>
@@ -16653,9 +16977,9 @@
         <w:t xml:space="preserve">Ithrann sleeps at his shrine. Oren hopes the serpent-kin’s books hold a cure for a dying god.</w:t>
       </w:r>
     </w:p>
-    <w:bookmarkEnd w:id="83"/>
     <w:bookmarkEnd w:id="84"/>
-    <w:bookmarkStart w:id="85" w:name="advantages"/>
+    <w:bookmarkEnd w:id="85"/>
+    <w:bookmarkStart w:id="86" w:name="advantages"/>
     <w:p>
       <w:pPr>
         <w:pStyle w:val="Heading1"/>
@@ -17503,8 +17827,8 @@
         <w:t xml:space="preserve">too, or the gift has nothing to work with.</w:t>
       </w:r>
     </w:p>
-    <w:bookmarkEnd w:id="85"/>
-    <w:bookmarkStart w:id="100" w:name="ancestries"/>
+    <w:bookmarkEnd w:id="86"/>
+    <w:bookmarkStart w:id="101" w:name="ancestries"/>
     <w:p>
       <w:pPr>
         <w:pStyle w:val="Heading1"/>
@@ -18431,7 +18755,7 @@
         </w:tc>
       </w:tr>
     </w:tbl>
-    <w:bookmarkStart w:id="86" w:name="shared-rules"/>
+    <w:bookmarkStart w:id="87" w:name="shared-rules"/>
     <w:p>
       <w:pPr>
         <w:pStyle w:val="Heading2"/>
@@ -18633,8 +18957,8 @@
         </w:tc>
       </w:tr>
     </w:tbl>
-    <w:bookmarkEnd w:id="86"/>
-    <w:bookmarkStart w:id="87" w:name="crownlander"/>
+    <w:bookmarkEnd w:id="87"/>
+    <w:bookmarkStart w:id="88" w:name="crownlander"/>
     <w:p>
       <w:pPr>
         <w:pStyle w:val="Heading2"/>
@@ -18947,8 +19271,8 @@
         </w:tc>
       </w:tr>
     </w:tbl>
-    <w:bookmarkEnd w:id="87"/>
-    <w:bookmarkStart w:id="88" w:name="islander"/>
+    <w:bookmarkEnd w:id="88"/>
+    <w:bookmarkStart w:id="89" w:name="islander"/>
     <w:p>
       <w:pPr>
         <w:pStyle w:val="Heading2"/>
@@ -19261,8 +19585,8 @@
         </w:tc>
       </w:tr>
     </w:tbl>
-    <w:bookmarkEnd w:id="88"/>
-    <w:bookmarkStart w:id="89" w:name="northlander"/>
+    <w:bookmarkEnd w:id="89"/>
+    <w:bookmarkStart w:id="90" w:name="northlander"/>
     <w:p>
       <w:pPr>
         <w:pStyle w:val="Heading2"/>
@@ -19575,8 +19899,8 @@
         </w:tc>
       </w:tr>
     </w:tbl>
-    <w:bookmarkEnd w:id="89"/>
-    <w:bookmarkStart w:id="90" w:name="sand-born"/>
+    <w:bookmarkEnd w:id="90"/>
+    <w:bookmarkStart w:id="91" w:name="sand-born"/>
     <w:p>
       <w:pPr>
         <w:pStyle w:val="Heading2"/>
@@ -19889,8 +20213,8 @@
         </w:tc>
       </w:tr>
     </w:tbl>
-    <w:bookmarkEnd w:id="90"/>
-    <w:bookmarkStart w:id="91" w:name="ashborn"/>
+    <w:bookmarkEnd w:id="91"/>
+    <w:bookmarkStart w:id="92" w:name="ashborn"/>
     <w:p>
       <w:pPr>
         <w:pStyle w:val="Heading2"/>
@@ -20227,8 +20551,8 @@
         </w:tc>
       </w:tr>
     </w:tbl>
-    <w:bookmarkEnd w:id="91"/>
-    <w:bookmarkStart w:id="92" w:name="deepkin"/>
+    <w:bookmarkEnd w:id="92"/>
+    <w:bookmarkStart w:id="93" w:name="deepkin"/>
     <w:p>
       <w:pPr>
         <w:pStyle w:val="Heading2"/>
@@ -20577,8 +20901,8 @@
         </w:tc>
       </w:tr>
     </w:tbl>
-    <w:bookmarkEnd w:id="92"/>
-    <w:bookmarkStart w:id="93" w:name="witch-blooded"/>
+    <w:bookmarkEnd w:id="93"/>
+    <w:bookmarkStart w:id="94" w:name="witch-blooded"/>
     <w:p>
       <w:pPr>
         <w:pStyle w:val="Heading2"/>
@@ -20945,8 +21269,8 @@
         </w:tc>
       </w:tr>
     </w:tbl>
-    <w:bookmarkEnd w:id="93"/>
-    <w:bookmarkStart w:id="94" w:name="demon-marked"/>
+    <w:bookmarkEnd w:id="94"/>
+    <w:bookmarkStart w:id="95" w:name="demon-marked"/>
     <w:p>
       <w:pPr>
         <w:pStyle w:val="Heading2"/>
@@ -21295,8 +21619,8 @@
         </w:tc>
       </w:tr>
     </w:tbl>
-    <w:bookmarkEnd w:id="94"/>
-    <w:bookmarkStart w:id="95" w:name="giant-blooded"/>
+    <w:bookmarkEnd w:id="95"/>
+    <w:bookmarkStart w:id="96" w:name="giant-blooded"/>
     <w:p>
       <w:pPr>
         <w:pStyle w:val="Heading2"/>
@@ -21633,8 +21957,8 @@
         </w:tc>
       </w:tr>
     </w:tbl>
-    <w:bookmarkEnd w:id="95"/>
-    <w:bookmarkStart w:id="96" w:name="serpent-kin"/>
+    <w:bookmarkEnd w:id="96"/>
+    <w:bookmarkStart w:id="97" w:name="serpent-kin"/>
     <w:p>
       <w:pPr>
         <w:pStyle w:val="Heading2"/>
@@ -21983,8 +22307,8 @@
         </w:tc>
       </w:tr>
     </w:tbl>
-    <w:bookmarkEnd w:id="96"/>
-    <w:bookmarkStart w:id="97" w:name="skinchanger"/>
+    <w:bookmarkEnd w:id="97"/>
+    <w:bookmarkStart w:id="98" w:name="skinchanger"/>
     <w:p>
       <w:pPr>
         <w:pStyle w:val="Heading2"/>
@@ -22367,8 +22691,8 @@
         </w:tc>
       </w:tr>
     </w:tbl>
-    <w:bookmarkEnd w:id="97"/>
-    <w:bookmarkStart w:id="98" w:name="godblooded"/>
+    <w:bookmarkEnd w:id="98"/>
+    <w:bookmarkStart w:id="99" w:name="godblooded"/>
     <w:p>
       <w:pPr>
         <w:pStyle w:val="Heading2"/>
@@ -22717,8 +23041,8 @@
         </w:tc>
       </w:tr>
     </w:tbl>
-    <w:bookmarkEnd w:id="98"/>
-    <w:bookmarkStart w:id="99" w:name="undying"/>
+    <w:bookmarkEnd w:id="99"/>
+    <w:bookmarkStart w:id="100" w:name="undying"/>
     <w:p>
       <w:pPr>
         <w:pStyle w:val="Heading2"/>
@@ -23079,9 +23403,9 @@
         </w:tc>
       </w:tr>
     </w:tbl>
-    <w:bookmarkEnd w:id="99"/>
     <w:bookmarkEnd w:id="100"/>
-    <w:bookmarkStart w:id="111" w:name="making-your-own"/>
+    <w:bookmarkEnd w:id="101"/>
+    <w:bookmarkStart w:id="112" w:name="making-your-own"/>
     <w:p>
       <w:pPr>
         <w:pStyle w:val="Heading1"/>
@@ -23114,7 +23438,7 @@
         <w:t xml:space="preserve">option at the end of each list, and its checklist holds a custom choice to the same rules as everything else.</w:t>
       </w:r>
     </w:p>
-    <w:bookmarkStart w:id="101" w:name="a-custom-calling"/>
+    <w:bookmarkStart w:id="102" w:name="a-custom-calling"/>
     <w:p>
       <w:pPr>
         <w:pStyle w:val="Heading2"/>
@@ -23290,8 +23614,8 @@
         <w:t xml:space="preserve">.</w:t>
       </w:r>
     </w:p>
-    <w:bookmarkEnd w:id="101"/>
-    <w:bookmarkStart w:id="110" w:name="a-custom-ancestry"/>
+    <w:bookmarkEnd w:id="102"/>
+    <w:bookmarkStart w:id="111" w:name="a-custom-ancestry"/>
     <w:p>
       <w:pPr>
         <w:pStyle w:val="Heading2"/>
@@ -23308,7 +23632,7 @@
         <w:t xml:space="preserve">Build it with the GM, one step at a time.</w:t>
       </w:r>
     </w:p>
-    <w:bookmarkStart w:id="102" w:name="the-concept"/>
+    <w:bookmarkStart w:id="103" w:name="the-concept"/>
     <w:p>
       <w:pPr>
         <w:pStyle w:val="Heading3"/>
@@ -23325,8 +23649,8 @@
         <w:t xml:space="preserve">Two or three sentences: where they come from, what sets them apart, and how others see them. It should be something the ancestries in this book don’t already cover.</w:t>
       </w:r>
     </w:p>
-    <w:bookmarkEnd w:id="102"/>
-    <w:bookmarkStart w:id="103" w:name="the-tier"/>
+    <w:bookmarkEnd w:id="103"/>
+    <w:bookmarkStart w:id="104" w:name="the-tier"/>
     <w:p>
       <w:pPr>
         <w:pStyle w:val="Heading3"/>
@@ -23623,8 +23947,8 @@
         <w:t xml:space="preserve">When in doubt, choose the higher tier.</w:t>
       </w:r>
     </w:p>
-    <w:bookmarkEnd w:id="103"/>
-    <w:bookmarkStart w:id="104" w:name="attribute-adjustments"/>
+    <w:bookmarkEnd w:id="104"/>
+    <w:bookmarkStart w:id="105" w:name="attribute-adjustments"/>
     <w:p>
       <w:pPr>
         <w:pStyle w:val="Heading3"/>
@@ -23670,8 +23994,8 @@
         <w:t xml:space="preserve">: a +2 needs a −2 or two −1s. The adjustments move the attribute’s base (+1 starts it at 11) and raise its starting maximum (13 plus the bonus). Most ancestries change two to four attributes.</w:t>
       </w:r>
     </w:p>
-    <w:bookmarkEnd w:id="104"/>
-    <w:bookmarkStart w:id="105" w:name="core-rules-tier-1-and-up"/>
+    <w:bookmarkEnd w:id="105"/>
+    <w:bookmarkStart w:id="106" w:name="core-rules-tier-1-and-up"/>
     <w:p>
       <w:pPr>
         <w:pStyle w:val="Heading3"/>
@@ -23688,8 +24012,8 @@
         <w:t xml:space="preserve">One to three short rules that always apply: what they can do (see in the dark, resist cold, a free Trained skill) and what it costs (a weakness, a people’s distrust, a hazard they can’t abide). A strength with no drawback is worth more than it looks, so price it a tier higher.</w:t>
       </w:r>
     </w:p>
-    <w:bookmarkEnd w:id="105"/>
-    <w:bookmarkStart w:id="106" w:name="ancestry-advantages"/>
+    <w:bookmarkEnd w:id="106"/>
+    <w:bookmarkStart w:id="107" w:name="ancestry-advantages"/>
     <w:p>
       <w:pPr>
         <w:pStyle w:val="Heading3"/>
@@ -23744,8 +24068,8 @@
         <w:t xml:space="preserve">: a problem the trait causes, with a clear trigger and a real consequence, which earns a Fortune point when it bites, like any complication. A character takes one advantage, general or ancestry, so make them distinct choices.</w:t>
       </w:r>
     </w:p>
-    <w:bookmarkEnd w:id="106"/>
-    <w:bookmarkStart w:id="107" w:name="an-alternate-form-optional-tier-2-or-3"/>
+    <w:bookmarkEnd w:id="107"/>
+    <w:bookmarkStart w:id="108" w:name="an-alternate-form-optional-tier-2-or-3"/>
     <w:p>
       <w:pPr>
         <w:pStyle w:val="Heading3"/>
@@ -23778,8 +24102,8 @@
         <w:t xml:space="preserve">apply.</w:t>
       </w:r>
     </w:p>
-    <w:bookmarkEnd w:id="107"/>
-    <w:bookmarkStart w:id="108" w:name="in-the-creator"/>
+    <w:bookmarkEnd w:id="108"/>
+    <w:bookmarkStart w:id="109" w:name="in-the-creator"/>
     <w:p>
       <w:pPr>
         <w:pStyle w:val="Heading3"/>
@@ -23884,8 +24208,8 @@
         <w:t xml:space="preserve">and enter the advantage and its companion complication.</w:t>
       </w:r>
     </w:p>
-    <w:bookmarkEnd w:id="108"/>
-    <w:bookmarkStart w:id="109" w:name="example"/>
+    <w:bookmarkEnd w:id="109"/>
+    <w:bookmarkStart w:id="110" w:name="example"/>
     <w:p>
       <w:pPr>
         <w:pStyle w:val="Heading3"/>
@@ -23990,10 +24314,10 @@
         <w:t xml:space="preserve">: villagers see the birds and bar their doors; accept the suspicion.</w:t>
       </w:r>
     </w:p>
-    <w:bookmarkEnd w:id="109"/>
     <w:bookmarkEnd w:id="110"/>
     <w:bookmarkEnd w:id="111"/>
-    <w:bookmarkStart w:id="112" w:name="complications"/>
+    <w:bookmarkEnd w:id="112"/>
+    <w:bookmarkStart w:id="113" w:name="complications"/>
     <w:p>
       <w:pPr>
         <w:pStyle w:val="Heading1"/>
@@ -24698,8 +25022,8 @@
         </w:tc>
       </w:tr>
     </w:tbl>
-    <w:bookmarkEnd w:id="112"/>
-    <w:bookmarkStart w:id="114" w:name="quick-reference"/>
+    <w:bookmarkEnd w:id="113"/>
+    <w:bookmarkStart w:id="115" w:name="quick-reference"/>
     <w:p>
       <w:pPr>
         <w:pStyle w:val="Heading1"/>
@@ -24890,7 +25214,7 @@
       <w:r>
         <w:t xml:space="preserve"> </w:t>
       </w:r>
-      <w:hyperlink r:id="rId113">
+      <w:hyperlink r:id="rId114">
         <w:r>
           <w:rPr>
             <w:rStyle w:val="Hyperlink"/>
@@ -24902,7 +25226,7 @@
         <w:t xml:space="preserve">. You may share, adapt, and use it for any purpose, including commercially, as long as you give appropriate credit to the author.</w:t>
       </w:r>
     </w:p>
-    <w:bookmarkEnd w:id="114"/>
+    <w:bookmarkEnd w:id="115"/>
     <w:sectPr/>
   </w:body>
 </w:document>

</xml_diff>

<commit_message>
The Shattered Crown: enchantments, rituals worked into objects
An enchantment is a ritual worked into an item that lasts (a scene, a day
for +1 segment, a moon for +2, or until broken: Major only, a rare
trapping and another box of Corruption). Weight sets what the item gains:
Minor +1 to one use or a small wonder; Significant +2, +1 box on hits, or
turning one hit a fight; Major a bound cantrip at its First Seal or a great
property. One to an item; talismans and enchantments share one limit
(Trained 2, Specialty 3, Expert 4); Sight sees them, Shatter's Third Seal
or a rite of unbinding breaks them.

Co-Authored-By: Claude Opus 5.5 <noreply@anthropic.com>
Claude-Session: https://claude.ai/code/session_015SADCFzhKijkC2foUmXrpC
</commit_message>
<xml_diff>
--- a/legend-dynamics/fantasy/The_Shattered_Crown_Players_Guide.docx
+++ b/legend-dynamics/fantasy/The_Shattered_Crown_Players_Guide.docx
@@ -10598,6 +10598,40 @@
                 <w:sz w:val="19"/>
               </w:rPr>
               <w:t xml:space="preserve">A ritual bound into a bone, a ring or a knotted cord, released by breaking it.</w:t>
+            </w:r>
+          </w:p>
+        </w:tc>
+      </w:tr>
+      <w:tr>
+        <w:tc>
+          <w:tcPr/>
+          <w:p>
+            <w:pPr>
+              <w:pStyle w:val="Compact"/>
+              <w:jc w:val="left"/>
+            </w:pPr>
+            <w:r>
+              <w:rPr>
+                <w:bCs/>
+                <w:b/>
+                <w:sz w:val="19"/>
+              </w:rPr>
+              <w:t xml:space="preserve">Enchantments</w:t>
+            </w:r>
+          </w:p>
+        </w:tc>
+        <w:tc>
+          <w:tcPr/>
+          <w:p>
+            <w:pPr>
+              <w:pStyle w:val="Compact"/>
+              <w:jc w:val="left"/>
+            </w:pPr>
+            <w:r>
+              <w:rPr>
+                <w:sz w:val="19"/>
+              </w:rPr>
+              <w:t xml:space="preserve">A ritual worked into an object, lasting a scene, a day (+1 segment), a moon (+2) or until broken (Major only). Talismans and enchantments share one limit: Trained 2, Specialty 3, Expert 4.</w:t>
             </w:r>
           </w:p>
         </w:tc>
@@ -13672,7 +13706,7 @@
     </w:p>
     <w:bookmarkEnd w:id="74"/>
     <w:bookmarkEnd w:id="75"/>
-    <w:bookmarkStart w:id="79" w:name="sorcery"/>
+    <w:bookmarkStart w:id="80" w:name="sorcery"/>
     <w:p>
       <w:pPr>
         <w:pStyle w:val="Heading1"/>
@@ -14786,7 +14820,7 @@
       </w:r>
     </w:p>
     <w:bookmarkEnd w:id="76"/>
-    <w:bookmarkStart w:id="77" w:name="rituals-and-talismans"/>
+    <w:bookmarkStart w:id="78" w:name="rituals-and-talismans"/>
     <w:p>
       <w:pPr>
         <w:pStyle w:val="Heading2"/>
@@ -15180,14 +15214,13 @@
         <w:t xml:space="preserve">A finished ritual can be bound into a bone, a ring or a knotted cord and released by breaking it: Trained 2, Specialty 3, Expert 4 ready at once.</w:t>
       </w:r>
     </w:p>
-    <w:bookmarkEnd w:id="77"/>
-    <w:bookmarkStart w:id="78" w:name="corruption"/>
-    <w:p>
-      <w:pPr>
-        <w:pStyle w:val="Heading2"/>
-      </w:pPr>
-      <w:r>
-        <w:t xml:space="preserve">Corruption</w:t>
+    <w:bookmarkStart w:id="77" w:name="enchantments"/>
+    <w:p>
+      <w:pPr>
+        <w:pStyle w:val="Heading3"/>
+      </w:pPr>
+      <w:r>
+        <w:t xml:space="preserve">Enchantments</w:t>
       </w:r>
     </w:p>
     <w:p>
@@ -15195,7 +15228,7 @@
         <w:pStyle w:val="FirstParagraph"/>
       </w:pPr>
       <w:r>
-        <w:t xml:space="preserve">Power has a price. Every character keeps a</w:t>
+        <w:t xml:space="preserve">An</w:t>
       </w:r>
       <w:r>
         <w:t xml:space="preserve"> </w:t>
@@ -15205,15 +15238,253 @@
           <w:bCs/>
           <w:b/>
         </w:rPr>
-        <w:t xml:space="preserve">Corruption</w:t>
-      </w:r>
-      <w:r>
-        <w:t xml:space="preserve"> </w:t>
-      </w:r>
-      <w:r>
-        <w:t xml:space="preserve">track of four boxes on their sheet:</w:t>
-      </w:r>
-    </w:p>
+        <w:t xml:space="preserve">enchantment</w:t>
+      </w:r>
+      <w:r>
+        <w:t xml:space="preserve"> </w:t>
+      </w:r>
+      <w:r>
+        <w:t xml:space="preserve">is a ritual worked into an object: a blade that bites deeper, a cloak that hides its wearer, a ring that turns a blow. Where a talisman is spent when it breaks, an enchantment</w:t>
+      </w:r>
+      <w:r>
+        <w:t xml:space="preserve"> </w:t>
+      </w:r>
+      <w:r>
+        <w:rPr>
+          <w:bCs/>
+          <w:b/>
+        </w:rPr>
+        <w:t xml:space="preserve">lasts</w:t>
+      </w:r>
+      <w:r>
+        <w:t xml:space="preserve">, and anyone can carry the item. Work it like any ritual, with the item in your hands: describe the empowerment, the GM sets its weight, and you fill the clock with Sorcery rolls.</w:t>
+      </w:r>
+    </w:p>
+    <w:tbl>
+      <w:tblPr>
+        <w:tblStyle w:val="Table"/>
+        <w:tblW w:type="pct" w:w="5000"/>
+        <w:tblLook w:firstRow="1" w:lastRow="0" w:firstColumn="0" w:lastColumn="0" w:noHBand="0" w:noVBand="0" w:val="0020"/>
+        <w:jc w:val="start"/>
+        <w:tblBorders>
+          <w:top w:val="single" w:sz="4" w:color="B8C2D3"/>
+          <w:left w:val="single" w:sz="4" w:color="B8C2D3"/>
+          <w:bottom w:val="single" w:sz="4" w:color="B8C2D3"/>
+          <w:right w:val="single" w:sz="4" w:color="B8C2D3"/>
+          <w:insideH w:val="single" w:sz="4" w:color="B8C2D3"/>
+          <w:insideV w:val="single" w:sz="4" w:color="B8C2D3"/>
+        </w:tblBorders>
+      </w:tblPr>
+      <w:tblGrid>
+        <w:gridCol w:w="2640"/>
+        <w:gridCol w:w="2640"/>
+        <w:gridCol w:w="2640"/>
+      </w:tblGrid>
+      <w:tr>
+        <w:trPr>
+          <w:tblHeader w:val="true"/>
+        </w:trPr>
+        <w:tc>
+          <w:tcPr>
+            <w:shd w:val="clear" w:fill="F2E7D6"/>
+          </w:tcPr>
+          <w:p>
+            <w:pPr>
+              <w:pStyle w:val="Compact"/>
+              <w:jc w:val="left"/>
+            </w:pPr>
+            <w:r>
+              <w:rPr>
+                <w:b/>
+                <w:sz w:val="19"/>
+              </w:rPr>
+              <w:t xml:space="preserve">Weight</w:t>
+            </w:r>
+          </w:p>
+        </w:tc>
+        <w:tc>
+          <w:tcPr>
+            <w:shd w:val="clear" w:fill="F2E7D6"/>
+          </w:tcPr>
+          <w:p>
+            <w:pPr>
+              <w:pStyle w:val="Compact"/>
+              <w:jc w:val="left"/>
+            </w:pPr>
+            <w:r>
+              <w:rPr>
+                <w:b/>
+                <w:sz w:val="19"/>
+              </w:rPr>
+              <w:t xml:space="preserve">What the item gains</w:t>
+            </w:r>
+          </w:p>
+        </w:tc>
+        <w:tc>
+          <w:tcPr>
+            <w:shd w:val="clear" w:fill="F2E7D6"/>
+          </w:tcPr>
+          <w:p>
+            <w:pPr>
+              <w:pStyle w:val="Compact"/>
+              <w:jc w:val="left"/>
+            </w:pPr>
+            <w:r>
+              <w:rPr>
+                <w:b/>
+                <w:sz w:val="19"/>
+              </w:rPr>
+              <w:t xml:space="preserve">For example</w:t>
+            </w:r>
+          </w:p>
+        </w:tc>
+      </w:tr>
+      <w:tr>
+        <w:tc>
+          <w:tcPr/>
+          <w:p>
+            <w:pPr>
+              <w:pStyle w:val="Compact"/>
+              <w:jc w:val="left"/>
+            </w:pPr>
+            <w:r>
+              <w:rPr>
+                <w:b/>
+                <w:sz w:val="19"/>
+              </w:rPr>
+              <w:t xml:space="preserve">Minor (2)</w:t>
+            </w:r>
+          </w:p>
+        </w:tc>
+        <w:tc>
+          <w:tcPr/>
+          <w:p>
+            <w:pPr>
+              <w:pStyle w:val="Compact"/>
+              <w:jc w:val="left"/>
+            </w:pPr>
+            <w:r>
+              <w:rPr>
+                <w:sz w:val="19"/>
+              </w:rPr>
+              <w:t xml:space="preserve">+1 to one use of the item, or one small wonder</w:t>
+            </w:r>
+          </w:p>
+        </w:tc>
+        <w:tc>
+          <w:tcPr/>
+          <w:p>
+            <w:pPr>
+              <w:pStyle w:val="Compact"/>
+              <w:jc w:val="left"/>
+            </w:pPr>
+            <w:r>
+              <w:rPr>
+                <w:sz w:val="19"/>
+              </w:rPr>
+              <w:t xml:space="preserve">A sword +1 to hit; boots +1 to Athletics; a lantern that shows the hidden</w:t>
+            </w:r>
+          </w:p>
+        </w:tc>
+      </w:tr>
+      <w:tr>
+        <w:tc>
+          <w:tcPr/>
+          <w:p>
+            <w:pPr>
+              <w:pStyle w:val="Compact"/>
+              <w:jc w:val="left"/>
+            </w:pPr>
+            <w:r>
+              <w:rPr>
+                <w:b/>
+                <w:sz w:val="19"/>
+              </w:rPr>
+              <w:t xml:space="preserve">Significant (4)</w:t>
+            </w:r>
+          </w:p>
+        </w:tc>
+        <w:tc>
+          <w:tcPr/>
+          <w:p>
+            <w:pPr>
+              <w:pStyle w:val="Compact"/>
+              <w:jc w:val="left"/>
+            </w:pPr>
+            <w:r>
+              <w:rPr>
+                <w:sz w:val="19"/>
+              </w:rPr>
+              <w:t xml:space="preserve">+2 to one use, or its hits mark one more box, or it turns one hit a fight (a hit of 2 or more boxes marks one fewer)</w:t>
+            </w:r>
+          </w:p>
+        </w:tc>
+        <w:tc>
+          <w:tcPr/>
+          <w:p>
+            <w:pPr>
+              <w:pStyle w:val="Compact"/>
+              <w:jc w:val="left"/>
+            </w:pPr>
+            <w:r>
+              <w:rPr>
+                <w:sz w:val="19"/>
+              </w:rPr>
+              <w:t xml:space="preserve">A war-axe that bites deep; a cloak +2 to Stealth; a coat that turns a blade</w:t>
+            </w:r>
+          </w:p>
+        </w:tc>
+      </w:tr>
+      <w:tr>
+        <w:tc>
+          <w:tcPr/>
+          <w:p>
+            <w:pPr>
+              <w:pStyle w:val="Compact"/>
+              <w:jc w:val="left"/>
+            </w:pPr>
+            <w:r>
+              <w:rPr>
+                <w:b/>
+                <w:sz w:val="19"/>
+              </w:rPr>
+              <w:t xml:space="preserve">Major (6)</w:t>
+            </w:r>
+          </w:p>
+        </w:tc>
+        <w:tc>
+          <w:tcPr/>
+          <w:p>
+            <w:pPr>
+              <w:pStyle w:val="Compact"/>
+              <w:jc w:val="left"/>
+            </w:pPr>
+            <w:r>
+              <w:rPr>
+                <w:sz w:val="19"/>
+              </w:rPr>
+              <w:t xml:space="preserve">A cantrip bound into it, at its First Seal, cast once a scene by whoever holds it (with their Sorcery, or at 10 without it), or one great property</w:t>
+            </w:r>
+          </w:p>
+        </w:tc>
+        <w:tc>
+          <w:tcPr/>
+          <w:p>
+            <w:pPr>
+              <w:pStyle w:val="Compact"/>
+              <w:jc w:val="left"/>
+            </w:pPr>
+            <w:r>
+              <w:rPr>
+                <w:sz w:val="19"/>
+              </w:rPr>
+              <w:t xml:space="preserve">A ring of Ward; a staff of Witchfire; a blade that wounds what nothing else can</w:t>
+            </w:r>
+          </w:p>
+        </w:tc>
+      </w:tr>
+    </w:tbl>
+    <w:p/>
     <w:tbl>
       <w:tblPr>
         <w:tblStyle w:val="Table"/>
@@ -15251,7 +15522,7 @@
                 <w:b/>
                 <w:sz w:val="19"/>
               </w:rPr>
-              <w:t xml:space="preserve">Boxes</w:t>
+              <w:t xml:space="preserve">How long it lasts</w:t>
             </w:r>
           </w:p>
         </w:tc>
@@ -15269,356 +15540,158 @@
                 <w:b/>
                 <w:sz w:val="19"/>
               </w:rPr>
-              <w:t xml:space="preserve">Effect</w:t>
-            </w:r>
-          </w:p>
-        </w:tc>
-      </w:tr>
-      <w:tr>
-        <w:tc>
-          <w:tcPr/>
-          <w:p>
-            <w:pPr>
-              <w:pStyle w:val="Compact"/>
-              <w:jc w:val="left"/>
-            </w:pPr>
-            <w:r>
-              <w:rPr>
-                <w:b/>
-                <w:sz w:val="19"/>
-              </w:rPr>
-              <w:t xml:space="preserve">0</w:t>
-            </w:r>
-          </w:p>
-        </w:tc>
-        <w:tc>
-          <w:tcPr/>
-          <w:p>
-            <w:pPr>
-              <w:pStyle w:val="Compact"/>
-              <w:jc w:val="left"/>
-            </w:pPr>
-            <w:r>
-              <w:rPr>
-                <w:sz w:val="19"/>
-              </w:rPr>
-              <w:t xml:space="preserve">Untouched</w:t>
-            </w:r>
-          </w:p>
-        </w:tc>
-      </w:tr>
-      <w:tr>
-        <w:tc>
-          <w:tcPr/>
-          <w:p>
-            <w:pPr>
-              <w:pStyle w:val="Compact"/>
-              <w:jc w:val="left"/>
-            </w:pPr>
-            <w:r>
-              <w:rPr>
-                <w:b/>
-                <w:sz w:val="19"/>
-              </w:rPr>
-              <w:t xml:space="preserve">1</w:t>
-            </w:r>
-          </w:p>
-        </w:tc>
-        <w:tc>
-          <w:tcPr/>
-          <w:p>
-            <w:pPr>
-              <w:pStyle w:val="Compact"/>
-              <w:jc w:val="left"/>
-            </w:pPr>
+              <w:t xml:space="preserve">Clock</w:t>
+            </w:r>
+          </w:p>
+        </w:tc>
+      </w:tr>
+      <w:tr>
+        <w:tc>
+          <w:tcPr/>
+          <w:p>
+            <w:pPr>
+              <w:pStyle w:val="Compact"/>
+              <w:jc w:val="left"/>
+            </w:pPr>
+            <w:r>
+              <w:rPr>
+                <w:b/>
+                <w:sz w:val="19"/>
+              </w:rPr>
+              <w:t xml:space="preserve">A scene</w:t>
+            </w:r>
+          </w:p>
+        </w:tc>
+        <w:tc>
+          <w:tcPr/>
+          <w:p>
+            <w:pPr>
+              <w:pStyle w:val="Compact"/>
+              <w:jc w:val="left"/>
+            </w:pPr>
+            <w:r>
+              <w:rPr>
+                <w:sz w:val="19"/>
+              </w:rPr>
+              <w:t xml:space="preserve">As its weight</w:t>
+            </w:r>
+          </w:p>
+        </w:tc>
+      </w:tr>
+      <w:tr>
+        <w:tc>
+          <w:tcPr/>
+          <w:p>
+            <w:pPr>
+              <w:pStyle w:val="Compact"/>
+              <w:jc w:val="left"/>
+            </w:pPr>
+            <w:r>
+              <w:rPr>
+                <w:b/>
+                <w:sz w:val="19"/>
+              </w:rPr>
+              <w:t xml:space="preserve">A day</w:t>
+            </w:r>
+          </w:p>
+        </w:tc>
+        <w:tc>
+          <w:tcPr/>
+          <w:p>
+            <w:pPr>
+              <w:pStyle w:val="Compact"/>
+              <w:jc w:val="left"/>
+            </w:pPr>
+            <w:r>
+              <w:rPr>
+                <w:sz w:val="19"/>
+              </w:rPr>
+              <w:t xml:space="preserve">+1 segment</w:t>
+            </w:r>
+          </w:p>
+        </w:tc>
+      </w:tr>
+      <w:tr>
+        <w:tc>
+          <w:tcPr/>
+          <w:p>
+            <w:pPr>
+              <w:pStyle w:val="Compact"/>
+              <w:jc w:val="left"/>
+            </w:pPr>
+            <w:r>
+              <w:rPr>
+                <w:b/>
+                <w:sz w:val="19"/>
+              </w:rPr>
+              <w:t xml:space="preserve">A moon</w:t>
+            </w:r>
+          </w:p>
+        </w:tc>
+        <w:tc>
+          <w:tcPr/>
+          <w:p>
+            <w:pPr>
+              <w:pStyle w:val="Compact"/>
+              <w:jc w:val="left"/>
+            </w:pPr>
+            <w:r>
+              <w:rPr>
+                <w:sz w:val="19"/>
+              </w:rPr>
+              <w:t xml:space="preserve">+2 segments</w:t>
+            </w:r>
+          </w:p>
+        </w:tc>
+      </w:tr>
+      <w:tr>
+        <w:tc>
+          <w:tcPr/>
+          <w:p>
+            <w:pPr>
+              <w:pStyle w:val="Compact"/>
+              <w:jc w:val="left"/>
+            </w:pPr>
+            <w:r>
+              <w:rPr>
+                <w:b/>
+                <w:sz w:val="19"/>
+              </w:rPr>
+              <w:t xml:space="preserve">Until broken</w:t>
+            </w:r>
+          </w:p>
+        </w:tc>
+        <w:tc>
+          <w:tcPr/>
+          <w:p>
+            <w:pPr>
+              <w:pStyle w:val="Compact"/>
+              <w:jc w:val="left"/>
+            </w:pPr>
+            <w:r>
+              <w:rPr>
+                <w:sz w:val="19"/>
+              </w:rPr>
+              <w:t xml:space="preserve">Major only: it needs a rare trapping (a true name, a Crown shard’s light, the blood of a king) and marks</w:t>
+            </w:r>
+            <w:r>
+              <w:rPr>
+                <w:sz w:val="19"/>
+              </w:rPr>
+              <w:t xml:space="preserve"> </w:t>
+            </w:r>
             <w:r>
               <w:rPr>
                 <w:bCs/>
                 <w:b/>
                 <w:sz w:val="19"/>
               </w:rPr>
-              <w:t xml:space="preserve">Marked:</w:t>
-            </w:r>
-            <w:r>
-              <w:rPr>
-                <w:sz w:val="19"/>
-              </w:rPr>
-              <w:t xml:space="preserve"> </w:t>
-            </w:r>
-            <w:r>
-              <w:rPr>
-                <w:sz w:val="19"/>
-              </w:rPr>
-              <w:t xml:space="preserve">a visible sign of sorcery (black veins, cold eyes, a shadow that lags behind)</w:t>
-            </w:r>
-          </w:p>
-        </w:tc>
-      </w:tr>
-      <w:tr>
-        <w:tc>
-          <w:tcPr/>
-          <w:p>
-            <w:pPr>
-              <w:pStyle w:val="Compact"/>
-              <w:jc w:val="left"/>
-            </w:pPr>
-            <w:r>
-              <w:rPr>
-                <w:b/>
-                <w:sz w:val="19"/>
-              </w:rPr>
-              <w:t xml:space="preserve">2</w:t>
-            </w:r>
-          </w:p>
-        </w:tc>
-        <w:tc>
-          <w:tcPr/>
-          <w:p>
-            <w:pPr>
-              <w:pStyle w:val="Compact"/>
-              <w:jc w:val="left"/>
-            </w:pPr>
-            <w:r>
-              <w:rPr>
-                <w:bCs/>
-                <w:b/>
-                <w:sz w:val="19"/>
-              </w:rPr>
-              <w:t xml:space="preserve">Tainted:</w:t>
-            </w:r>
-            <w:r>
-              <w:rPr>
-                <w:sz w:val="19"/>
-              </w:rPr>
-              <w:t xml:space="preserve"> </w:t>
-            </w:r>
-            <w:r>
-              <w:rPr>
-                <w:sz w:val="19"/>
-              </w:rPr>
-              <w:t xml:space="preserve">−2 to Persuasion with the pious</w:t>
-            </w:r>
-          </w:p>
-        </w:tc>
-      </w:tr>
-      <w:tr>
-        <w:tc>
-          <w:tcPr/>
-          <w:p>
-            <w:pPr>
-              <w:pStyle w:val="Compact"/>
-              <w:jc w:val="left"/>
-            </w:pPr>
-            <w:r>
-              <w:rPr>
-                <w:b/>
-                <w:sz w:val="19"/>
-              </w:rPr>
-              <w:t xml:space="preserve">3</w:t>
-            </w:r>
-          </w:p>
-        </w:tc>
-        <w:tc>
-          <w:tcPr/>
-          <w:p>
-            <w:pPr>
-              <w:pStyle w:val="Compact"/>
-              <w:jc w:val="left"/>
-            </w:pPr>
-            <w:r>
-              <w:rPr>
-                <w:bCs/>
-                <w:b/>
-                <w:sz w:val="19"/>
-              </w:rPr>
-              <w:t xml:space="preserve">Twisted:</w:t>
-            </w:r>
-            <w:r>
-              <w:rPr>
-                <w:sz w:val="19"/>
-              </w:rPr>
-              <w:t xml:space="preserve"> </w:t>
-            </w:r>
-            <w:r>
-              <w:rPr>
-                <w:sz w:val="19"/>
-              </w:rPr>
-              <w:t xml:space="preserve">the GM can trigger a madness or compulsion, as with a complication</w:t>
-            </w:r>
-          </w:p>
-        </w:tc>
-      </w:tr>
-      <w:tr>
-        <w:tc>
-          <w:tcPr/>
-          <w:p>
-            <w:pPr>
-              <w:pStyle w:val="Compact"/>
-              <w:jc w:val="left"/>
-            </w:pPr>
-            <w:r>
-              <w:rPr>
-                <w:b/>
-                <w:sz w:val="19"/>
-              </w:rPr>
-              <w:t xml:space="preserve">4</w:t>
-            </w:r>
-          </w:p>
-        </w:tc>
-        <w:tc>
-          <w:tcPr/>
-          <w:p>
-            <w:pPr>
-              <w:pStyle w:val="Compact"/>
-              <w:jc w:val="left"/>
-            </w:pPr>
-            <w:r>
-              <w:rPr>
-                <w:bCs/>
-                <w:b/>
-                <w:sz w:val="19"/>
-              </w:rPr>
-              <w:t xml:space="preserve">Lost:</w:t>
-            </w:r>
-            <w:r>
-              <w:rPr>
-                <w:sz w:val="19"/>
-              </w:rPr>
-              <w:t xml:space="preserve"> </w:t>
-            </w:r>
-            <w:r>
-              <w:rPr>
-                <w:sz w:val="19"/>
-              </w:rPr>
-              <w:t xml:space="preserve">the power claims you; only a great rite can bring you back</w:t>
+              <w:t xml:space="preserve">another box of Corruption</w:t>
             </w:r>
           </w:p>
         </w:tc>
       </w:tr>
     </w:tbl>
-    <w:p>
-      <w:pPr>
-        <w:pStyle w:val="BodyText"/>
-      </w:pPr>
-      <w:r>
-        <w:t xml:space="preserve">A</w:t>
-      </w:r>
-      <w:r>
-        <w:t xml:space="preserve"> </w:t>
-      </w:r>
-      <w:r>
-        <w:rPr>
-          <w:bCs/>
-          <w:b/>
-        </w:rPr>
-        <w:t xml:space="preserve">failed cast</w:t>
-      </w:r>
-      <w:r>
-        <w:t xml:space="preserve"> </w:t>
-      </w:r>
-      <w:r>
-        <w:t xml:space="preserve">marks 1 box; a</w:t>
-      </w:r>
-      <w:r>
-        <w:t xml:space="preserve"> </w:t>
-      </w:r>
-      <w:r>
-        <w:rPr>
-          <w:bCs/>
-          <w:b/>
-        </w:rPr>
-        <w:t xml:space="preserve">natural 18</w:t>
-      </w:r>
-      <w:r>
-        <w:t xml:space="preserve"> </w:t>
-      </w:r>
-      <w:r>
-        <w:t xml:space="preserve">marks 2; finishing a</w:t>
-      </w:r>
-      <w:r>
-        <w:t xml:space="preserve"> </w:t>
-      </w:r>
-      <w:r>
-        <w:rPr>
-          <w:bCs/>
-          <w:b/>
-        </w:rPr>
-        <w:t xml:space="preserve">Major ritual</w:t>
-      </w:r>
-      <w:r>
-        <w:t xml:space="preserve"> </w:t>
-      </w:r>
-      <w:r>
-        <w:t xml:space="preserve">marks 1, whatever the roll. Holding a</w:t>
-      </w:r>
-      <w:r>
-        <w:t xml:space="preserve"> </w:t>
-      </w:r>
-      <w:r>
-        <w:rPr>
-          <w:bCs/>
-          <w:b/>
-        </w:rPr>
-        <w:t xml:space="preserve">Crown shard</w:t>
-      </w:r>
-      <w:r>
-        <w:t xml:space="preserve"> </w:t>
-      </w:r>
-      <w:r>
-        <w:t xml:space="preserve">marks 1 each venture. A</w:t>
-      </w:r>
-      <w:r>
-        <w:t xml:space="preserve"> </w:t>
-      </w:r>
-      <w:r>
-        <w:rPr>
-          <w:bCs/>
-          <w:b/>
-        </w:rPr>
-        <w:t xml:space="preserve">cleansing rite</w:t>
-      </w:r>
-      <w:r>
-        <w:t xml:space="preserve"> </w:t>
-      </w:r>
-      <w:r>
-        <w:t xml:space="preserve">or a</w:t>
-      </w:r>
-      <w:r>
-        <w:t xml:space="preserve"> </w:t>
-      </w:r>
-      <w:r>
-        <w:rPr>
-          <w:bCs/>
-          <w:b/>
-        </w:rPr>
-        <w:t xml:space="preserve">pilgrimage</w:t>
-      </w:r>
-      <w:r>
-        <w:t xml:space="preserve"> </w:t>
-      </w:r>
-      <w:r>
-        <w:t xml:space="preserve">between ventures clears one box.</w:t>
-      </w:r>
-    </w:p>
-    <w:bookmarkEnd w:id="78"/>
-    <w:bookmarkEnd w:id="79"/>
-    <w:bookmarkStart w:id="81" w:name="the-world"/>
-    <w:p>
-      <w:pPr>
-        <w:pStyle w:val="Heading1"/>
-      </w:pPr>
-      <w:r>
-        <w:t xml:space="preserve">The world</w:t>
-      </w:r>
-    </w:p>
-    <w:p>
-      <w:pPr>
-        <w:pStyle w:val="FirstParagraph"/>
-      </w:pPr>
-      <w:r>
-        <w:t xml:space="preserve">The empire is gone, but its bones are everywhere: roads no one repairs, aqueducts that feed dead cities, sorcerer-towers that still glow at night. Its heirs quarrel over the pieces.</w:t>
-      </w:r>
-    </w:p>
     <w:p>
       <w:pPr>
         <w:numPr>
@@ -15632,42 +15705,13 @@
           <w:bCs/>
           <w:b/>
         </w:rPr>
-        <w:t xml:space="preserve">The Gilded Cities.</w:t>
-      </w:r>
-      <w:r>
-        <w:t xml:space="preserve"> </w:t>
-      </w:r>
-      <w:r>
-        <w:t xml:space="preserve">The empire’s heart, now a coast of rival city-states: silk, lotus, slave markets and assassins. Ruled by</w:t>
-      </w:r>
-      <w:r>
-        <w:t xml:space="preserve"> </w:t>
-      </w:r>
-      <w:r>
-        <w:rPr>
-          <w:bCs/>
-          <w:b/>
-        </w:rPr>
-        <w:t xml:space="preserve">merchant princes</w:t>
-      </w:r>
-      <w:r>
-        <w:t xml:space="preserve"> </w:t>
-      </w:r>
-      <w:r>
-        <w:t xml:space="preserve">and the occasional</w:t>
-      </w:r>
-      <w:r>
-        <w:t xml:space="preserve"> </w:t>
-      </w:r>
-      <w:r>
-        <w:rPr>
-          <w:bCs/>
-          <w:b/>
-        </w:rPr>
-        <w:t xml:space="preserve">sorcerer-prince</w:t>
-      </w:r>
-      <w:r>
-        <w:t xml:space="preserve">.</w:t>
+        <w:t xml:space="preserve">One enchantment to an item.</w:t>
+      </w:r>
+      <w:r>
+        <w:t xml:space="preserve"> </w:t>
+      </w:r>
+      <w:r>
+        <w:t xml:space="preserve">A second working on the same item fails, or breaks the first (the GM’s choice).</w:t>
       </w:r>
     </w:p>
     <w:p>
@@ -15683,13 +15727,26 @@
           <w:bCs/>
           <w:b/>
         </w:rPr>
-        <w:t xml:space="preserve">The Frozen North.</w:t>
-      </w:r>
-      <w:r>
-        <w:t xml:space="preserve"> </w:t>
-      </w:r>
-      <w:r>
-        <w:t xml:space="preserve">Clans, longships and giants’ graves. Northlanders raid south every summer and trade every winter.</w:t>
+        <w:t xml:space="preserve">Your limit.</w:t>
+      </w:r>
+      <w:r>
+        <w:t xml:space="preserve"> </w:t>
+      </w:r>
+      <w:r>
+        <w:t xml:space="preserve">Your ready talismans and your enchantments still holding together can’t exceed your talisman limit:</w:t>
+      </w:r>
+      <w:r>
+        <w:t xml:space="preserve"> </w:t>
+      </w:r>
+      <w:r>
+        <w:rPr>
+          <w:bCs/>
+          <w:b/>
+        </w:rPr>
+        <w:t xml:space="preserve">Trained 2, Specialty 3, Expert 4</w:t>
+      </w:r>
+      <w:r>
+        <w:t xml:space="preserve">. When an enchantment ends, its place is free again.</w:t>
       </w:r>
     </w:p>
     <w:p>
@@ -15705,29 +15762,13 @@
           <w:bCs/>
           <w:b/>
         </w:rPr>
-        <w:t xml:space="preserve">The Burning Sands.</w:t>
-      </w:r>
-      <w:r>
-        <w:t xml:space="preserve"> </w:t>
-      </w:r>
-      <w:r>
-        <w:t xml:space="preserve">Nomads, caravan cities and buried temples of the</w:t>
-      </w:r>
-      <w:r>
-        <w:t xml:space="preserve"> </w:t>
-      </w:r>
-      <w:r>
-        <w:rPr>
-          <w:bCs/>
-          <w:b/>
-        </w:rPr>
-        <w:t xml:space="preserve">serpent kings</w:t>
-      </w:r>
-      <w:r>
-        <w:t xml:space="preserve"> </w:t>
-      </w:r>
-      <w:r>
-        <w:t xml:space="preserve">who ruled before humans.</w:t>
+        <w:t xml:space="preserve">The price.</w:t>
+      </w:r>
+      <w:r>
+        <w:t xml:space="preserve"> </w:t>
+      </w:r>
+      <w:r>
+        <w:t xml:space="preserve">Finishing a Major enchantment marks a box of Corruption, as any Major ritual does.</w:t>
       </w:r>
     </w:p>
     <w:p>
@@ -15743,66 +15784,453 @@
           <w:bCs/>
           <w:b/>
         </w:rPr>
-        <w:t xml:space="preserve">The Shattered Isles.</w:t>
-      </w:r>
-      <w:r>
-        <w:t xml:space="preserve"> </w:t>
-      </w:r>
-      <w:r>
-        <w:t xml:space="preserve">Corsair havens, sea-witches and sunken ruins; the Islanders’ free captains answer to no one.</w:t>
-      </w:r>
-    </w:p>
-    <w:p>
-      <w:pPr>
-        <w:numPr>
-          <w:ilvl w:val="0"/>
-          <w:numId w:val="1015"/>
-        </w:numPr>
-        <w:pStyle w:val="Compact"/>
-      </w:pPr>
+        <w:t xml:space="preserve">Seeing and breaking.</w:t>
+      </w:r>
+      <w:r>
+        <w:t xml:space="preserve"> </w:t>
+      </w:r>
+      <w:r>
+        <w:t xml:space="preserve">Sorcerer’s Sight shows an enchantment and who made it. Shatter at its Third Seal breaks one, and so does a rite of unbinding (Significant).</w:t>
+      </w:r>
+    </w:p>
+    <w:bookmarkEnd w:id="77"/>
+    <w:bookmarkEnd w:id="78"/>
+    <w:bookmarkStart w:id="79" w:name="corruption"/>
+    <w:p>
+      <w:pPr>
+        <w:pStyle w:val="Heading2"/>
+      </w:pPr>
+      <w:r>
+        <w:t xml:space="preserve">Corruption</w:t>
+      </w:r>
+    </w:p>
+    <w:p>
+      <w:pPr>
+        <w:pStyle w:val="FirstParagraph"/>
+      </w:pPr>
+      <w:r>
+        <w:t xml:space="preserve">Power has a price. Every character keeps a</w:t>
+      </w:r>
+      <w:r>
+        <w:t xml:space="preserve"> </w:t>
+      </w:r>
       <w:r>
         <w:rPr>
           <w:bCs/>
           <w:b/>
         </w:rPr>
-        <w:t xml:space="preserve">The Deeps.</w:t>
-      </w:r>
-      <w:r>
-        <w:t xml:space="preserve"> </w:t>
-      </w:r>
-      <w:r>
-        <w:t xml:space="preserve">Deepkin cities beneath the mountains, and below them, older things that dream.</w:t>
-      </w:r>
-    </w:p>
-    <w:p>
-      <w:pPr>
-        <w:numPr>
-          <w:ilvl w:val="0"/>
-          <w:numId w:val="1015"/>
-        </w:numPr>
-        <w:pStyle w:val="Compact"/>
-      </w:pPr>
+        <w:t xml:space="preserve">Corruption</w:t>
+      </w:r>
+      <w:r>
+        <w:t xml:space="preserve"> </w:t>
+      </w:r>
+      <w:r>
+        <w:t xml:space="preserve">track of four boxes on their sheet:</w:t>
+      </w:r>
+    </w:p>
+    <w:tbl>
+      <w:tblPr>
+        <w:tblStyle w:val="Table"/>
+        <w:tblW w:type="pct" w:w="5000"/>
+        <w:tblLook w:firstRow="1" w:lastRow="0" w:firstColumn="0" w:lastColumn="0" w:noHBand="0" w:noVBand="0" w:val="0020"/>
+        <w:jc w:val="start"/>
+        <w:tblBorders>
+          <w:top w:val="single" w:sz="4" w:color="B8C2D3"/>
+          <w:left w:val="single" w:sz="4" w:color="B8C2D3"/>
+          <w:bottom w:val="single" w:sz="4" w:color="B8C2D3"/>
+          <w:right w:val="single" w:sz="4" w:color="B8C2D3"/>
+          <w:insideH w:val="single" w:sz="4" w:color="B8C2D3"/>
+          <w:insideV w:val="single" w:sz="4" w:color="B8C2D3"/>
+        </w:tblBorders>
+      </w:tblPr>
+      <w:tblGrid>
+        <w:gridCol w:w="3960"/>
+        <w:gridCol w:w="3960"/>
+      </w:tblGrid>
+      <w:tr>
+        <w:trPr>
+          <w:tblHeader w:val="true"/>
+        </w:trPr>
+        <w:tc>
+          <w:tcPr>
+            <w:shd w:val="clear" w:fill="F2E7D6"/>
+          </w:tcPr>
+          <w:p>
+            <w:pPr>
+              <w:pStyle w:val="Compact"/>
+              <w:jc w:val="left"/>
+            </w:pPr>
+            <w:r>
+              <w:rPr>
+                <w:b/>
+                <w:sz w:val="19"/>
+              </w:rPr>
+              <w:t xml:space="preserve">Boxes</w:t>
+            </w:r>
+          </w:p>
+        </w:tc>
+        <w:tc>
+          <w:tcPr>
+            <w:shd w:val="clear" w:fill="F2E7D6"/>
+          </w:tcPr>
+          <w:p>
+            <w:pPr>
+              <w:pStyle w:val="Compact"/>
+              <w:jc w:val="left"/>
+            </w:pPr>
+            <w:r>
+              <w:rPr>
+                <w:b/>
+                <w:sz w:val="19"/>
+              </w:rPr>
+              <w:t xml:space="preserve">Effect</w:t>
+            </w:r>
+          </w:p>
+        </w:tc>
+      </w:tr>
+      <w:tr>
+        <w:tc>
+          <w:tcPr/>
+          <w:p>
+            <w:pPr>
+              <w:pStyle w:val="Compact"/>
+              <w:jc w:val="left"/>
+            </w:pPr>
+            <w:r>
+              <w:rPr>
+                <w:b/>
+                <w:sz w:val="19"/>
+              </w:rPr>
+              <w:t xml:space="preserve">0</w:t>
+            </w:r>
+          </w:p>
+        </w:tc>
+        <w:tc>
+          <w:tcPr/>
+          <w:p>
+            <w:pPr>
+              <w:pStyle w:val="Compact"/>
+              <w:jc w:val="left"/>
+            </w:pPr>
+            <w:r>
+              <w:rPr>
+                <w:sz w:val="19"/>
+              </w:rPr>
+              <w:t xml:space="preserve">Untouched</w:t>
+            </w:r>
+          </w:p>
+        </w:tc>
+      </w:tr>
+      <w:tr>
+        <w:tc>
+          <w:tcPr/>
+          <w:p>
+            <w:pPr>
+              <w:pStyle w:val="Compact"/>
+              <w:jc w:val="left"/>
+            </w:pPr>
+            <w:r>
+              <w:rPr>
+                <w:b/>
+                <w:sz w:val="19"/>
+              </w:rPr>
+              <w:t xml:space="preserve">1</w:t>
+            </w:r>
+          </w:p>
+        </w:tc>
+        <w:tc>
+          <w:tcPr/>
+          <w:p>
+            <w:pPr>
+              <w:pStyle w:val="Compact"/>
+              <w:jc w:val="left"/>
+            </w:pPr>
+            <w:r>
+              <w:rPr>
+                <w:bCs/>
+                <w:b/>
+                <w:sz w:val="19"/>
+              </w:rPr>
+              <w:t xml:space="preserve">Marked:</w:t>
+            </w:r>
+            <w:r>
+              <w:rPr>
+                <w:sz w:val="19"/>
+              </w:rPr>
+              <w:t xml:space="preserve"> </w:t>
+            </w:r>
+            <w:r>
+              <w:rPr>
+                <w:sz w:val="19"/>
+              </w:rPr>
+              <w:t xml:space="preserve">a visible sign of sorcery (black veins, cold eyes, a shadow that lags behind)</w:t>
+            </w:r>
+          </w:p>
+        </w:tc>
+      </w:tr>
+      <w:tr>
+        <w:tc>
+          <w:tcPr/>
+          <w:p>
+            <w:pPr>
+              <w:pStyle w:val="Compact"/>
+              <w:jc w:val="left"/>
+            </w:pPr>
+            <w:r>
+              <w:rPr>
+                <w:b/>
+                <w:sz w:val="19"/>
+              </w:rPr>
+              <w:t xml:space="preserve">2</w:t>
+            </w:r>
+          </w:p>
+        </w:tc>
+        <w:tc>
+          <w:tcPr/>
+          <w:p>
+            <w:pPr>
+              <w:pStyle w:val="Compact"/>
+              <w:jc w:val="left"/>
+            </w:pPr>
+            <w:r>
+              <w:rPr>
+                <w:bCs/>
+                <w:b/>
+                <w:sz w:val="19"/>
+              </w:rPr>
+              <w:t xml:space="preserve">Tainted:</w:t>
+            </w:r>
+            <w:r>
+              <w:rPr>
+                <w:sz w:val="19"/>
+              </w:rPr>
+              <w:t xml:space="preserve"> </w:t>
+            </w:r>
+            <w:r>
+              <w:rPr>
+                <w:sz w:val="19"/>
+              </w:rPr>
+              <w:t xml:space="preserve">−2 to Persuasion with the pious</w:t>
+            </w:r>
+          </w:p>
+        </w:tc>
+      </w:tr>
+      <w:tr>
+        <w:tc>
+          <w:tcPr/>
+          <w:p>
+            <w:pPr>
+              <w:pStyle w:val="Compact"/>
+              <w:jc w:val="left"/>
+            </w:pPr>
+            <w:r>
+              <w:rPr>
+                <w:b/>
+                <w:sz w:val="19"/>
+              </w:rPr>
+              <w:t xml:space="preserve">3</w:t>
+            </w:r>
+          </w:p>
+        </w:tc>
+        <w:tc>
+          <w:tcPr/>
+          <w:p>
+            <w:pPr>
+              <w:pStyle w:val="Compact"/>
+              <w:jc w:val="left"/>
+            </w:pPr>
+            <w:r>
+              <w:rPr>
+                <w:bCs/>
+                <w:b/>
+                <w:sz w:val="19"/>
+              </w:rPr>
+              <w:t xml:space="preserve">Twisted:</w:t>
+            </w:r>
+            <w:r>
+              <w:rPr>
+                <w:sz w:val="19"/>
+              </w:rPr>
+              <w:t xml:space="preserve"> </w:t>
+            </w:r>
+            <w:r>
+              <w:rPr>
+                <w:sz w:val="19"/>
+              </w:rPr>
+              <w:t xml:space="preserve">the GM can trigger a madness or compulsion, as with a complication</w:t>
+            </w:r>
+          </w:p>
+        </w:tc>
+      </w:tr>
+      <w:tr>
+        <w:tc>
+          <w:tcPr/>
+          <w:p>
+            <w:pPr>
+              <w:pStyle w:val="Compact"/>
+              <w:jc w:val="left"/>
+            </w:pPr>
+            <w:r>
+              <w:rPr>
+                <w:b/>
+                <w:sz w:val="19"/>
+              </w:rPr>
+              <w:t xml:space="preserve">4</w:t>
+            </w:r>
+          </w:p>
+        </w:tc>
+        <w:tc>
+          <w:tcPr/>
+          <w:p>
+            <w:pPr>
+              <w:pStyle w:val="Compact"/>
+              <w:jc w:val="left"/>
+            </w:pPr>
+            <w:r>
+              <w:rPr>
+                <w:bCs/>
+                <w:b/>
+                <w:sz w:val="19"/>
+              </w:rPr>
+              <w:t xml:space="preserve">Lost:</w:t>
+            </w:r>
+            <w:r>
+              <w:rPr>
+                <w:sz w:val="19"/>
+              </w:rPr>
+              <w:t xml:space="preserve"> </w:t>
+            </w:r>
+            <w:r>
+              <w:rPr>
+                <w:sz w:val="19"/>
+              </w:rPr>
+              <w:t xml:space="preserve">the power claims you; only a great rite can bring you back</w:t>
+            </w:r>
+          </w:p>
+        </w:tc>
+      </w:tr>
+    </w:tbl>
+    <w:p>
+      <w:pPr>
+        <w:pStyle w:val="BodyText"/>
+      </w:pPr>
+      <w:r>
+        <w:t xml:space="preserve">A</w:t>
+      </w:r>
+      <w:r>
+        <w:t xml:space="preserve"> </w:t>
+      </w:r>
       <w:r>
         <w:rPr>
           <w:bCs/>
           <w:b/>
         </w:rPr>
-        <w:t xml:space="preserve">The Ashlands.</w:t>
-      </w:r>
-      <w:r>
-        <w:t xml:space="preserve"> </w:t>
-      </w:r>
-      <w:r>
-        <w:t xml:space="preserve">The empire’s blasted center, where the Crown broke. Nothing grows; shards and madmen are found there.</w:t>
-      </w:r>
-    </w:p>
-    <w:bookmarkStart w:id="80" w:name="powers"/>
-    <w:p>
-      <w:pPr>
-        <w:pStyle w:val="Heading2"/>
-      </w:pPr>
-      <w:r>
-        <w:t xml:space="preserve">Powers</w:t>
+        <w:t xml:space="preserve">failed cast</w:t>
+      </w:r>
+      <w:r>
+        <w:t xml:space="preserve"> </w:t>
+      </w:r>
+      <w:r>
+        <w:t xml:space="preserve">marks 1 box; a</w:t>
+      </w:r>
+      <w:r>
+        <w:t xml:space="preserve"> </w:t>
+      </w:r>
+      <w:r>
+        <w:rPr>
+          <w:bCs/>
+          <w:b/>
+        </w:rPr>
+        <w:t xml:space="preserve">natural 18</w:t>
+      </w:r>
+      <w:r>
+        <w:t xml:space="preserve"> </w:t>
+      </w:r>
+      <w:r>
+        <w:t xml:space="preserve">marks 2; finishing a</w:t>
+      </w:r>
+      <w:r>
+        <w:t xml:space="preserve"> </w:t>
+      </w:r>
+      <w:r>
+        <w:rPr>
+          <w:bCs/>
+          <w:b/>
+        </w:rPr>
+        <w:t xml:space="preserve">Major ritual</w:t>
+      </w:r>
+      <w:r>
+        <w:t xml:space="preserve"> </w:t>
+      </w:r>
+      <w:r>
+        <w:t xml:space="preserve">marks 1, whatever the roll. Holding a</w:t>
+      </w:r>
+      <w:r>
+        <w:t xml:space="preserve"> </w:t>
+      </w:r>
+      <w:r>
+        <w:rPr>
+          <w:bCs/>
+          <w:b/>
+        </w:rPr>
+        <w:t xml:space="preserve">Crown shard</w:t>
+      </w:r>
+      <w:r>
+        <w:t xml:space="preserve"> </w:t>
+      </w:r>
+      <w:r>
+        <w:t xml:space="preserve">marks 1 each venture. A</w:t>
+      </w:r>
+      <w:r>
+        <w:t xml:space="preserve"> </w:t>
+      </w:r>
+      <w:r>
+        <w:rPr>
+          <w:bCs/>
+          <w:b/>
+        </w:rPr>
+        <w:t xml:space="preserve">cleansing rite</w:t>
+      </w:r>
+      <w:r>
+        <w:t xml:space="preserve"> </w:t>
+      </w:r>
+      <w:r>
+        <w:t xml:space="preserve">or a</w:t>
+      </w:r>
+      <w:r>
+        <w:t xml:space="preserve"> </w:t>
+      </w:r>
+      <w:r>
+        <w:rPr>
+          <w:bCs/>
+          <w:b/>
+        </w:rPr>
+        <w:t xml:space="preserve">pilgrimage</w:t>
+      </w:r>
+      <w:r>
+        <w:t xml:space="preserve"> </w:t>
+      </w:r>
+      <w:r>
+        <w:t xml:space="preserve">between ventures clears one box.</w:t>
+      </w:r>
+    </w:p>
+    <w:bookmarkEnd w:id="79"/>
+    <w:bookmarkEnd w:id="80"/>
+    <w:bookmarkStart w:id="82" w:name="the-world"/>
+    <w:p>
+      <w:pPr>
+        <w:pStyle w:val="Heading1"/>
+      </w:pPr>
+      <w:r>
+        <w:t xml:space="preserve">The world</w:t>
+      </w:r>
+    </w:p>
+    <w:p>
+      <w:pPr>
+        <w:pStyle w:val="FirstParagraph"/>
+      </w:pPr>
+      <w:r>
+        <w:t xml:space="preserve">The empire is gone, but its bones are everywhere: roads no one repairs, aqueducts that feed dead cities, sorcerer-towers that still glow at night. Its heirs quarrel over the pieces.</w:t>
       </w:r>
     </w:p>
     <w:p>
@@ -15818,13 +16246,42 @@
           <w:bCs/>
           <w:b/>
         </w:rPr>
-        <w:t xml:space="preserve">The Crown shards.</w:t>
-      </w:r>
-      <w:r>
-        <w:t xml:space="preserve"> </w:t>
-      </w:r>
-      <w:r>
-        <w:t xml:space="preserve">Nine in all; four are held by known rulers, three are lost, and two are rumors. Each grants one great power and whispers to its bearer.</w:t>
+        <w:t xml:space="preserve">The Gilded Cities.</w:t>
+      </w:r>
+      <w:r>
+        <w:t xml:space="preserve"> </w:t>
+      </w:r>
+      <w:r>
+        <w:t xml:space="preserve">The empire’s heart, now a coast of rival city-states: silk, lotus, slave markets and assassins. Ruled by</w:t>
+      </w:r>
+      <w:r>
+        <w:t xml:space="preserve"> </w:t>
+      </w:r>
+      <w:r>
+        <w:rPr>
+          <w:bCs/>
+          <w:b/>
+        </w:rPr>
+        <w:t xml:space="preserve">merchant princes</w:t>
+      </w:r>
+      <w:r>
+        <w:t xml:space="preserve"> </w:t>
+      </w:r>
+      <w:r>
+        <w:t xml:space="preserve">and the occasional</w:t>
+      </w:r>
+      <w:r>
+        <w:t xml:space="preserve"> </w:t>
+      </w:r>
+      <w:r>
+        <w:rPr>
+          <w:bCs/>
+          <w:b/>
+        </w:rPr>
+        <w:t xml:space="preserve">sorcerer-prince</w:t>
+      </w:r>
+      <w:r>
+        <w:t xml:space="preserve">.</w:t>
       </w:r>
     </w:p>
     <w:p>
@@ -15840,13 +16297,13 @@
           <w:bCs/>
           <w:b/>
         </w:rPr>
-        <w:t xml:space="preserve">The sorcerer-princes.</w:t>
-      </w:r>
-      <w:r>
-        <w:t xml:space="preserve"> </w:t>
-      </w:r>
-      <w:r>
-        <w:t xml:space="preserve">Rulers who bought their thrones with sorcery and keep them with fear.</w:t>
+        <w:t xml:space="preserve">The Frozen North.</w:t>
+      </w:r>
+      <w:r>
+        <w:t xml:space="preserve"> </w:t>
+      </w:r>
+      <w:r>
+        <w:t xml:space="preserve">Clans, longships and giants’ graves. Northlanders raid south every summer and trade every winter.</w:t>
       </w:r>
     </w:p>
     <w:p>
@@ -15862,13 +16319,29 @@
           <w:bCs/>
           <w:b/>
         </w:rPr>
-        <w:t xml:space="preserve">The merchant princes.</w:t>
-      </w:r>
-      <w:r>
-        <w:t xml:space="preserve"> </w:t>
-      </w:r>
-      <w:r>
-        <w:t xml:space="preserve">Gold rules the Gilded Cities more than any king.</w:t>
+        <w:t xml:space="preserve">The Burning Sands.</w:t>
+      </w:r>
+      <w:r>
+        <w:t xml:space="preserve"> </w:t>
+      </w:r>
+      <w:r>
+        <w:t xml:space="preserve">Nomads, caravan cities and buried temples of the</w:t>
+      </w:r>
+      <w:r>
+        <w:t xml:space="preserve"> </w:t>
+      </w:r>
+      <w:r>
+        <w:rPr>
+          <w:bCs/>
+          <w:b/>
+        </w:rPr>
+        <w:t xml:space="preserve">serpent kings</w:t>
+      </w:r>
+      <w:r>
+        <w:t xml:space="preserve"> </w:t>
+      </w:r>
+      <w:r>
+        <w:t xml:space="preserve">who ruled before humans.</w:t>
       </w:r>
     </w:p>
     <w:p>
@@ -15884,13 +16357,13 @@
           <w:bCs/>
           <w:b/>
         </w:rPr>
-        <w:t xml:space="preserve">The Cult of the Burning God.</w:t>
-      </w:r>
-      <w:r>
-        <w:t xml:space="preserve"> </w:t>
-      </w:r>
-      <w:r>
-        <w:t xml:space="preserve">Zealots who burn sorcerers, and sometimes their neighbors.</w:t>
+        <w:t xml:space="preserve">The Shattered Isles.</w:t>
+      </w:r>
+      <w:r>
+        <w:t xml:space="preserve"> </w:t>
+      </w:r>
+      <w:r>
+        <w:t xml:space="preserve">Corsair havens, sea-witches and sunken ruins; the Islanders’ free captains answer to no one.</w:t>
       </w:r>
     </w:p>
     <w:p>
@@ -15906,13 +16379,13 @@
           <w:bCs/>
           <w:b/>
         </w:rPr>
-        <w:t xml:space="preserve">The Iron Company and its rivals.</w:t>
-      </w:r>
-      <w:r>
-        <w:t xml:space="preserve"> </w:t>
-      </w:r>
-      <w:r>
-        <w:t xml:space="preserve">Mercenary companies who decide most wars, for a price.</w:t>
+        <w:t xml:space="preserve">The Deeps.</w:t>
+      </w:r>
+      <w:r>
+        <w:t xml:space="preserve"> </w:t>
+      </w:r>
+      <w:r>
+        <w:t xml:space="preserve">Deepkin cities beneath the mountains, and below them, older things that dream.</w:t>
       </w:r>
     </w:p>
     <w:p>
@@ -15928,6 +16401,147 @@
           <w:bCs/>
           <w:b/>
         </w:rPr>
+        <w:t xml:space="preserve">The Ashlands.</w:t>
+      </w:r>
+      <w:r>
+        <w:t xml:space="preserve"> </w:t>
+      </w:r>
+      <w:r>
+        <w:t xml:space="preserve">The empire’s blasted center, where the Crown broke. Nothing grows; shards and madmen are found there.</w:t>
+      </w:r>
+    </w:p>
+    <w:bookmarkStart w:id="81" w:name="powers"/>
+    <w:p>
+      <w:pPr>
+        <w:pStyle w:val="Heading2"/>
+      </w:pPr>
+      <w:r>
+        <w:t xml:space="preserve">Powers</w:t>
+      </w:r>
+    </w:p>
+    <w:p>
+      <w:pPr>
+        <w:numPr>
+          <w:ilvl w:val="0"/>
+          <w:numId w:val="1017"/>
+        </w:numPr>
+        <w:pStyle w:val="Compact"/>
+      </w:pPr>
+      <w:r>
+        <w:rPr>
+          <w:bCs/>
+          <w:b/>
+        </w:rPr>
+        <w:t xml:space="preserve">The Crown shards.</w:t>
+      </w:r>
+      <w:r>
+        <w:t xml:space="preserve"> </w:t>
+      </w:r>
+      <w:r>
+        <w:t xml:space="preserve">Nine in all; four are held by known rulers, three are lost, and two are rumors. Each grants one great power and whispers to its bearer.</w:t>
+      </w:r>
+    </w:p>
+    <w:p>
+      <w:pPr>
+        <w:numPr>
+          <w:ilvl w:val="0"/>
+          <w:numId w:val="1017"/>
+        </w:numPr>
+        <w:pStyle w:val="Compact"/>
+      </w:pPr>
+      <w:r>
+        <w:rPr>
+          <w:bCs/>
+          <w:b/>
+        </w:rPr>
+        <w:t xml:space="preserve">The sorcerer-princes.</w:t>
+      </w:r>
+      <w:r>
+        <w:t xml:space="preserve"> </w:t>
+      </w:r>
+      <w:r>
+        <w:t xml:space="preserve">Rulers who bought their thrones with sorcery and keep them with fear.</w:t>
+      </w:r>
+    </w:p>
+    <w:p>
+      <w:pPr>
+        <w:numPr>
+          <w:ilvl w:val="0"/>
+          <w:numId w:val="1017"/>
+        </w:numPr>
+        <w:pStyle w:val="Compact"/>
+      </w:pPr>
+      <w:r>
+        <w:rPr>
+          <w:bCs/>
+          <w:b/>
+        </w:rPr>
+        <w:t xml:space="preserve">The merchant princes.</w:t>
+      </w:r>
+      <w:r>
+        <w:t xml:space="preserve"> </w:t>
+      </w:r>
+      <w:r>
+        <w:t xml:space="preserve">Gold rules the Gilded Cities more than any king.</w:t>
+      </w:r>
+    </w:p>
+    <w:p>
+      <w:pPr>
+        <w:numPr>
+          <w:ilvl w:val="0"/>
+          <w:numId w:val="1017"/>
+        </w:numPr>
+        <w:pStyle w:val="Compact"/>
+      </w:pPr>
+      <w:r>
+        <w:rPr>
+          <w:bCs/>
+          <w:b/>
+        </w:rPr>
+        <w:t xml:space="preserve">The Cult of the Burning God.</w:t>
+      </w:r>
+      <w:r>
+        <w:t xml:space="preserve"> </w:t>
+      </w:r>
+      <w:r>
+        <w:t xml:space="preserve">Zealots who burn sorcerers, and sometimes their neighbors.</w:t>
+      </w:r>
+    </w:p>
+    <w:p>
+      <w:pPr>
+        <w:numPr>
+          <w:ilvl w:val="0"/>
+          <w:numId w:val="1017"/>
+        </w:numPr>
+        <w:pStyle w:val="Compact"/>
+      </w:pPr>
+      <w:r>
+        <w:rPr>
+          <w:bCs/>
+          <w:b/>
+        </w:rPr>
+        <w:t xml:space="preserve">The Iron Company and its rivals.</w:t>
+      </w:r>
+      <w:r>
+        <w:t xml:space="preserve"> </w:t>
+      </w:r>
+      <w:r>
+        <w:t xml:space="preserve">Mercenary companies who decide most wars, for a price.</w:t>
+      </w:r>
+    </w:p>
+    <w:p>
+      <w:pPr>
+        <w:numPr>
+          <w:ilvl w:val="0"/>
+          <w:numId w:val="1017"/>
+        </w:numPr>
+        <w:pStyle w:val="Compact"/>
+      </w:pPr>
+      <w:r>
+        <w:rPr>
+          <w:bCs/>
+          <w:b/>
+        </w:rPr>
         <w:t xml:space="preserve">The Thieves’ Guild.</w:t>
       </w:r>
       <w:r>
@@ -15937,9 +16551,9 @@
         <w:t xml:space="preserve">Every city has one; they don’t all get along.</w:t>
       </w:r>
     </w:p>
-    <w:bookmarkEnd w:id="80"/>
     <w:bookmarkEnd w:id="81"/>
-    <w:bookmarkStart w:id="82" w:name="threats"/>
+    <w:bookmarkEnd w:id="82"/>
+    <w:bookmarkStart w:id="83" w:name="threats"/>
     <w:p>
       <w:pPr>
         <w:pStyle w:val="Heading1"/>
@@ -17317,8 +17931,8 @@
         <w:t xml:space="preserve">For a tougher version, add +1 to its targets and one box; for a weaker one, subtract.</w:t>
       </w:r>
     </w:p>
-    <w:bookmarkEnd w:id="82"/>
-    <w:bookmarkStart w:id="90" w:name="ready-made-characters"/>
+    <w:bookmarkEnd w:id="83"/>
+    <w:bookmarkStart w:id="91" w:name="ready-made-characters"/>
     <w:p>
       <w:pPr>
         <w:pStyle w:val="Heading1"/>
@@ -17335,7 +17949,7 @@
         <w:t xml:space="preserve">Characters ready to play, for one-shots, new players, or a group in a hurry. Each follows the creation rules exactly, and their connections tie them together. In the creator, choose one from the ready-made list to open it and make it your own.</w:t>
       </w:r>
     </w:p>
-    <w:bookmarkStart w:id="83" w:name="vessa-thorn"/>
+    <w:bookmarkStart w:id="84" w:name="vessa-thorn"/>
     <w:p>
       <w:pPr>
         <w:pStyle w:val="Heading2"/>
@@ -17360,192 +17974,6 @@
       </w:r>
       <w:r>
         <w:t xml:space="preserve">The best climber in the Gilded Cities, who stole a jewel from a sorcerer-prince and is only now learning it’s a shard of the Crown.</w:t>
-      </w:r>
-    </w:p>
-    <w:p>
-      <w:pPr>
-        <w:numPr>
-          <w:ilvl w:val="0"/>
-          <w:numId w:val="1017"/>
-        </w:numPr>
-        <w:pStyle w:val="Compact"/>
-      </w:pPr>
-      <w:r>
-        <w:rPr>
-          <w:bCs/>
-          <w:b/>
-        </w:rPr>
-        <w:t xml:space="preserve">Attributes:</w:t>
-      </w:r>
-      <w:r>
-        <w:t xml:space="preserve"> </w:t>
-      </w:r>
-      <w:r>
-        <w:t xml:space="preserve">Body 11, Agility 13, Intellect 11, Presence 12, Will 9.</w:t>
-      </w:r>
-      <w:r>
-        <w:t xml:space="preserve"> </w:t>
-      </w:r>
-      <w:r>
-        <w:rPr>
-          <w:bCs/>
-          <w:b/>
-        </w:rPr>
-        <w:t xml:space="preserve">Dodge</w:t>
-      </w:r>
-      <w:r>
-        <w:t xml:space="preserve"> </w:t>
-      </w:r>
-      <w:r>
-        <w:t xml:space="preserve">12.</w:t>
-      </w:r>
-    </w:p>
-    <w:p>
-      <w:pPr>
-        <w:numPr>
-          <w:ilvl w:val="0"/>
-          <w:numId w:val="1017"/>
-        </w:numPr>
-        <w:pStyle w:val="Compact"/>
-      </w:pPr>
-      <w:r>
-        <w:rPr>
-          <w:bCs/>
-          <w:b/>
-        </w:rPr>
-        <w:t xml:space="preserve">Skills:</w:t>
-      </w:r>
-      <w:r>
-        <w:t xml:space="preserve"> </w:t>
-      </w:r>
-      <w:r>
-        <w:t xml:space="preserve">Thievery 18 (Expert). Trained: Stealth 14, Deception 13, Persuasion 13, Athletics 12, Craft 12, Investigation 12, Melee 12, Read People 10.</w:t>
-      </w:r>
-    </w:p>
-    <w:p>
-      <w:pPr>
-        <w:numPr>
-          <w:ilvl w:val="0"/>
-          <w:numId w:val="1017"/>
-        </w:numPr>
-        <w:pStyle w:val="Compact"/>
-      </w:pPr>
-      <w:r>
-        <w:rPr>
-          <w:bCs/>
-          <w:b/>
-        </w:rPr>
-        <w:t xml:space="preserve">Edges:</w:t>
-      </w:r>
-      <w:r>
-        <w:t xml:space="preserve"> </w:t>
-      </w:r>
-      <w:r>
-        <w:t xml:space="preserve">+1 attribute point, Extra Trained skill, A friend; a friend: Old Marrow, a fence in the Gilded Cities who buys anything and asks nothing.</w:t>
-      </w:r>
-    </w:p>
-    <w:p>
-      <w:pPr>
-        <w:numPr>
-          <w:ilvl w:val="0"/>
-          <w:numId w:val="1017"/>
-        </w:numPr>
-        <w:pStyle w:val="Compact"/>
-      </w:pPr>
-      <w:r>
-        <w:rPr>
-          <w:bCs/>
-          <w:b/>
-        </w:rPr>
-        <w:t xml:space="preserve">Advantage:</w:t>
-      </w:r>
-      <w:r>
-        <w:t xml:space="preserve"> </w:t>
-      </w:r>
-      <w:r>
-        <w:t xml:space="preserve">Lockbreaker.</w:t>
-      </w:r>
-      <w:r>
-        <w:t xml:space="preserve"> </w:t>
-      </w:r>
-      <w:r>
-        <w:rPr>
-          <w:bCs/>
-          <w:b/>
-        </w:rPr>
-        <w:t xml:space="preserve">Complication:</w:t>
-      </w:r>
-      <w:r>
-        <w:t xml:space="preserve"> </w:t>
-      </w:r>
-      <w:r>
-        <w:t xml:space="preserve">Keeper of a Secret; trigger: a powerful figure asks what you know.</w:t>
-      </w:r>
-    </w:p>
-    <w:p>
-      <w:pPr>
-        <w:numPr>
-          <w:ilvl w:val="0"/>
-          <w:numId w:val="1017"/>
-        </w:numPr>
-        <w:pStyle w:val="Compact"/>
-      </w:pPr>
-      <w:r>
-        <w:rPr>
-          <w:bCs/>
-          <w:b/>
-        </w:rPr>
-        <w:t xml:space="preserve">What drives me:</w:t>
-      </w:r>
-      <w:r>
-        <w:t xml:space="preserve"> </w:t>
-      </w:r>
-      <w:r>
-        <w:t xml:space="preserve">Gold, and plenty of it. Everything else follows.</w:t>
-      </w:r>
-      <w:r>
-        <w:t xml:space="preserve"> </w:t>
-      </w:r>
-      <w:r>
-        <w:rPr>
-          <w:bCs/>
-          <w:b/>
-        </w:rPr>
-        <w:t xml:space="preserve">Connection:</w:t>
-      </w:r>
-      <w:r>
-        <w:t xml:space="preserve"> </w:t>
-      </w:r>
-      <w:r>
-        <w:t xml:space="preserve">Cinder was paid to kill her and didn’t. Neither of them has said why.</w:t>
-      </w:r>
-    </w:p>
-    <w:bookmarkEnd w:id="83"/>
-    <w:bookmarkStart w:id="84" w:name="ithrann"/>
-    <w:p>
-      <w:pPr>
-        <w:pStyle w:val="Heading2"/>
-      </w:pPr>
-      <w:r>
-        <w:t xml:space="preserve">Ithrann</w:t>
-      </w:r>
-    </w:p>
-    <w:p>
-      <w:pPr>
-        <w:pStyle w:val="FirstParagraph"/>
-      </w:pPr>
-      <w:r>
-        <w:rPr>
-          <w:iCs/>
-          <w:i/>
-        </w:rPr>
-        <w:t xml:space="preserve">Last scholar of Ssa’keth, Sorcerer. Serpent-kin (tier 2).</w:t>
-      </w:r>
-      <w:r>
-        <w:t xml:space="preserve"> </w:t>
-      </w:r>
-      <w:r>
-        <w:t xml:space="preserve">Keeper of a drowned serpent temple’s memory, searching the human kingdoms for its lost library.</w:t>
       </w:r>
     </w:p>
     <w:p>
@@ -17567,7 +17995,7 @@
         <w:t xml:space="preserve"> </w:t>
       </w:r>
       <w:r>
-        <w:t xml:space="preserve">Body 9, Agility 12, Intellect 13, Presence 9, Will 13.</w:t>
+        <w:t xml:space="preserve">Body 11, Agility 13, Intellect 11, Presence 12, Will 9.</w:t>
       </w:r>
       <w:r>
         <w:t xml:space="preserve"> </w:t>
@@ -17583,7 +18011,7 @@
         <w:t xml:space="preserve"> </w:t>
       </w:r>
       <w:r>
-        <w:t xml:space="preserve">11.</w:t>
+        <w:t xml:space="preserve">12.</w:t>
       </w:r>
     </w:p>
     <w:p>
@@ -17605,7 +18033,7 @@
         <w:t xml:space="preserve"> </w:t>
       </w:r>
       <w:r>
-        <w:t xml:space="preserve">Sorcery 16 (Specialty). Trained: Healing 14, Investigation 14, Lore 14, Read People 14, Survival 14, Stealth 13, Athletics 10, Deception 10, Persuasion 10.</w:t>
+        <w:t xml:space="preserve">Thievery 18 (Expert). Trained: Stealth 14, Deception 13, Persuasion 13, Athletics 12, Craft 12, Investigation 12, Melee 12, Read People 10.</w:t>
       </w:r>
     </w:p>
     <w:p>
@@ -17627,7 +18055,7 @@
         <w:t xml:space="preserve"> </w:t>
       </w:r>
       <w:r>
-        <w:t xml:space="preserve">+1 attribute point.</w:t>
+        <w:t xml:space="preserve">+1 attribute point, Extra Trained skill, A friend; a friend: Old Marrow, a fence in the Gilded Cities who buys anything and asks nothing.</w:t>
       </w:r>
     </w:p>
     <w:p>
@@ -17649,7 +18077,7 @@
         <w:t xml:space="preserve"> </w:t>
       </w:r>
       <w:r>
-        <w:t xml:space="preserve">Venom (ancestry; companion: Hated Blood).</w:t>
+        <w:t xml:space="preserve">Lockbreaker.</w:t>
       </w:r>
       <w:r>
         <w:t xml:space="preserve"> </w:t>
@@ -17665,7 +18093,7 @@
         <w:t xml:space="preserve"> </w:t>
       </w:r>
       <w:r>
-        <w:t xml:space="preserve">Outcast; trigger: someone recognizes your exile mark.</w:t>
+        <w:t xml:space="preserve">Keeper of a Secret; trigger: a powerful figure asks what you know.</w:t>
       </w:r>
     </w:p>
     <w:p>
@@ -17687,7 +18115,7 @@
         <w:t xml:space="preserve"> </w:t>
       </w:r>
       <w:r>
-        <w:t xml:space="preserve">The old empire’s secrets are out there. I will read them.</w:t>
+        <w:t xml:space="preserve">Gold, and plenty of it. Everything else follows.</w:t>
       </w:r>
       <w:r>
         <w:t xml:space="preserve"> </w:t>
@@ -17703,17 +18131,17 @@
         <w:t xml:space="preserve"> </w:t>
       </w:r>
       <w:r>
-        <w:t xml:space="preserve">Oren Sael shelters Ithrann at his shrine when no inn will take a serpent-kin.</w:t>
+        <w:t xml:space="preserve">Cinder was paid to kill her and didn’t. Neither of them has said why.</w:t>
       </w:r>
     </w:p>
     <w:bookmarkEnd w:id="84"/>
-    <w:bookmarkStart w:id="85" w:name="nyx"/>
+    <w:bookmarkStart w:id="85" w:name="ithrann"/>
     <w:p>
       <w:pPr>
         <w:pStyle w:val="Heading2"/>
       </w:pPr>
       <w:r>
-        <w:t xml:space="preserve">Nyx</w:t>
+        <w:t xml:space="preserve">Ithrann</w:t>
       </w:r>
     </w:p>
     <w:p>
@@ -17725,13 +18153,13 @@
           <w:iCs/>
           <w:i/>
         </w:rPr>
-        <w:t xml:space="preserve">Hedge-witch, Witch. Witch-blooded (tier 1).</w:t>
-      </w:r>
-      <w:r>
-        <w:t xml:space="preserve"> </w:t>
-      </w:r>
-      <w:r>
-        <w:t xml:space="preserve">Run out of her village with stones and torches; sells cures and curses to whoever pays.</w:t>
+        <w:t xml:space="preserve">Last scholar of Ssa’keth, Sorcerer. Serpent-kin (tier 2).</w:t>
+      </w:r>
+      <w:r>
+        <w:t xml:space="preserve"> </w:t>
+      </w:r>
+      <w:r>
+        <w:t xml:space="preserve">Keeper of a drowned serpent temple’s memory, searching the human kingdoms for its lost library.</w:t>
       </w:r>
     </w:p>
     <w:p>
@@ -17753,7 +18181,7 @@
         <w:t xml:space="preserve"> </w:t>
       </w:r>
       <w:r>
-        <w:t xml:space="preserve">Body 9, Agility 11, Intellect 11, Presence 11, Will 13.</w:t>
+        <w:t xml:space="preserve">Body 9, Agility 12, Intellect 13, Presence 9, Will 13.</w:t>
       </w:r>
       <w:r>
         <w:t xml:space="preserve"> </w:t>
@@ -17769,7 +18197,7 @@
         <w:t xml:space="preserve"> </w:t>
       </w:r>
       <w:r>
-        <w:t xml:space="preserve">10.</w:t>
+        <w:t xml:space="preserve">11.</w:t>
       </w:r>
     </w:p>
     <w:p>
@@ -17791,7 +18219,7 @@
         <w:t xml:space="preserve"> </w:t>
       </w:r>
       <w:r>
-        <w:t xml:space="preserve">Sorcery 16 (Specialty). Trained: Read People 14, Survival 14, Craft 12, Deception 12, Healing 12, Lore 12, Persuasion 12, Stealth 12, Tracking 12, Athletics 10.</w:t>
+        <w:t xml:space="preserve">Sorcery 16 (Specialty). Trained: Healing 14, Investigation 14, Lore 14, Read People 14, Survival 14, Stealth 13, Athletics 10, Deception 10, Persuasion 10.</w:t>
       </w:r>
     </w:p>
     <w:p>
@@ -17813,7 +18241,7 @@
         <w:t xml:space="preserve"> </w:t>
       </w:r>
       <w:r>
-        <w:t xml:space="preserve">Extra Trained skill, Extra Fortune.</w:t>
+        <w:t xml:space="preserve">+1 attribute point.</w:t>
       </w:r>
     </w:p>
     <w:p>
@@ -17835,7 +18263,7 @@
         <w:t xml:space="preserve"> </w:t>
       </w:r>
       <w:r>
-        <w:t xml:space="preserve">Herb-Wise.</w:t>
+        <w:t xml:space="preserve">Venom (ancestry; companion: Hated Blood).</w:t>
       </w:r>
       <w:r>
         <w:t xml:space="preserve"> </w:t>
@@ -17851,7 +18279,7 @@
         <w:t xml:space="preserve"> </w:t>
       </w:r>
       <w:r>
-        <w:t xml:space="preserve">Debt to a Sorcerer; trigger: a raven arrives with a sealed message.</w:t>
+        <w:t xml:space="preserve">Outcast; trigger: someone recognizes your exile mark.</w:t>
       </w:r>
     </w:p>
     <w:p>
@@ -17873,7 +18301,7 @@
         <w:t xml:space="preserve"> </w:t>
       </w:r>
       <w:r>
-        <w:t xml:space="preserve">Every day alive is a victory. I mean to have more of them.</w:t>
+        <w:t xml:space="preserve">The old empire’s secrets are out there. I will read them.</w:t>
       </w:r>
       <w:r>
         <w:t xml:space="preserve"> </w:t>
@@ -17889,17 +18317,17 @@
         <w:t xml:space="preserve"> </w:t>
       </w:r>
       <w:r>
-        <w:t xml:space="preserve">Gorrum carried her out of the burning village. He says he was just passing.</w:t>
+        <w:t xml:space="preserve">Oren Sael shelters Ithrann at his shrine when no inn will take a serpent-kin.</w:t>
       </w:r>
     </w:p>
     <w:bookmarkEnd w:id="85"/>
-    <w:bookmarkStart w:id="86" w:name="gorrum-ironjaw"/>
+    <w:bookmarkStart w:id="86" w:name="nyx"/>
     <w:p>
       <w:pPr>
         <w:pStyle w:val="Heading2"/>
       </w:pPr>
       <w:r>
-        <w:t xml:space="preserve">Gorrum Ironjaw</w:t>
+        <w:t xml:space="preserve">Nyx</w:t>
       </w:r>
     </w:p>
     <w:p>
@@ -17911,13 +18339,13 @@
           <w:iCs/>
           <w:i/>
         </w:rPr>
-        <w:t xml:space="preserve">Sergeant of the Iron Company, Sellsword. Giant-blooded (tier 2).</w:t>
-      </w:r>
-      <w:r>
-        <w:t xml:space="preserve"> </w:t>
-      </w:r>
-      <w:r>
-        <w:t xml:space="preserve">Twenty years with the Iron Company, a wheel-lock pistol he calls Thunder, and a soft spot for strays.</w:t>
+        <w:t xml:space="preserve">Hedge-witch, Witch. Witch-blooded (tier 1).</w:t>
+      </w:r>
+      <w:r>
+        <w:t xml:space="preserve"> </w:t>
+      </w:r>
+      <w:r>
+        <w:t xml:space="preserve">Run out of her village with stones and torches; sells cures and curses to whoever pays.</w:t>
       </w:r>
     </w:p>
     <w:p>
@@ -17939,7 +18367,7 @@
         <w:t xml:space="preserve"> </w:t>
       </w:r>
       <w:r>
-        <w:t xml:space="preserve">Body 15, Agility 10, Intellect 9, Presence 10, Will 11.</w:t>
+        <w:t xml:space="preserve">Body 9, Agility 11, Intellect 11, Presence 11, Will 13.</w:t>
       </w:r>
       <w:r>
         <w:t xml:space="preserve"> </w:t>
@@ -17955,7 +18383,7 @@
         <w:t xml:space="preserve"> </w:t>
       </w:r>
       <w:r>
-        <w:t xml:space="preserve">9.</w:t>
+        <w:t xml:space="preserve">10.</w:t>
       </w:r>
     </w:p>
     <w:p>
@@ -17977,7 +18405,7 @@
         <w:t xml:space="preserve"> </w:t>
       </w:r>
       <w:r>
-        <w:t xml:space="preserve">Melee 18 (Specialty). Trained: Athletics 16, Brawling 16, Read People 12, Survival 12, Leadership 11, Marksmanship 11, Persuasion 11, Riding 11, Healing 10.</w:t>
+        <w:t xml:space="preserve">Sorcery 16 (Specialty). Trained: Read People 14, Survival 14, Craft 12, Deception 12, Healing 12, Lore 12, Persuasion 12, Stealth 12, Tracking 12, Athletics 10.</w:t>
       </w:r>
     </w:p>
     <w:p>
@@ -17999,7 +18427,7 @@
         <w:t xml:space="preserve"> </w:t>
       </w:r>
       <w:r>
-        <w:t xml:space="preserve">Second advantage; second advantage: Shield-Wall.</w:t>
+        <w:t xml:space="preserve">Extra Trained skill, Extra Fortune.</w:t>
       </w:r>
     </w:p>
     <w:p>
@@ -18021,7 +18449,7 @@
         <w:t xml:space="preserve"> </w:t>
       </w:r>
       <w:r>
-        <w:t xml:space="preserve">Battle-Hardened.</w:t>
+        <w:t xml:space="preserve">Herb-Wise.</w:t>
       </w:r>
       <w:r>
         <w:t xml:space="preserve"> </w:t>
@@ -18037,7 +18465,7 @@
         <w:t xml:space="preserve"> </w:t>
       </w:r>
       <w:r>
-        <w:t xml:space="preserve">Old Rival; trigger: your rival arrives first.</w:t>
+        <w:t xml:space="preserve">Debt to a Sorcerer; trigger: a raven arrives with a sealed message.</w:t>
       </w:r>
     </w:p>
     <w:p>
@@ -18059,7 +18487,7 @@
         <w:t xml:space="preserve"> </w:t>
       </w:r>
       <w:r>
-        <w:t xml:space="preserve">I did terrible things. I mean to balance the scales.</w:t>
+        <w:t xml:space="preserve">Every day alive is a victory. I mean to have more of them.</w:t>
       </w:r>
       <w:r>
         <w:t xml:space="preserve"> </w:t>
@@ -18075,17 +18503,17 @@
         <w:t xml:space="preserve"> </w:t>
       </w:r>
       <w:r>
-        <w:t xml:space="preserve">Nyx is the stray he carried out of the fire. He’d die before he’d say he cares.</w:t>
+        <w:t xml:space="preserve">Gorrum carried her out of the burning village. He says he was just passing.</w:t>
       </w:r>
     </w:p>
     <w:bookmarkEnd w:id="86"/>
-    <w:bookmarkStart w:id="87" w:name="mira-saltwind"/>
+    <w:bookmarkStart w:id="87" w:name="gorrum-ironjaw"/>
     <w:p>
       <w:pPr>
         <w:pStyle w:val="Heading2"/>
       </w:pPr>
       <w:r>
-        <w:t xml:space="preserve">Mira Saltwind</w:t>
+        <w:t xml:space="preserve">Gorrum Ironjaw</w:t>
       </w:r>
     </w:p>
     <w:p>
@@ -18097,13 +18525,13 @@
           <w:iCs/>
           <w:i/>
         </w:rPr>
-        <w:t xml:space="preserve">Free captain, without a ship, Corsair. Islander (tier 0); Master.</w:t>
-      </w:r>
-      <w:r>
-        <w:t xml:space="preserve"> </w:t>
-      </w:r>
-      <w:r>
-        <w:t xml:space="preserve">Captain of the Kestrel until a sea-witch sank her. She kept her mother’s arquebus and her crew’s debts.</w:t>
+        <w:t xml:space="preserve">Sergeant of the Iron Company, Sellsword. Giant-blooded (tier 2).</w:t>
+      </w:r>
+      <w:r>
+        <w:t xml:space="preserve"> </w:t>
+      </w:r>
+      <w:r>
+        <w:t xml:space="preserve">Twenty years with the Iron Company, a wheel-lock pistol he calls Thunder, and a soft spot for strays.</w:t>
       </w:r>
     </w:p>
     <w:p>
@@ -18125,7 +18553,7 @@
         <w:t xml:space="preserve"> </w:t>
       </w:r>
       <w:r>
-        <w:t xml:space="preserve">Body 11, Agility 13, Intellect 10, Presence 11, Will 11.</w:t>
+        <w:t xml:space="preserve">Body 15, Agility 10, Intellect 9, Presence 10, Will 11.</w:t>
       </w:r>
       <w:r>
         <w:t xml:space="preserve"> </w:t>
@@ -18141,7 +18569,7 @@
         <w:t xml:space="preserve"> </w:t>
       </w:r>
       <w:r>
-        <w:t xml:space="preserve">12.</w:t>
+        <w:t xml:space="preserve">9.</w:t>
       </w:r>
     </w:p>
     <w:p>
@@ -18163,7 +18591,7 @@
         <w:t xml:space="preserve"> </w:t>
       </w:r>
       <w:r>
-        <w:t xml:space="preserve">Sailing 18 (Expert). Trained: Marksmanship 14, Stealth 14, Athletics 12, Brawling 12, Melee 12, Persuasion 12, Read People 12, Survival 12.</w:t>
+        <w:t xml:space="preserve">Melee 18 (Specialty). Trained: Athletics 16, Brawling 16, Read People 12, Survival 12, Leadership 11, Marksmanship 11, Persuasion 11, Riding 11, Healing 10.</w:t>
       </w:r>
     </w:p>
     <w:p>
@@ -18185,7 +18613,7 @@
         <w:t xml:space="preserve"> </w:t>
       </w:r>
       <w:r>
-        <w:t xml:space="preserve">+1 attribute point, Extra Trained skill, A fine weapon or tool; a fine tool: her mother’s arquebus, Widowmaker (+2 Marksmanship).</w:t>
+        <w:t xml:space="preserve">Second advantage; second advantage: Shield-Wall.</w:t>
       </w:r>
     </w:p>
     <w:p>
@@ -18207,7 +18635,7 @@
         <w:t xml:space="preserve"> </w:t>
       </w:r>
       <w:r>
-        <w:t xml:space="preserve">Sea Legs.</w:t>
+        <w:t xml:space="preserve">Battle-Hardened.</w:t>
       </w:r>
       <w:r>
         <w:t xml:space="preserve"> </w:t>
@@ -18223,7 +18651,7 @@
         <w:t xml:space="preserve"> </w:t>
       </w:r>
       <w:r>
-        <w:t xml:space="preserve">Sworn Vengeance; trigger: news of where your enemy is.</w:t>
+        <w:t xml:space="preserve">Old Rival; trigger: your rival arrives first.</w:t>
       </w:r>
     </w:p>
     <w:p>
@@ -18245,7 +18673,7 @@
         <w:t xml:space="preserve"> </w:t>
       </w:r>
       <w:r>
-        <w:t xml:space="preserve">Someone took everything from me. I mean to take it back, in blood.</w:t>
+        <w:t xml:space="preserve">I did terrible things. I mean to balance the scales.</w:t>
       </w:r>
       <w:r>
         <w:t xml:space="preserve"> </w:t>
@@ -18261,17 +18689,17 @@
         <w:t xml:space="preserve"> </w:t>
       </w:r>
       <w:r>
-        <w:t xml:space="preserve">Kara of the Long Winter owes her a life, and Mira means to collect.</w:t>
+        <w:t xml:space="preserve">Nyx is the stray he carried out of the fire. He’d die before he’d say he cares.</w:t>
       </w:r>
     </w:p>
     <w:bookmarkEnd w:id="87"/>
-    <w:bookmarkStart w:id="88" w:name="cinder"/>
+    <w:bookmarkStart w:id="88" w:name="mira-saltwind"/>
     <w:p>
       <w:pPr>
         <w:pStyle w:val="Heading2"/>
       </w:pPr>
       <w:r>
-        <w:t xml:space="preserve">Cinder</w:t>
+        <w:t xml:space="preserve">Mira Saltwind</w:t>
       </w:r>
     </w:p>
     <w:p>
@@ -18283,13 +18711,13 @@
           <w:iCs/>
           <w:i/>
         </w:rPr>
-        <w:t xml:space="preserve">Former blade of the Ash Guild, Assassin. Ashborn (tier 1).</w:t>
-      </w:r>
-      <w:r>
-        <w:t xml:space="preserve"> </w:t>
-      </w:r>
-      <w:r>
-        <w:t xml:space="preserve">Made by the Ash Guild into its best knife; ran the night they ordered a child’s death.</w:t>
+        <w:t xml:space="preserve">Free captain, without a ship, Corsair. Islander (tier 0); Master.</w:t>
+      </w:r>
+      <w:r>
+        <w:t xml:space="preserve"> </w:t>
+      </w:r>
+      <w:r>
+        <w:t xml:space="preserve">Captain of the Kestrel until a sea-witch sank her. She kept her mother’s arquebus and her crew’s debts.</w:t>
       </w:r>
     </w:p>
     <w:p>
@@ -18311,7 +18739,7 @@
         <w:t xml:space="preserve"> </w:t>
       </w:r>
       <w:r>
-        <w:t xml:space="preserve">Body 12, Agility 13, Intellect 11, Presence 9, Will 11.</w:t>
+        <w:t xml:space="preserve">Body 11, Agility 13, Intellect 10, Presence 11, Will 11.</w:t>
       </w:r>
       <w:r>
         <w:t xml:space="preserve"> </w:t>
@@ -18349,7 +18777,7 @@
         <w:t xml:space="preserve"> </w:t>
       </w:r>
       <w:r>
-        <w:t xml:space="preserve">Stealth 16 (Specialty). Trained: Marksmanship 14, Thievery 14, Athletics 13, Brawling 13, Melee 13, Craft 12, Investigation 12, Read People 12, Survival 12, Deception 10.</w:t>
+        <w:t xml:space="preserve">Sailing 18 (Expert). Trained: Marksmanship 14, Stealth 14, Athletics 12, Brawling 12, Melee 12, Persuasion 12, Read People 12, Survival 12.</w:t>
       </w:r>
     </w:p>
     <w:p>
@@ -18371,7 +18799,7 @@
         <w:t xml:space="preserve"> </w:t>
       </w:r>
       <w:r>
-        <w:t xml:space="preserve">+1 attribute point, Extra Trained skill.</w:t>
+        <w:t xml:space="preserve">+1 attribute point, Extra Trained skill, A fine weapon or tool; a fine tool: her mother’s arquebus, Widowmaker (+2 Marksmanship).</w:t>
       </w:r>
     </w:p>
     <w:p>
@@ -18393,7 +18821,7 @@
         <w:t xml:space="preserve"> </w:t>
       </w:r>
       <w:r>
-        <w:t xml:space="preserve">Shadow-Walker.</w:t>
+        <w:t xml:space="preserve">Sea Legs.</w:t>
       </w:r>
       <w:r>
         <w:t xml:space="preserve"> </w:t>
@@ -18409,7 +18837,7 @@
         <w:t xml:space="preserve"> </w:t>
       </w:r>
       <w:r>
-        <w:t xml:space="preserve">Wanted; trigger: a bounty hunter takes the next room.</w:t>
+        <w:t xml:space="preserve">Sworn Vengeance; trigger: news of where your enemy is.</w:t>
       </w:r>
     </w:p>
     <w:p>
@@ -18431,7 +18859,7 @@
         <w:t xml:space="preserve"> </w:t>
       </w:r>
       <w:r>
-        <w:t xml:space="preserve">No master, no chains, no one to answer to.</w:t>
+        <w:t xml:space="preserve">Someone took everything from me. I mean to take it back, in blood.</w:t>
       </w:r>
       <w:r>
         <w:t xml:space="preserve"> </w:t>
@@ -18447,17 +18875,17 @@
         <w:t xml:space="preserve"> </w:t>
       </w:r>
       <w:r>
-        <w:t xml:space="preserve">Vessa Thorn was their last contract. They let her live and have been running ever since.</w:t>
+        <w:t xml:space="preserve">Kara of the Long Winter owes her a life, and Mira means to collect.</w:t>
       </w:r>
     </w:p>
     <w:bookmarkEnd w:id="88"/>
-    <w:bookmarkStart w:id="89" w:name="oren-sael"/>
+    <w:bookmarkStart w:id="89" w:name="cinder"/>
     <w:p>
       <w:pPr>
         <w:pStyle w:val="Heading2"/>
       </w:pPr>
       <w:r>
-        <w:t xml:space="preserve">Oren Sael</w:t>
+        <w:t xml:space="preserve">Cinder</w:t>
       </w:r>
     </w:p>
     <w:p>
@@ -18469,13 +18897,13 @@
           <w:iCs/>
           <w:i/>
         </w:rPr>
-        <w:t xml:space="preserve">Keeper of the Last Shrine, Priest. Sand-born (tier 0).</w:t>
-      </w:r>
-      <w:r>
-        <w:t xml:space="preserve"> </w:t>
-      </w:r>
-      <w:r>
-        <w:t xml:space="preserve">The last priest of Haddu, god of wells, who keeps a shrine no caravan visits and a flame that is going out.</w:t>
+        <w:t xml:space="preserve">Former blade of the Ash Guild, Assassin. Ashborn (tier 1).</w:t>
+      </w:r>
+      <w:r>
+        <w:t xml:space="preserve"> </w:t>
+      </w:r>
+      <w:r>
+        <w:t xml:space="preserve">Made by the Ash Guild into its best knife; ran the night they ordered a child’s death.</w:t>
       </w:r>
     </w:p>
     <w:p>
@@ -18497,7 +18925,7 @@
         <w:t xml:space="preserve"> </w:t>
       </w:r>
       <w:r>
-        <w:t xml:space="preserve">Body 10, Agility 10, Intellect 11, Presence 13, Will 13.</w:t>
+        <w:t xml:space="preserve">Body 12, Agility 13, Intellect 11, Presence 9, Will 11.</w:t>
       </w:r>
       <w:r>
         <w:t xml:space="preserve"> </w:t>
@@ -18513,7 +18941,7 @@
         <w:t xml:space="preserve"> </w:t>
       </w:r>
       <w:r>
-        <w:t xml:space="preserve">9.</w:t>
+        <w:t xml:space="preserve">12.</w:t>
       </w:r>
     </w:p>
     <w:p>
@@ -18535,7 +18963,7 @@
         <w:t xml:space="preserve"> </w:t>
       </w:r>
       <w:r>
-        <w:t xml:space="preserve">Persuasion 16 (Specialty). Trained: Leadership 14, Read People 14, Survival 14, Healing 12, Investigation 12, Lore 12, Athletics 11, Melee 11, Riding 11.</w:t>
+        <w:t xml:space="preserve">Stealth 16 (Specialty). Trained: Marksmanship 14, Thievery 14, Athletics 13, Brawling 13, Melee 13, Craft 12, Investigation 12, Read People 12, Survival 12, Deception 10.</w:t>
       </w:r>
     </w:p>
     <w:p>
@@ -18557,7 +18985,7 @@
         <w:t xml:space="preserve"> </w:t>
       </w:r>
       <w:r>
-        <w:t xml:space="preserve">+1 attribute point ×2, A friend; a friend: Yusra, the last caravan-master who still stops at the shrine.</w:t>
+        <w:t xml:space="preserve">+1 attribute point, Extra Trained skill.</w:t>
       </w:r>
     </w:p>
     <w:p>
@@ -18579,7 +19007,7 @@
         <w:t xml:space="preserve"> </w:t>
       </w:r>
       <w:r>
-        <w:t xml:space="preserve">Iron Will.</w:t>
+        <w:t xml:space="preserve">Shadow-Walker.</w:t>
       </w:r>
       <w:r>
         <w:t xml:space="preserve"> </w:t>
@@ -18595,7 +19023,7 @@
         <w:t xml:space="preserve"> </w:t>
       </w:r>
       <w:r>
-        <w:t xml:space="preserve">Oath-Bound; trigger: keeping the vow means abandoning the plan.</w:t>
+        <w:t xml:space="preserve">Wanted; trigger: a bounty hunter takes the next room.</w:t>
       </w:r>
     </w:p>
     <w:p>
@@ -18617,7 +19045,7 @@
         <w:t xml:space="preserve"> </w:t>
       </w:r>
       <w:r>
-        <w:t xml:space="preserve">My god is dying. Someone has to keep the flame.</w:t>
+        <w:t xml:space="preserve">No master, no chains, no one to answer to.</w:t>
       </w:r>
       <w:r>
         <w:t xml:space="preserve"> </w:t>
@@ -18633,12 +19061,198 @@
         <w:t xml:space="preserve"> </w:t>
       </w:r>
       <w:r>
+        <w:t xml:space="preserve">Vessa Thorn was their last contract. They let her live and have been running ever since.</w:t>
+      </w:r>
+    </w:p>
+    <w:bookmarkEnd w:id="89"/>
+    <w:bookmarkStart w:id="90" w:name="oren-sael"/>
+    <w:p>
+      <w:pPr>
+        <w:pStyle w:val="Heading2"/>
+      </w:pPr>
+      <w:r>
+        <w:t xml:space="preserve">Oren Sael</w:t>
+      </w:r>
+    </w:p>
+    <w:p>
+      <w:pPr>
+        <w:pStyle w:val="FirstParagraph"/>
+      </w:pPr>
+      <w:r>
+        <w:rPr>
+          <w:iCs/>
+          <w:i/>
+        </w:rPr>
+        <w:t xml:space="preserve">Keeper of the Last Shrine, Priest. Sand-born (tier 0).</w:t>
+      </w:r>
+      <w:r>
+        <w:t xml:space="preserve"> </w:t>
+      </w:r>
+      <w:r>
+        <w:t xml:space="preserve">The last priest of Haddu, god of wells, who keeps a shrine no caravan visits and a flame that is going out.</w:t>
+      </w:r>
+    </w:p>
+    <w:p>
+      <w:pPr>
+        <w:numPr>
+          <w:ilvl w:val="0"/>
+          <w:numId w:val="1024"/>
+        </w:numPr>
+        <w:pStyle w:val="Compact"/>
+      </w:pPr>
+      <w:r>
+        <w:rPr>
+          <w:bCs/>
+          <w:b/>
+        </w:rPr>
+        <w:t xml:space="preserve">Attributes:</w:t>
+      </w:r>
+      <w:r>
+        <w:t xml:space="preserve"> </w:t>
+      </w:r>
+      <w:r>
+        <w:t xml:space="preserve">Body 10, Agility 10, Intellect 11, Presence 13, Will 13.</w:t>
+      </w:r>
+      <w:r>
+        <w:t xml:space="preserve"> </w:t>
+      </w:r>
+      <w:r>
+        <w:rPr>
+          <w:bCs/>
+          <w:b/>
+        </w:rPr>
+        <w:t xml:space="preserve">Dodge</w:t>
+      </w:r>
+      <w:r>
+        <w:t xml:space="preserve"> </w:t>
+      </w:r>
+      <w:r>
+        <w:t xml:space="preserve">9.</w:t>
+      </w:r>
+    </w:p>
+    <w:p>
+      <w:pPr>
+        <w:numPr>
+          <w:ilvl w:val="0"/>
+          <w:numId w:val="1024"/>
+        </w:numPr>
+        <w:pStyle w:val="Compact"/>
+      </w:pPr>
+      <w:r>
+        <w:rPr>
+          <w:bCs/>
+          <w:b/>
+        </w:rPr>
+        <w:t xml:space="preserve">Skills:</w:t>
+      </w:r>
+      <w:r>
+        <w:t xml:space="preserve"> </w:t>
+      </w:r>
+      <w:r>
+        <w:t xml:space="preserve">Persuasion 16 (Specialty). Trained: Leadership 14, Read People 14, Survival 14, Healing 12, Investigation 12, Lore 12, Athletics 11, Melee 11, Riding 11.</w:t>
+      </w:r>
+    </w:p>
+    <w:p>
+      <w:pPr>
+        <w:numPr>
+          <w:ilvl w:val="0"/>
+          <w:numId w:val="1024"/>
+        </w:numPr>
+        <w:pStyle w:val="Compact"/>
+      </w:pPr>
+      <w:r>
+        <w:rPr>
+          <w:bCs/>
+          <w:b/>
+        </w:rPr>
+        <w:t xml:space="preserve">Edges:</w:t>
+      </w:r>
+      <w:r>
+        <w:t xml:space="preserve"> </w:t>
+      </w:r>
+      <w:r>
+        <w:t xml:space="preserve">+1 attribute point ×2, A friend; a friend: Yusra, the last caravan-master who still stops at the shrine.</w:t>
+      </w:r>
+    </w:p>
+    <w:p>
+      <w:pPr>
+        <w:numPr>
+          <w:ilvl w:val="0"/>
+          <w:numId w:val="1024"/>
+        </w:numPr>
+        <w:pStyle w:val="Compact"/>
+      </w:pPr>
+      <w:r>
+        <w:rPr>
+          <w:bCs/>
+          <w:b/>
+        </w:rPr>
+        <w:t xml:space="preserve">Advantage:</w:t>
+      </w:r>
+      <w:r>
+        <w:t xml:space="preserve"> </w:t>
+      </w:r>
+      <w:r>
+        <w:t xml:space="preserve">Iron Will.</w:t>
+      </w:r>
+      <w:r>
+        <w:t xml:space="preserve"> </w:t>
+      </w:r>
+      <w:r>
+        <w:rPr>
+          <w:bCs/>
+          <w:b/>
+        </w:rPr>
+        <w:t xml:space="preserve">Complication:</w:t>
+      </w:r>
+      <w:r>
+        <w:t xml:space="preserve"> </w:t>
+      </w:r>
+      <w:r>
+        <w:t xml:space="preserve">Oath-Bound; trigger: keeping the vow means abandoning the plan.</w:t>
+      </w:r>
+    </w:p>
+    <w:p>
+      <w:pPr>
+        <w:numPr>
+          <w:ilvl w:val="0"/>
+          <w:numId w:val="1024"/>
+        </w:numPr>
+        <w:pStyle w:val="Compact"/>
+      </w:pPr>
+      <w:r>
+        <w:rPr>
+          <w:bCs/>
+          <w:b/>
+        </w:rPr>
+        <w:t xml:space="preserve">What drives me:</w:t>
+      </w:r>
+      <w:r>
+        <w:t xml:space="preserve"> </w:t>
+      </w:r>
+      <w:r>
+        <w:t xml:space="preserve">My god is dying. Someone has to keep the flame.</w:t>
+      </w:r>
+      <w:r>
+        <w:t xml:space="preserve"> </w:t>
+      </w:r>
+      <w:r>
+        <w:rPr>
+          <w:bCs/>
+          <w:b/>
+        </w:rPr>
+        <w:t xml:space="preserve">Connection:</w:t>
+      </w:r>
+      <w:r>
+        <w:t xml:space="preserve"> </w:t>
+      </w:r>
+      <w:r>
         <w:t xml:space="preserve">Ithrann sleeps at his shrine. Oren hopes the serpent-kin’s books hold a cure for a dying god.</w:t>
       </w:r>
     </w:p>
-    <w:bookmarkEnd w:id="89"/>
     <w:bookmarkEnd w:id="90"/>
-    <w:bookmarkStart w:id="91" w:name="advantages"/>
+    <w:bookmarkEnd w:id="91"/>
+    <w:bookmarkStart w:id="92" w:name="advantages"/>
     <w:p>
       <w:pPr>
         <w:pStyle w:val="Heading1"/>
@@ -19486,8 +20100,8 @@
         <w:t xml:space="preserve">too, or the gift has nothing to work with.</w:t>
       </w:r>
     </w:p>
-    <w:bookmarkEnd w:id="91"/>
-    <w:bookmarkStart w:id="106" w:name="ancestries"/>
+    <w:bookmarkEnd w:id="92"/>
+    <w:bookmarkStart w:id="107" w:name="ancestries"/>
     <w:p>
       <w:pPr>
         <w:pStyle w:val="Heading1"/>
@@ -20414,7 +21028,7 @@
         </w:tc>
       </w:tr>
     </w:tbl>
-    <w:bookmarkStart w:id="92" w:name="shared-rules"/>
+    <w:bookmarkStart w:id="93" w:name="shared-rules"/>
     <w:p>
       <w:pPr>
         <w:pStyle w:val="Heading2"/>
@@ -20616,8 +21230,8 @@
         </w:tc>
       </w:tr>
     </w:tbl>
-    <w:bookmarkEnd w:id="92"/>
-    <w:bookmarkStart w:id="93" w:name="crownlander"/>
+    <w:bookmarkEnd w:id="93"/>
+    <w:bookmarkStart w:id="94" w:name="crownlander"/>
     <w:p>
       <w:pPr>
         <w:pStyle w:val="Heading2"/>
@@ -20930,8 +21544,8 @@
         </w:tc>
       </w:tr>
     </w:tbl>
-    <w:bookmarkEnd w:id="93"/>
-    <w:bookmarkStart w:id="94" w:name="islander"/>
+    <w:bookmarkEnd w:id="94"/>
+    <w:bookmarkStart w:id="95" w:name="islander"/>
     <w:p>
       <w:pPr>
         <w:pStyle w:val="Heading2"/>
@@ -21244,8 +21858,8 @@
         </w:tc>
       </w:tr>
     </w:tbl>
-    <w:bookmarkEnd w:id="94"/>
-    <w:bookmarkStart w:id="95" w:name="northlander"/>
+    <w:bookmarkEnd w:id="95"/>
+    <w:bookmarkStart w:id="96" w:name="northlander"/>
     <w:p>
       <w:pPr>
         <w:pStyle w:val="Heading2"/>
@@ -21558,8 +22172,8 @@
         </w:tc>
       </w:tr>
     </w:tbl>
-    <w:bookmarkEnd w:id="95"/>
-    <w:bookmarkStart w:id="96" w:name="sand-born"/>
+    <w:bookmarkEnd w:id="96"/>
+    <w:bookmarkStart w:id="97" w:name="sand-born"/>
     <w:p>
       <w:pPr>
         <w:pStyle w:val="Heading2"/>
@@ -21872,8 +22486,8 @@
         </w:tc>
       </w:tr>
     </w:tbl>
-    <w:bookmarkEnd w:id="96"/>
-    <w:bookmarkStart w:id="97" w:name="ashborn"/>
+    <w:bookmarkEnd w:id="97"/>
+    <w:bookmarkStart w:id="98" w:name="ashborn"/>
     <w:p>
       <w:pPr>
         <w:pStyle w:val="Heading2"/>
@@ -21918,7 +22532,7 @@
       <w:pPr>
         <w:numPr>
           <w:ilvl w:val="0"/>
-          <w:numId w:val="1024"/>
+          <w:numId w:val="1025"/>
         </w:numPr>
         <w:pStyle w:val="Compact"/>
       </w:pPr>
@@ -22210,8 +22824,8 @@
         </w:tc>
       </w:tr>
     </w:tbl>
-    <w:bookmarkEnd w:id="97"/>
-    <w:bookmarkStart w:id="98" w:name="deepkin"/>
+    <w:bookmarkEnd w:id="98"/>
+    <w:bookmarkStart w:id="99" w:name="deepkin"/>
     <w:p>
       <w:pPr>
         <w:pStyle w:val="Heading2"/>
@@ -22256,7 +22870,7 @@
       <w:pPr>
         <w:numPr>
           <w:ilvl w:val="0"/>
-          <w:numId w:val="1025"/>
+          <w:numId w:val="1026"/>
         </w:numPr>
         <w:pStyle w:val="Compact"/>
       </w:pPr>
@@ -22268,7 +22882,7 @@
       <w:pPr>
         <w:numPr>
           <w:ilvl w:val="0"/>
-          <w:numId w:val="1025"/>
+          <w:numId w:val="1026"/>
         </w:numPr>
         <w:pStyle w:val="Compact"/>
       </w:pPr>
@@ -22560,8 +23174,8 @@
         </w:tc>
       </w:tr>
     </w:tbl>
-    <w:bookmarkEnd w:id="98"/>
-    <w:bookmarkStart w:id="99" w:name="witch-blooded"/>
+    <w:bookmarkEnd w:id="99"/>
+    <w:bookmarkStart w:id="100" w:name="witch-blooded"/>
     <w:p>
       <w:pPr>
         <w:pStyle w:val="Heading2"/>
@@ -22606,7 +23220,7 @@
       <w:pPr>
         <w:numPr>
           <w:ilvl w:val="0"/>
-          <w:numId w:val="1026"/>
+          <w:numId w:val="1027"/>
         </w:numPr>
         <w:pStyle w:val="Compact"/>
       </w:pPr>
@@ -22618,7 +23232,7 @@
       <w:pPr>
         <w:numPr>
           <w:ilvl w:val="0"/>
-          <w:numId w:val="1026"/>
+          <w:numId w:val="1027"/>
         </w:numPr>
         <w:pStyle w:val="Compact"/>
       </w:pPr>
@@ -22928,8 +23542,8 @@
         </w:tc>
       </w:tr>
     </w:tbl>
-    <w:bookmarkEnd w:id="99"/>
-    <w:bookmarkStart w:id="100" w:name="demon-marked"/>
+    <w:bookmarkEnd w:id="100"/>
+    <w:bookmarkStart w:id="101" w:name="demon-marked"/>
     <w:p>
       <w:pPr>
         <w:pStyle w:val="Heading2"/>
@@ -22974,7 +23588,7 @@
       <w:pPr>
         <w:numPr>
           <w:ilvl w:val="0"/>
-          <w:numId w:val="1027"/>
+          <w:numId w:val="1028"/>
         </w:numPr>
         <w:pStyle w:val="Compact"/>
       </w:pPr>
@@ -22986,7 +23600,7 @@
       <w:pPr>
         <w:numPr>
           <w:ilvl w:val="0"/>
-          <w:numId w:val="1027"/>
+          <w:numId w:val="1028"/>
         </w:numPr>
         <w:pStyle w:val="Compact"/>
       </w:pPr>
@@ -23278,8 +23892,8 @@
         </w:tc>
       </w:tr>
     </w:tbl>
-    <w:bookmarkEnd w:id="100"/>
-    <w:bookmarkStart w:id="101" w:name="giant-blooded"/>
+    <w:bookmarkEnd w:id="101"/>
+    <w:bookmarkStart w:id="102" w:name="giant-blooded"/>
     <w:p>
       <w:pPr>
         <w:pStyle w:val="Heading2"/>
@@ -23324,7 +23938,7 @@
       <w:pPr>
         <w:numPr>
           <w:ilvl w:val="0"/>
-          <w:numId w:val="1028"/>
+          <w:numId w:val="1029"/>
         </w:numPr>
         <w:pStyle w:val="Compact"/>
       </w:pPr>
@@ -23616,8 +24230,8 @@
         </w:tc>
       </w:tr>
     </w:tbl>
-    <w:bookmarkEnd w:id="101"/>
-    <w:bookmarkStart w:id="102" w:name="serpent-kin"/>
+    <w:bookmarkEnd w:id="102"/>
+    <w:bookmarkStart w:id="103" w:name="serpent-kin"/>
     <w:p>
       <w:pPr>
         <w:pStyle w:val="Heading2"/>
@@ -23662,7 +24276,7 @@
       <w:pPr>
         <w:numPr>
           <w:ilvl w:val="0"/>
-          <w:numId w:val="1029"/>
+          <w:numId w:val="1030"/>
         </w:numPr>
         <w:pStyle w:val="Compact"/>
       </w:pPr>
@@ -23674,7 +24288,7 @@
       <w:pPr>
         <w:numPr>
           <w:ilvl w:val="0"/>
-          <w:numId w:val="1029"/>
+          <w:numId w:val="1030"/>
         </w:numPr>
         <w:pStyle w:val="Compact"/>
       </w:pPr>
@@ -23966,8 +24580,8 @@
         </w:tc>
       </w:tr>
     </w:tbl>
-    <w:bookmarkEnd w:id="102"/>
-    <w:bookmarkStart w:id="103" w:name="skinchanger"/>
+    <w:bookmarkEnd w:id="103"/>
+    <w:bookmarkStart w:id="104" w:name="skinchanger"/>
     <w:p>
       <w:pPr>
         <w:pStyle w:val="Heading2"/>
@@ -24012,7 +24626,7 @@
       <w:pPr>
         <w:numPr>
           <w:ilvl w:val="0"/>
-          <w:numId w:val="1030"/>
+          <w:numId w:val="1031"/>
         </w:numPr>
         <w:pStyle w:val="Compact"/>
       </w:pPr>
@@ -24024,7 +24638,7 @@
       <w:pPr>
         <w:numPr>
           <w:ilvl w:val="0"/>
-          <w:numId w:val="1030"/>
+          <w:numId w:val="1031"/>
         </w:numPr>
         <w:pStyle w:val="Compact"/>
       </w:pPr>
@@ -24350,8 +24964,8 @@
         </w:tc>
       </w:tr>
     </w:tbl>
-    <w:bookmarkEnd w:id="103"/>
-    <w:bookmarkStart w:id="104" w:name="godblooded"/>
+    <w:bookmarkEnd w:id="104"/>
+    <w:bookmarkStart w:id="105" w:name="godblooded"/>
     <w:p>
       <w:pPr>
         <w:pStyle w:val="Heading2"/>
@@ -24396,7 +25010,7 @@
       <w:pPr>
         <w:numPr>
           <w:ilvl w:val="0"/>
-          <w:numId w:val="1031"/>
+          <w:numId w:val="1032"/>
         </w:numPr>
         <w:pStyle w:val="Compact"/>
       </w:pPr>
@@ -24408,7 +25022,7 @@
       <w:pPr>
         <w:numPr>
           <w:ilvl w:val="0"/>
-          <w:numId w:val="1031"/>
+          <w:numId w:val="1032"/>
         </w:numPr>
         <w:pStyle w:val="Compact"/>
       </w:pPr>
@@ -24700,8 +25314,8 @@
         </w:tc>
       </w:tr>
     </w:tbl>
-    <w:bookmarkEnd w:id="104"/>
-    <w:bookmarkStart w:id="105" w:name="undying"/>
+    <w:bookmarkEnd w:id="105"/>
+    <w:bookmarkStart w:id="106" w:name="undying"/>
     <w:p>
       <w:pPr>
         <w:pStyle w:val="Heading2"/>
@@ -24746,7 +25360,7 @@
       <w:pPr>
         <w:numPr>
           <w:ilvl w:val="0"/>
-          <w:numId w:val="1032"/>
+          <w:numId w:val="1033"/>
         </w:numPr>
         <w:pStyle w:val="Compact"/>
       </w:pPr>
@@ -24758,7 +25372,7 @@
       <w:pPr>
         <w:numPr>
           <w:ilvl w:val="0"/>
-          <w:numId w:val="1032"/>
+          <w:numId w:val="1033"/>
         </w:numPr>
         <w:pStyle w:val="Compact"/>
       </w:pPr>
@@ -24770,7 +25384,7 @@
       <w:pPr>
         <w:numPr>
           <w:ilvl w:val="0"/>
-          <w:numId w:val="1032"/>
+          <w:numId w:val="1033"/>
         </w:numPr>
         <w:pStyle w:val="Compact"/>
       </w:pPr>
@@ -25062,9 +25676,9 @@
         </w:tc>
       </w:tr>
     </w:tbl>
-    <w:bookmarkEnd w:id="105"/>
     <w:bookmarkEnd w:id="106"/>
-    <w:bookmarkStart w:id="117" w:name="making-your-own"/>
+    <w:bookmarkEnd w:id="107"/>
+    <w:bookmarkStart w:id="118" w:name="making-your-own"/>
     <w:p>
       <w:pPr>
         <w:pStyle w:val="Heading1"/>
@@ -25097,7 +25711,7 @@
         <w:t xml:space="preserve">option at the end of each list, and its checklist holds a custom choice to the same rules as everything else.</w:t>
       </w:r>
     </w:p>
-    <w:bookmarkStart w:id="107" w:name="a-custom-calling"/>
+    <w:bookmarkStart w:id="108" w:name="a-custom-calling"/>
     <w:p>
       <w:pPr>
         <w:pStyle w:val="Heading2"/>
@@ -25118,7 +25732,7 @@
       <w:pPr>
         <w:numPr>
           <w:ilvl w:val="0"/>
-          <w:numId w:val="1033"/>
+          <w:numId w:val="1034"/>
         </w:numPr>
         <w:pStyle w:val="Compact"/>
       </w:pPr>
@@ -25164,7 +25778,7 @@
       <w:pPr>
         <w:numPr>
           <w:ilvl w:val="0"/>
-          <w:numId w:val="1033"/>
+          <w:numId w:val="1034"/>
         </w:numPr>
         <w:pStyle w:val="Compact"/>
       </w:pPr>
@@ -25186,7 +25800,7 @@
       <w:pPr>
         <w:numPr>
           <w:ilvl w:val="0"/>
-          <w:numId w:val="1033"/>
+          <w:numId w:val="1034"/>
         </w:numPr>
         <w:pStyle w:val="Compact"/>
       </w:pPr>
@@ -25208,7 +25822,7 @@
       <w:pPr>
         <w:numPr>
           <w:ilvl w:val="0"/>
-          <w:numId w:val="1033"/>
+          <w:numId w:val="1034"/>
         </w:numPr>
         <w:pStyle w:val="Compact"/>
       </w:pPr>
@@ -25273,8 +25887,8 @@
         <w:t xml:space="preserve">.</w:t>
       </w:r>
     </w:p>
-    <w:bookmarkEnd w:id="107"/>
-    <w:bookmarkStart w:id="116" w:name="a-custom-ancestry"/>
+    <w:bookmarkEnd w:id="108"/>
+    <w:bookmarkStart w:id="117" w:name="a-custom-ancestry"/>
     <w:p>
       <w:pPr>
         <w:pStyle w:val="Heading2"/>
@@ -25291,7 +25905,7 @@
         <w:t xml:space="preserve">Build it with the GM, one step at a time.</w:t>
       </w:r>
     </w:p>
-    <w:bookmarkStart w:id="108" w:name="the-concept"/>
+    <w:bookmarkStart w:id="109" w:name="the-concept"/>
     <w:p>
       <w:pPr>
         <w:pStyle w:val="Heading3"/>
@@ -25308,8 +25922,8 @@
         <w:t xml:space="preserve">Two or three sentences: where they come from, what sets them apart, and how others see them. It should be something the ancestries in this book don’t already cover.</w:t>
       </w:r>
     </w:p>
-    <w:bookmarkEnd w:id="108"/>
-    <w:bookmarkStart w:id="109" w:name="the-tier"/>
+    <w:bookmarkEnd w:id="109"/>
+    <w:bookmarkStart w:id="110" w:name="the-tier"/>
     <w:p>
       <w:pPr>
         <w:pStyle w:val="Heading3"/>
@@ -25606,8 +26220,8 @@
         <w:t xml:space="preserve">When in doubt, choose the higher tier.</w:t>
       </w:r>
     </w:p>
-    <w:bookmarkEnd w:id="109"/>
-    <w:bookmarkStart w:id="110" w:name="attribute-adjustments"/>
+    <w:bookmarkEnd w:id="110"/>
+    <w:bookmarkStart w:id="111" w:name="attribute-adjustments"/>
     <w:p>
       <w:pPr>
         <w:pStyle w:val="Heading3"/>
@@ -25653,8 +26267,8 @@
         <w:t xml:space="preserve">: a +2 needs a −2 or two −1s. The adjustments move the attribute’s base (+1 starts it at 11) and raise its starting maximum (13 plus the bonus). Most ancestries change two to four attributes.</w:t>
       </w:r>
     </w:p>
-    <w:bookmarkEnd w:id="110"/>
-    <w:bookmarkStart w:id="111" w:name="core-rules-tier-1-and-up"/>
+    <w:bookmarkEnd w:id="111"/>
+    <w:bookmarkStart w:id="112" w:name="core-rules-tier-1-and-up"/>
     <w:p>
       <w:pPr>
         <w:pStyle w:val="Heading3"/>
@@ -25671,8 +26285,8 @@
         <w:t xml:space="preserve">One to three short rules that always apply: what they can do (see in the dark, resist cold, a free Trained skill) and what it costs (a weakness, a people’s distrust, a hazard they can’t abide). A strength with no drawback is worth more than it looks, so price it a tier higher.</w:t>
       </w:r>
     </w:p>
-    <w:bookmarkEnd w:id="111"/>
-    <w:bookmarkStart w:id="112" w:name="ancestry-advantages"/>
+    <w:bookmarkEnd w:id="112"/>
+    <w:bookmarkStart w:id="113" w:name="ancestry-advantages"/>
     <w:p>
       <w:pPr>
         <w:pStyle w:val="Heading3"/>
@@ -25727,8 +26341,8 @@
         <w:t xml:space="preserve">: a problem the trait causes, with a clear trigger and a real consequence, which earns a Fortune point when it bites, like any complication. A character takes one advantage, general or ancestry, so make them distinct choices.</w:t>
       </w:r>
     </w:p>
-    <w:bookmarkEnd w:id="112"/>
-    <w:bookmarkStart w:id="113" w:name="an-alternate-form-optional-tier-2-or-3"/>
+    <w:bookmarkEnd w:id="113"/>
+    <w:bookmarkStart w:id="114" w:name="an-alternate-form-optional-tier-2-or-3"/>
     <w:p>
       <w:pPr>
         <w:pStyle w:val="Heading3"/>
@@ -25761,8 +26375,8 @@
         <w:t xml:space="preserve">apply.</w:t>
       </w:r>
     </w:p>
-    <w:bookmarkEnd w:id="113"/>
-    <w:bookmarkStart w:id="114" w:name="in-the-creator"/>
+    <w:bookmarkEnd w:id="114"/>
+    <w:bookmarkStart w:id="115" w:name="in-the-creator"/>
     <w:p>
       <w:pPr>
         <w:pStyle w:val="Heading3"/>
@@ -25775,7 +26389,7 @@
       <w:pPr>
         <w:numPr>
           <w:ilvl w:val="0"/>
-          <w:numId w:val="1034"/>
+          <w:numId w:val="1035"/>
         </w:numPr>
         <w:pStyle w:val="Compact"/>
       </w:pPr>
@@ -25803,7 +26417,7 @@
       <w:pPr>
         <w:numPr>
           <w:ilvl w:val="0"/>
-          <w:numId w:val="1034"/>
+          <w:numId w:val="1035"/>
         </w:numPr>
         <w:pStyle w:val="Compact"/>
       </w:pPr>
@@ -25815,7 +26429,7 @@
       <w:pPr>
         <w:numPr>
           <w:ilvl w:val="0"/>
-          <w:numId w:val="1034"/>
+          <w:numId w:val="1035"/>
         </w:numPr>
         <w:pStyle w:val="Compact"/>
       </w:pPr>
@@ -25843,7 +26457,7 @@
       <w:pPr>
         <w:numPr>
           <w:ilvl w:val="0"/>
-          <w:numId w:val="1034"/>
+          <w:numId w:val="1035"/>
         </w:numPr>
         <w:pStyle w:val="Compact"/>
       </w:pPr>
@@ -25867,8 +26481,8 @@
         <w:t xml:space="preserve">and enter the advantage and its companion complication.</w:t>
       </w:r>
     </w:p>
-    <w:bookmarkEnd w:id="114"/>
-    <w:bookmarkStart w:id="115" w:name="example"/>
+    <w:bookmarkEnd w:id="115"/>
+    <w:bookmarkStart w:id="116" w:name="example"/>
     <w:p>
       <w:pPr>
         <w:pStyle w:val="Heading3"/>
@@ -25973,10 +26587,10 @@
         <w:t xml:space="preserve">: villagers see the birds and bar their doors; accept the suspicion.</w:t>
       </w:r>
     </w:p>
-    <w:bookmarkEnd w:id="115"/>
     <w:bookmarkEnd w:id="116"/>
     <w:bookmarkEnd w:id="117"/>
-    <w:bookmarkStart w:id="118" w:name="complications"/>
+    <w:bookmarkEnd w:id="118"/>
+    <w:bookmarkStart w:id="119" w:name="complications"/>
     <w:p>
       <w:pPr>
         <w:pStyle w:val="Heading1"/>
@@ -26681,8 +27295,8 @@
         </w:tc>
       </w:tr>
     </w:tbl>
-    <w:bookmarkEnd w:id="118"/>
-    <w:bookmarkStart w:id="120" w:name="quick-reference"/>
+    <w:bookmarkEnd w:id="119"/>
+    <w:bookmarkStart w:id="121" w:name="quick-reference"/>
     <w:p>
       <w:pPr>
         <w:pStyle w:val="Heading1"/>
@@ -26873,7 +27487,7 @@
       <w:r>
         <w:t xml:space="preserve"> </w:t>
       </w:r>
-      <w:hyperlink r:id="rId119">
+      <w:hyperlink r:id="rId120">
         <w:r>
           <w:rPr>
             <w:rStyle w:val="Hyperlink"/>
@@ -26885,7 +27499,7 @@
         <w:t xml:space="preserve">. You may share, adapt, and use it for any purpose, including commercially, as long as you give appropriate credit to the author.</w:t>
       </w:r>
     </w:p>
-    <w:bookmarkEnd w:id="120"/>
+    <w:bookmarkEnd w:id="121"/>
     <w:sectPr/>
   </w:body>
 </w:document>
@@ -27361,6 +27975,9 @@
     <w:abstractNumId w:val="991"/>
   </w:num>
   <w:num w:numId="1033">
+    <w:abstractNumId w:val="991"/>
+  </w:num>
+  <w:num w:numId="1034">
     <w:abstractNumId w:val="99411"/>
     <w:lvlOverride w:ilvl="0">
       <w:startOverride w:val="1"/>
@@ -27390,7 +28007,7 @@
       <w:startOverride w:val="1"/>
     </w:lvlOverride>
   </w:num>
-  <w:num w:numId="1034">
+  <w:num w:numId="1035">
     <w:abstractNumId w:val="99411"/>
     <w:lvlOverride w:ilvl="0">
       <w:startOverride w:val="1"/>

</xml_diff>

<commit_message>
The Shattered Crown: Talisman and Enchanted heirloom Edges
- Talisman (1 Edge): start each venture with a ready talisman holding a
  Minor ritual agreed with the GM; anyone can break it; renewed between
  ventures; outside the talisman limit.
- Enchanted heirloom (1 Edge): an item with a lasting Significant
  enchantment (+2 to one use, +1 box on hits, or turning one hit a fight),
  which Sight can see and Shatter or unbinding can break.
- Engine: a setting's own Edges can ask for a short description; the
  creator shows the field, the checklist asks for it, the sheet shows it.
- Significant enchantments as data, for the Rules Lab.

Co-Authored-By: Claude Opus 5.5 <noreply@anthropic.com>
Claude-Session: https://claude.ai/code/session_015SADCFzhKijkC2foUmXrpC
</commit_message>
<xml_diff>
--- a/legend-dynamics/fantasy/The_Shattered_Crown_Players_Guide.docx
+++ b/legend-dynamics/fantasy/The_Shattered_Crown_Players_Guide.docx
@@ -2867,6 +2867,102 @@
                 <w:sz w:val="19"/>
               </w:rPr>
               <w:t xml:space="preserve">An heirloom weapon, a master’s instruments or a fine kit: +2 to one named skill when it’s used</w:t>
+            </w:r>
+          </w:p>
+        </w:tc>
+        <w:tc>
+          <w:tcPr/>
+          <w:p>
+            <w:pPr>
+              <w:pStyle w:val="Compact"/>
+              <w:jc w:val="left"/>
+            </w:pPr>
+            <w:r>
+              <w:rPr>
+                <w:sz w:val="19"/>
+              </w:rPr>
+              <w:t xml:space="preserve">1</w:t>
+            </w:r>
+          </w:p>
+        </w:tc>
+      </w:tr>
+      <w:tr>
+        <w:tc>
+          <w:tcPr/>
+          <w:p>
+            <w:pPr>
+              <w:pStyle w:val="Compact"/>
+              <w:jc w:val="left"/>
+            </w:pPr>
+            <w:r>
+              <w:rPr>
+                <w:b/>
+                <w:sz w:val="19"/>
+              </w:rPr>
+              <w:t xml:space="preserve">Talisman</w:t>
+            </w:r>
+          </w:p>
+        </w:tc>
+        <w:tc>
+          <w:tcPr/>
+          <w:p>
+            <w:pPr>
+              <w:pStyle w:val="Compact"/>
+              <w:jc w:val="left"/>
+            </w:pPr>
+            <w:r>
+              <w:rPr>
+                <w:sz w:val="19"/>
+              </w:rPr>
+              <w:t xml:space="preserve">Start each venture with one ready talisman holding a Minor ritual agreed with the GM. Anyone can break it; it’s renewed between ventures and doesn’t count against a talisman limit.</w:t>
+            </w:r>
+          </w:p>
+        </w:tc>
+        <w:tc>
+          <w:tcPr/>
+          <w:p>
+            <w:pPr>
+              <w:pStyle w:val="Compact"/>
+              <w:jc w:val="left"/>
+            </w:pPr>
+            <w:r>
+              <w:rPr>
+                <w:sz w:val="19"/>
+              </w:rPr>
+              <w:t xml:space="preserve">1</w:t>
+            </w:r>
+          </w:p>
+        </w:tc>
+      </w:tr>
+      <w:tr>
+        <w:tc>
+          <w:tcPr/>
+          <w:p>
+            <w:pPr>
+              <w:pStyle w:val="Compact"/>
+              <w:jc w:val="left"/>
+            </w:pPr>
+            <w:r>
+              <w:rPr>
+                <w:b/>
+                <w:sz w:val="19"/>
+              </w:rPr>
+              <w:t xml:space="preserve">Enchanted heirloom</w:t>
+            </w:r>
+          </w:p>
+        </w:tc>
+        <w:tc>
+          <w:tcPr/>
+          <w:p>
+            <w:pPr>
+              <w:pStyle w:val="Compact"/>
+              <w:jc w:val="left"/>
+            </w:pPr>
+            <w:r>
+              <w:rPr>
+                <w:sz w:val="19"/>
+              </w:rPr>
+              <w:t xml:space="preserve">One item carries a lasting Significant enchantment: +2 to one use, or its hits mark one more box, or it turns one hit a fight. Sight sees it; Shatter’s Third Seal or a rite of unbinding can break it.</w:t>
             </w:r>
           </w:p>
         </w:tc>
@@ -15791,6 +15887,60 @@
       </w:r>
       <w:r>
         <w:t xml:space="preserve">Sorcerer’s Sight shows an enchantment and who made it. Shatter at its Third Seal breaks one, and so does a rite of unbinding (Significant).</w:t>
+      </w:r>
+    </w:p>
+    <w:p>
+      <w:pPr>
+        <w:numPr>
+          <w:ilvl w:val="0"/>
+          <w:numId w:val="1015"/>
+        </w:numPr>
+        <w:pStyle w:val="Compact"/>
+      </w:pPr>
+      <w:r>
+        <w:rPr>
+          <w:bCs/>
+          <w:b/>
+        </w:rPr>
+        <w:t xml:space="preserve">Born with one.</w:t>
+      </w:r>
+      <w:r>
+        <w:t xml:space="preserve"> </w:t>
+      </w:r>
+      <w:r>
+        <w:t xml:space="preserve">Two Edges bring enchantment to any character, sorcerer or not:</w:t>
+      </w:r>
+      <w:r>
+        <w:t xml:space="preserve"> </w:t>
+      </w:r>
+      <w:r>
+        <w:rPr>
+          <w:bCs/>
+          <w:b/>
+        </w:rPr>
+        <w:t xml:space="preserve">Talisman</w:t>
+      </w:r>
+      <w:r>
+        <w:t xml:space="preserve"> </w:t>
+      </w:r>
+      <w:r>
+        <w:t xml:space="preserve">(a ready talisman, renewed every venture) and</w:t>
+      </w:r>
+      <w:r>
+        <w:t xml:space="preserve"> </w:t>
+      </w:r>
+      <w:r>
+        <w:rPr>
+          <w:bCs/>
+          <w:b/>
+        </w:rPr>
+        <w:t xml:space="preserve">Enchanted heirloom</w:t>
+      </w:r>
+      <w:r>
+        <w:t xml:space="preserve"> </w:t>
+      </w:r>
+      <w:r>
+        <w:t xml:space="preserve">(an item with a lasting Significant enchantment).</w:t>
       </w:r>
     </w:p>
     <w:bookmarkEnd w:id="77"/>

</xml_diff>

<commit_message>
Shapechangers: switch forms on the sheet, the GM view and in encounters
The sheet gets a Human form / Monstrous form (Beast form) switch: it shows the
numbers of the form the character is in, with the human ones beside them, and
the dice roller follows it. The form's bonuses never count in human form.

The Encounter panel reads the form: a character added in their form fights
with its numbers and its claws (a form whose claws or fangs mark 2 boxes),
with its traits as a note, and a 'change to' button switches mid-fight (logged)
and updates the character's card. The GM view's cards show the form and can
switch it too; the encounter follows a switch made there.

Co-Authored-By: Claude Opus 5.5 <noreply@anthropic.com>
Claude-Session: https://claude.ai/code/session_015SADCFzhKijkC2foUmXrpC
</commit_message>
<xml_diff>
--- a/legend-dynamics/fantasy/The_Shattered_Crown_Players_Guide.docx
+++ b/legend-dynamics/fantasy/The_Shattered_Crown_Players_Guide.docx
@@ -20014,7 +20014,7 @@
               <w:rPr>
                 <w:sz w:val="19"/>
               </w:rPr>
-              <w:t xml:space="preserve">While changed, the form’s attribute bonuses apply to rolls on those attributes and their skills, even above the starting maximum; its traits and drawbacks apply too.</w:t>
+              <w:t xml:space="preserve">While changed, the form’s attribute bonuses apply to rolls on those attributes and their skills, even above the starting maximum; its traits and drawbacks apply too. In human form, none of it does: the sheet’s form switch shows both sets of numbers.</w:t>
             </w:r>
           </w:p>
         </w:tc>
@@ -25195,7 +25195,7 @@
         <w:t xml:space="preserve"> </w:t>
       </w:r>
       <w:r>
-        <w:t xml:space="preserve">apply.</w:t>
+        <w:t xml:space="preserve">apply. The bonuses count only while the character is in that form: the sheet’s form switch shows both sets of numbers.</w:t>
       </w:r>
     </w:p>
     <w:bookmarkEnd w:id="114"/>

</xml_diff>